<commit_message>
AIrep001 v1.1 — add TrackOps export click-path and Claude Code route
Section 7.2 now spells out the exact TrackOps UI steps to export the CSV
(Case List → Advanced → date-range filter at foot of right-hand sidebar)
and the rule for the end date (last day of last full calendar month).
Adds Route A (Claude Code) alongside Route B (direct terminal) for running
the processor, so non-technical analysts have a clear path.

Co-Authored-By: Claude Opus 4.7 (1M context) <noreply@anthropic.com>
</commit_message>
<xml_diff>
--- a/docs/exports/AIrep001-MI-Process.docx
+++ b/docs/exports/AIrep001-MI-Process.docx
@@ -28,7 +28,7 @@
         </w:p>
       </w:sdtContent>
     </w:sdt>
-    <w:bookmarkStart w:id="29" w:name="X54cd307e615825903a4e33dd06757783330d89e"/>
+    <w:bookmarkStart w:id="32" w:name="X54cd307e615825903a4e33dd06757783330d89e"/>
     <w:p>
       <w:pPr>
         <w:pStyle w:val="Heading1"/>
@@ -68,7 +68,7 @@
         <w:t xml:space="preserve"> </w:t>
       </w:r>
       <w:r>
-        <w:t xml:space="preserve">1.0</w:t>
+        <w:t xml:space="preserve">1.1</w:t>
       </w:r>
       <w:r>
         <w:t xml:space="preserve"> </w:t>
@@ -1219,7 +1219,7 @@
       </w:r>
     </w:p>
     <w:bookmarkEnd w:id="14"/>
-    <w:bookmarkStart w:id="21" w:name="procedure"/>
+    <w:bookmarkStart w:id="24" w:name="procedure"/>
     <w:p>
       <w:pPr>
         <w:pStyle w:val="Heading2"/>
@@ -1412,7 +1412,7 @@
       </w:r>
     </w:p>
     <w:bookmarkEnd w:id="15"/>
-    <w:bookmarkStart w:id="16" w:name="X6b5a6cdc7782e4cd09dd714fb06d8023e5f8bbc"/>
+    <w:bookmarkStart w:id="19" w:name="X6b5a6cdc7782e4cd09dd714fb06d8023e5f8bbc"/>
     <w:p>
       <w:pPr>
         <w:pStyle w:val="Heading3"/>
@@ -1421,6 +1421,15 @@
         <w:t xml:space="preserve">7.2 Production day — export and process (Day 0, ~10 min)</w:t>
       </w:r>
     </w:p>
+    <w:bookmarkStart w:id="16" w:name="export-the-csv-from-trackops"/>
+    <w:p>
+      <w:pPr>
+        <w:pStyle w:val="Heading4"/>
+      </w:pPr>
+      <w:r>
+        <w:t xml:space="preserve">7.2.1 Export the CSV from TrackOps</w:t>
+      </w:r>
+    </w:p>
     <w:p>
       <w:pPr>
         <w:pStyle w:val="FirstParagraph"/>
@@ -1431,13 +1440,14 @@
     </w:p>
     <w:p>
       <w:pPr>
+        <w:pStyle w:val="Compact"/>
         <w:numPr>
           <w:ilvl w:val="0"/>
           <w:numId w:val="1006"/>
         </w:numPr>
       </w:pPr>
       <w:r>
-        <w:t xml:space="preserve">Sign into TrackOps. Navigate to</w:t>
+        <w:t xml:space="preserve">Open</w:t>
       </w:r>
       <w:r>
         <w:t xml:space="preserve"> </w:t>
@@ -1447,36 +1457,40 @@
           <w:b/>
           <w:bCs/>
         </w:rPr>
-        <w:t xml:space="preserve">Cases</w:t>
-      </w:r>
-      <w:r>
-        <w:t xml:space="preserve">.</w:t>
-      </w:r>
-    </w:p>
-    <w:p>
-      <w:pPr>
+        <w:t xml:space="preserve">TrackOps</w:t>
+      </w:r>
+      <w:r>
+        <w:t xml:space="preserve"> </w:t>
+      </w:r>
+      <w:r>
+        <w:t xml:space="preserve">at</w:t>
+      </w:r>
+      <w:r>
+        <w:t xml:space="preserve"> </w:t>
+      </w:r>
+      <w:r>
+        <w:rPr>
+          <w:rStyle w:val="VerbatimChar"/>
+        </w:rPr>
+        <w:t xml:space="preserve">https://dlbinvestigations.viewcases.com</w:t>
+      </w:r>
+      <w:r>
+        <w:t xml:space="preserve"> </w:t>
+      </w:r>
+      <w:r>
+        <w:t xml:space="preserve">and sign in.</w:t>
+      </w:r>
+    </w:p>
+    <w:p>
+      <w:pPr>
+        <w:pStyle w:val="Compact"/>
         <w:numPr>
           <w:ilvl w:val="0"/>
           <w:numId w:val="1006"/>
         </w:numPr>
       </w:pPr>
       <w:r>
-        <w:t xml:space="preserve">Filter to</w:t>
-      </w:r>
-      <w:r>
-        <w:t xml:space="preserve"> </w:t>
-      </w:r>
-      <w:r>
-        <w:rPr>
-          <w:rStyle w:val="VerbatimChar"/>
-        </w:rPr>
-        <w:t xml:space="preserve">Date Created</w:t>
-      </w:r>
-      <w:r>
-        <w:t xml:space="preserve"> </w:t>
-      </w:r>
-      <w:r>
-        <w:t xml:space="preserve">between</w:t>
+        <w:t xml:space="preserve">Navigate to the</w:t>
       </w:r>
       <w:r>
         <w:t xml:space="preserve"> </w:t>
@@ -1486,13 +1500,22 @@
           <w:b/>
           <w:bCs/>
         </w:rPr>
-        <w:t xml:space="preserve">1 January [current year]</w:t>
-      </w:r>
-      <w:r>
-        <w:t xml:space="preserve"> </w:t>
-      </w:r>
-      <w:r>
-        <w:t xml:space="preserve">and</w:t>
+        <w:t xml:space="preserve">Case List</w:t>
+      </w:r>
+      <w:r>
+        <w:t xml:space="preserve">.</w:t>
+      </w:r>
+    </w:p>
+    <w:p>
+      <w:pPr>
+        <w:pStyle w:val="Compact"/>
+        <w:numPr>
+          <w:ilvl w:val="0"/>
+          <w:numId w:val="1006"/>
+        </w:numPr>
+      </w:pPr>
+      <w:r>
+        <w:t xml:space="preserve">Click</w:t>
       </w:r>
       <w:r>
         <w:t xml:space="preserve"> </w:t>
@@ -1502,60 +1525,452 @@
           <w:b/>
           <w:bCs/>
         </w:rPr>
-        <w:t xml:space="preserve">today</w:t>
-      </w:r>
-      <w:r>
-        <w:t xml:space="preserve">.</w:t>
-      </w:r>
-    </w:p>
-    <w:p>
-      <w:pPr>
+        <w:t xml:space="preserve">Advanced</w:t>
+      </w:r>
+      <w:r>
+        <w:t xml:space="preserve"> </w:t>
+      </w:r>
+      <w:r>
+        <w:t xml:space="preserve">to expand the advanced filters panel.</w:t>
+      </w:r>
+    </w:p>
+    <w:p>
+      <w:pPr>
+        <w:pStyle w:val="Compact"/>
         <w:numPr>
           <w:ilvl w:val="0"/>
           <w:numId w:val="1006"/>
         </w:numPr>
       </w:pPr>
       <w:r>
-        <w:t xml:space="preserve">Click</w:t>
-      </w:r>
-      <w:r>
-        <w:t xml:space="preserve"> </w:t>
-      </w:r>
-      <w:r>
         <w:rPr>
           <w:b/>
           <w:bCs/>
         </w:rPr>
-        <w:t xml:space="preserve">Export → CSV</w:t>
-      </w:r>
-      <w:r>
-        <w:t xml:space="preserve">. Save the file to</w:t>
-      </w:r>
-      <w:r>
-        <w:t xml:space="preserve"> </w:t>
-      </w:r>
-      <w:r>
-        <w:rPr>
-          <w:rStyle w:val="VerbatimChar"/>
-        </w:rPr>
-        <w:t xml:space="preserve">~/Downloads/</w:t>
-      </w:r>
-      <w:r>
-        <w:t xml:space="preserve"> </w:t>
-      </w:r>
-      <w:r>
-        <w:t xml:space="preserve">with its default name.</w:t>
-      </w:r>
-    </w:p>
-    <w:p>
-      <w:pPr>
+        <w:t xml:space="preserve">Scroll to the bottom of the screen.</w:t>
+      </w:r>
+      <w:r>
+        <w:t xml:space="preserve"> </w:t>
+      </w:r>
+      <w:r>
+        <w:t xml:space="preserve">In the</w:t>
+      </w:r>
+      <w:r>
+        <w:t xml:space="preserve"> </w:t>
+      </w:r>
+      <w:r>
+        <w:rPr>
+          <w:b/>
+          <w:bCs/>
+        </w:rPr>
+        <w:t xml:space="preserve">right-hand sidebar at the foot of the page</w:t>
+      </w:r>
+      <w:r>
+        <w:t xml:space="preserve"> </w:t>
+      </w:r>
+      <w:r>
+        <w:t xml:space="preserve">there is a date-range filter.</w:t>
+      </w:r>
+    </w:p>
+    <w:p>
+      <w:pPr>
+        <w:pStyle w:val="Compact"/>
         <w:numPr>
           <w:ilvl w:val="0"/>
           <w:numId w:val="1006"/>
         </w:numPr>
       </w:pPr>
       <w:r>
-        <w:t xml:space="preserve">On the workstation, open a terminal and run:</w:t>
+        <w:t xml:space="preserve">Enter the date range:</w:t>
+      </w:r>
+    </w:p>
+    <w:p>
+      <w:pPr>
+        <w:pStyle w:val="Compact"/>
+        <w:numPr>
+          <w:ilvl w:val="1"/>
+          <w:numId w:val="1007"/>
+        </w:numPr>
+      </w:pPr>
+      <w:r>
+        <w:rPr>
+          <w:b/>
+          <w:bCs/>
+        </w:rPr>
+        <w:t xml:space="preserve">From:</w:t>
+      </w:r>
+      <w:r>
+        <w:t xml:space="preserve"> </w:t>
+      </w:r>
+      <w:r>
+        <w:rPr>
+          <w:rStyle w:val="VerbatimChar"/>
+        </w:rPr>
+        <w:t xml:space="preserve">1 January</w:t>
+      </w:r>
+      <w:r>
+        <w:t xml:space="preserve"> </w:t>
+      </w:r>
+      <w:r>
+        <w:t xml:space="preserve">of the current calendar year (e.g. </w:t>
+      </w:r>
+      <w:r>
+        <w:rPr>
+          <w:rStyle w:val="VerbatimChar"/>
+        </w:rPr>
+        <w:t xml:space="preserve">1/1/26</w:t>
+      </w:r>
+      <w:r>
+        <w:t xml:space="preserve">)</w:t>
+      </w:r>
+    </w:p>
+    <w:p>
+      <w:pPr>
+        <w:pStyle w:val="Compact"/>
+        <w:numPr>
+          <w:ilvl w:val="1"/>
+          <w:numId w:val="1007"/>
+        </w:numPr>
+      </w:pPr>
+      <w:r>
+        <w:rPr>
+          <w:b/>
+          <w:bCs/>
+        </w:rPr>
+        <w:t xml:space="preserve">To:</w:t>
+      </w:r>
+      <w:r>
+        <w:t xml:space="preserve"> </w:t>
+      </w:r>
+      <w:r>
+        <w:t xml:space="preserve">the</w:t>
+      </w:r>
+      <w:r>
+        <w:t xml:space="preserve"> </w:t>
+      </w:r>
+      <w:r>
+        <w:rPr>
+          <w:b/>
+          <w:bCs/>
+        </w:rPr>
+        <w:t xml:space="preserve">last day of the last full calendar month</w:t>
+      </w:r>
+      <w:r>
+        <w:t xml:space="preserve"> </w:t>
+      </w:r>
+      <w:r>
+        <w:t xml:space="preserve">that precedes today’s date.</w:t>
+      </w:r>
+    </w:p>
+    <w:p>
+      <w:pPr>
+        <w:pStyle w:val="Compact"/>
+        <w:numPr>
+          <w:ilvl w:val="2"/>
+          <w:numId w:val="1008"/>
+        </w:numPr>
+      </w:pPr>
+      <w:r>
+        <w:rPr>
+          <w:b/>
+          <w:bCs/>
+        </w:rPr>
+        <w:t xml:space="preserve">Example:</w:t>
+      </w:r>
+      <w:r>
+        <w:t xml:space="preserve"> </w:t>
+      </w:r>
+      <w:r>
+        <w:t xml:space="preserve">if today is</w:t>
+      </w:r>
+      <w:r>
+        <w:t xml:space="preserve"> </w:t>
+      </w:r>
+      <w:r>
+        <w:rPr>
+          <w:rStyle w:val="VerbatimChar"/>
+        </w:rPr>
+        <w:t xml:space="preserve">11/5/26</w:t>
+      </w:r>
+      <w:r>
+        <w:t xml:space="preserve"> </w:t>
+      </w:r>
+      <w:r>
+        <w:t xml:space="preserve">(11 May 2026), the end date is</w:t>
+      </w:r>
+      <w:r>
+        <w:t xml:space="preserve"> </w:t>
+      </w:r>
+      <w:r>
+        <w:rPr>
+          <w:rStyle w:val="VerbatimChar"/>
+        </w:rPr>
+        <w:t xml:space="preserve">30/4/26</w:t>
+      </w:r>
+      <w:r>
+        <w:t xml:space="preserve"> </w:t>
+      </w:r>
+      <w:r>
+        <w:t xml:space="preserve">(30 April 2026).</w:t>
+      </w:r>
+    </w:p>
+    <w:p>
+      <w:pPr>
+        <w:pStyle w:val="Compact"/>
+        <w:numPr>
+          <w:ilvl w:val="2"/>
+          <w:numId w:val="1008"/>
+        </w:numPr>
+      </w:pPr>
+      <w:r>
+        <w:rPr>
+          <w:b/>
+          <w:bCs/>
+        </w:rPr>
+        <w:t xml:space="preserve">Example:</w:t>
+      </w:r>
+      <w:r>
+        <w:t xml:space="preserve"> </w:t>
+      </w:r>
+      <w:r>
+        <w:t xml:space="preserve">if today is</w:t>
+      </w:r>
+      <w:r>
+        <w:t xml:space="preserve"> </w:t>
+      </w:r>
+      <w:r>
+        <w:rPr>
+          <w:rStyle w:val="VerbatimChar"/>
+        </w:rPr>
+        <w:t xml:space="preserve">5/12/26</w:t>
+      </w:r>
+      <w:r>
+        <w:t xml:space="preserve"> </w:t>
+      </w:r>
+      <w:r>
+        <w:t xml:space="preserve">(5 December 2026), the end date is</w:t>
+      </w:r>
+      <w:r>
+        <w:t xml:space="preserve"> </w:t>
+      </w:r>
+      <w:r>
+        <w:rPr>
+          <w:rStyle w:val="VerbatimChar"/>
+        </w:rPr>
+        <w:t xml:space="preserve">30/11/26</w:t>
+      </w:r>
+      <w:r>
+        <w:t xml:space="preserve"> </w:t>
+      </w:r>
+      <w:r>
+        <w:t xml:space="preserve">(30 November 2026).</w:t>
+      </w:r>
+    </w:p>
+    <w:p>
+      <w:pPr>
+        <w:pStyle w:val="Compact"/>
+        <w:numPr>
+          <w:ilvl w:val="1"/>
+          <w:numId w:val="1007"/>
+        </w:numPr>
+      </w:pPr>
+      <w:r>
+        <w:t xml:space="preserve">The current month is</w:t>
+      </w:r>
+      <w:r>
+        <w:t xml:space="preserve"> </w:t>
+      </w:r>
+      <w:r>
+        <w:rPr>
+          <w:b/>
+          <w:bCs/>
+        </w:rPr>
+        <w:t xml:space="preserve">always excluded</w:t>
+      </w:r>
+      <w:r>
+        <w:t xml:space="preserve"> </w:t>
+      </w:r>
+      <w:r>
+        <w:t xml:space="preserve">because it is not yet complete and would skew month-end aggregates.</w:t>
+      </w:r>
+    </w:p>
+    <w:p>
+      <w:pPr>
+        <w:pStyle w:val="Compact"/>
+        <w:numPr>
+          <w:ilvl w:val="0"/>
+          <w:numId w:val="1006"/>
+        </w:numPr>
+      </w:pPr>
+      <w:r>
+        <w:t xml:space="preserve">Apply the filter and wait until the filtered case list is fully loaded on screen.</w:t>
+      </w:r>
+    </w:p>
+    <w:p>
+      <w:pPr>
+        <w:pStyle w:val="Compact"/>
+        <w:numPr>
+          <w:ilvl w:val="0"/>
+          <w:numId w:val="1006"/>
+        </w:numPr>
+      </w:pPr>
+      <w:r>
+        <w:t xml:space="preserve">At the</w:t>
+      </w:r>
+      <w:r>
+        <w:t xml:space="preserve"> </w:t>
+      </w:r>
+      <w:r>
+        <w:rPr>
+          <w:b/>
+          <w:bCs/>
+        </w:rPr>
+        <w:t xml:space="preserve">top right of the screen</w:t>
+      </w:r>
+      <w:r>
+        <w:t xml:space="preserve">, click</w:t>
+      </w:r>
+      <w:r>
+        <w:t xml:space="preserve"> </w:t>
+      </w:r>
+      <w:r>
+        <w:rPr>
+          <w:b/>
+          <w:bCs/>
+        </w:rPr>
+        <w:t xml:space="preserve">Export</w:t>
+      </w:r>
+      <w:r>
+        <w:t xml:space="preserve">. Select</w:t>
+      </w:r>
+      <w:r>
+        <w:t xml:space="preserve"> </w:t>
+      </w:r>
+      <w:r>
+        <w:rPr>
+          <w:b/>
+          <w:bCs/>
+        </w:rPr>
+        <w:t xml:space="preserve">CSV</w:t>
+      </w:r>
+      <w:r>
+        <w:t xml:space="preserve"> </w:t>
+      </w:r>
+      <w:r>
+        <w:t xml:space="preserve">if prompted for a format.</w:t>
+      </w:r>
+    </w:p>
+    <w:p>
+      <w:pPr>
+        <w:pStyle w:val="Compact"/>
+        <w:numPr>
+          <w:ilvl w:val="0"/>
+          <w:numId w:val="1006"/>
+        </w:numPr>
+      </w:pPr>
+      <w:r>
+        <w:t xml:space="preserve">Save the downloaded file. By default it lands in</w:t>
+      </w:r>
+      <w:r>
+        <w:t xml:space="preserve"> </w:t>
+      </w:r>
+      <w:r>
+        <w:rPr>
+          <w:rStyle w:val="VerbatimChar"/>
+        </w:rPr>
+        <w:t xml:space="preserve">~/Downloads/</w:t>
+      </w:r>
+      <w:r>
+        <w:t xml:space="preserve"> </w:t>
+      </w:r>
+      <w:r>
+        <w:t xml:space="preserve">with a name of the form</w:t>
+      </w:r>
+      <w:r>
+        <w:t xml:space="preserve"> </w:t>
+      </w:r>
+      <w:r>
+        <w:rPr>
+          <w:rStyle w:val="VerbatimChar"/>
+        </w:rPr>
+        <w:t xml:space="preserve">cases_YYYY-MM-DD_-_YYYY-MM-DD_&lt;timestamp&gt;.csv</w:t>
+      </w:r>
+      <w:r>
+        <w:t xml:space="preserve">. Do not rename it — the processor accepts the default name.</w:t>
+      </w:r>
+    </w:p>
+    <w:bookmarkEnd w:id="16"/>
+    <w:bookmarkStart w:id="17" w:name="process-the-csv"/>
+    <w:p>
+      <w:pPr>
+        <w:pStyle w:val="Heading4"/>
+      </w:pPr>
+      <w:r>
+        <w:t xml:space="preserve">7.2.2 Process the CSV</w:t>
+      </w:r>
+    </w:p>
+    <w:p>
+      <w:pPr>
+        <w:pStyle w:val="FirstParagraph"/>
+      </w:pPr>
+      <w:r>
+        <w:t xml:space="preserve">The MI Analyst has two routes — either is acceptable, both produce identical output.</w:t>
+      </w:r>
+    </w:p>
+    <w:p>
+      <w:pPr>
+        <w:pStyle w:val="BodyText"/>
+      </w:pPr>
+      <w:r>
+        <w:rPr>
+          <w:b/>
+          <w:bCs/>
+        </w:rPr>
+        <w:t xml:space="preserve">Route A — via Claude Code</w:t>
+      </w:r>
+      <w:r>
+        <w:t xml:space="preserve"> </w:t>
+      </w:r>
+      <w:r>
+        <w:t xml:space="preserve">(recommended for non-technical users)</w:t>
+      </w:r>
+    </w:p>
+    <w:p>
+      <w:pPr>
+        <w:numPr>
+          <w:ilvl w:val="0"/>
+          <w:numId w:val="1009"/>
+        </w:numPr>
+      </w:pPr>
+      <w:r>
+        <w:t xml:space="preserve">Open</w:t>
+      </w:r>
+      <w:r>
+        <w:t xml:space="preserve"> </w:t>
+      </w:r>
+      <w:r>
+        <w:rPr>
+          <w:b/>
+          <w:bCs/>
+        </w:rPr>
+        <w:t xml:space="preserve">Terminal.app</w:t>
+      </w:r>
+      <w:r>
+        <w:t xml:space="preserve"> </w:t>
+      </w:r>
+      <w:r>
+        <w:t xml:space="preserve">on the workstation.</w:t>
+      </w:r>
+    </w:p>
+    <w:p>
+      <w:pPr>
+        <w:numPr>
+          <w:ilvl w:val="0"/>
+          <w:numId w:val="1009"/>
+        </w:numPr>
+      </w:pPr>
+      <w:r>
+        <w:t xml:space="preserve">Change into the MI Portal project directory:</w:t>
       </w:r>
     </w:p>
     <w:p>
@@ -1576,315 +1991,425 @@
         <w:rPr>
           <w:rStyle w:val="NormalTok"/>
         </w:rPr>
-        <w:t xml:space="preserve"> ~/Desktop/MI-Portal</w:t>
-      </w:r>
-      <w:r>
-        <w:br/>
-      </w:r>
-      <w:r>
-        <w:rPr>
-          <w:rStyle w:val="FunctionTok"/>
-        </w:rPr>
-        <w:t xml:space="preserve">git</w:t>
-      </w:r>
-      <w:r>
-        <w:rPr>
-          <w:rStyle w:val="NormalTok"/>
-        </w:rPr>
-        <w:t xml:space="preserve"> pull origin main</w:t>
-      </w:r>
-      <w:r>
-        <w:br/>
-      </w:r>
-      <w:r>
-        <w:rPr>
-          <w:rStyle w:val="ExtensionTok"/>
-        </w:rPr>
-        <w:t xml:space="preserve">node</w:t>
-      </w:r>
-      <w:r>
-        <w:rPr>
-          <w:rStyle w:val="NormalTok"/>
-        </w:rPr>
-        <w:t xml:space="preserve"> scripts/process-csv.js ~/Downloads/cases_</w:t>
-      </w:r>
-      <w:r>
-        <w:rPr>
-          <w:rStyle w:val="PreprocessorTok"/>
-        </w:rPr>
-        <w:t xml:space="preserve">*</w:t>
-      </w:r>
-      <w:r>
-        <w:rPr>
-          <w:rStyle w:val="NormalTok"/>
-        </w:rPr>
-        <w:t xml:space="preserve">_</w:t>
-      </w:r>
-      <w:r>
-        <w:rPr>
-          <w:rStyle w:val="OperatorTok"/>
-        </w:rPr>
-        <w:t xml:space="preserve">&lt;</w:t>
-      </w:r>
-      <w:r>
-        <w:rPr>
-          <w:rStyle w:val="NormalTok"/>
-        </w:rPr>
-        <w:t xml:space="preserve">timestamp</w:t>
-      </w:r>
-      <w:r>
-        <w:rPr>
-          <w:rStyle w:val="OperatorTok"/>
-        </w:rPr>
-        <w:t xml:space="preserve">&gt;</w:t>
-      </w:r>
-      <w:r>
-        <w:rPr>
-          <w:rStyle w:val="NormalTok"/>
-        </w:rPr>
-        <w:t xml:space="preserve">.csv</w:t>
+        <w:t xml:space="preserve"> /Users/daveb/Desktop/MI-Portal</w:t>
       </w:r>
     </w:p>
     <w:p>
       <w:pPr>
         <w:numPr>
           <w:ilvl w:val="0"/>
-          <w:numId w:val="1006"/>
-        </w:numPr>
-      </w:pPr>
-      <w:r>
-        <w:t xml:space="preserve">Review the script output. Each client line shows:</w:t>
-      </w:r>
-    </w:p>
-    <w:p>
-      <w:pPr>
-        <w:pStyle w:val="Compact"/>
-        <w:numPr>
-          <w:ilvl w:val="1"/>
-          <w:numId w:val="1007"/>
-        </w:numPr>
-      </w:pPr>
-      <w:r>
-        <w:t xml:space="preserve">Case count (total) and RTC count in parentheses</w:t>
-      </w:r>
-    </w:p>
-    <w:p>
-      <w:pPr>
-        <w:pStyle w:val="Compact"/>
-        <w:numPr>
-          <w:ilvl w:val="1"/>
-          <w:numId w:val="1007"/>
-        </w:numPr>
-      </w:pPr>
-      <w:r>
-        <w:t xml:space="preserve">SLA percentages for each measurable SLA dimension</w:t>
+          <w:numId w:val="1000"/>
+        </w:numPr>
+      </w:pPr>
+      <w:r>
+        <w:rPr>
+          <w:i/>
+          <w:iCs/>
+        </w:rPr>
+        <w:t xml:space="preserve">(or the equivalent path if the repository is cloned elsewhere on the analyst’s machine)</w:t>
       </w:r>
     </w:p>
     <w:p>
       <w:pPr>
         <w:numPr>
           <w:ilvl w:val="0"/>
-          <w:numId w:val="1006"/>
-        </w:numPr>
-      </w:pPr>
+          <w:numId w:val="1009"/>
+        </w:numPr>
+      </w:pPr>
+      <w:r>
+        <w:t xml:space="preserve">Start a Claude Code session by typing</w:t>
+      </w:r>
+      <w:r>
+        <w:t xml:space="preserve"> </w:t>
+      </w:r>
+      <w:r>
+        <w:rPr>
+          <w:rStyle w:val="VerbatimChar"/>
+        </w:rPr>
+        <w:t xml:space="preserve">claude</w:t>
+      </w:r>
+      <w:r>
+        <w:t xml:space="preserve"> </w:t>
+      </w:r>
+      <w:r>
+        <w:t xml:space="preserve">and pressing</w:t>
+      </w:r>
+      <w:r>
+        <w:t xml:space="preserve"> </w:t>
+      </w:r>
       <w:r>
         <w:rPr>
           <w:b/>
           <w:bCs/>
         </w:rPr>
-        <w:t xml:space="preserve">Verification checks</w:t>
-      </w:r>
-      <w:r>
-        <w:t xml:space="preserve"> </w:t>
-      </w:r>
-      <w:r>
-        <w:t xml:space="preserve">(all must pass before continuing):</w:t>
-      </w:r>
-    </w:p>
-    <w:p>
-      <w:pPr>
-        <w:pStyle w:val="Compact"/>
-        <w:numPr>
-          <w:ilvl w:val="1"/>
-          <w:numId w:val="1008"/>
-        </w:numPr>
+        <w:t xml:space="preserve">Return</w:t>
+      </w:r>
+      <w:r>
+        <w:t xml:space="preserve">. Claude Code is installed system-wide; if the command is not recognised, install it once per the instructions at https://docs.claude.com/claude-code.</w:t>
+      </w:r>
+    </w:p>
+    <w:p>
+      <w:pPr>
+        <w:numPr>
+          <w:ilvl w:val="0"/>
+          <w:numId w:val="1009"/>
+        </w:numPr>
+      </w:pPr>
+      <w:r>
+        <w:t xml:space="preserve">At the Claude Code prompt, paste the full path of the file saved in §7.2.1 step 8 and ask Claude to update the MI. A working prompt is:</w:t>
+      </w:r>
+    </w:p>
+    <w:p>
+      <w:pPr>
+        <w:pStyle w:val="BlockText"/>
+        <w:numPr>
+          <w:ilvl w:val="0"/>
+          <w:numId w:val="1000"/>
+        </w:numPr>
+      </w:pPr>
+      <w:r>
+        <w:t xml:space="preserve">Please update the MI from this CSV:</w:t>
+      </w:r>
+      <w:r>
+        <w:t xml:space="preserve"> </w:t>
+      </w:r>
+      <w:r>
+        <w:rPr>
+          <w:rStyle w:val="VerbatimChar"/>
+        </w:rPr>
+        <w:t xml:space="preserve">/Users/daveb/Downloads/cases_2026-01-01_-_2026-04-30_&lt;timestamp&gt;.csv</w:t>
+      </w:r>
+    </w:p>
+    <w:p>
+      <w:pPr>
+        <w:numPr>
+          <w:ilvl w:val="0"/>
+          <w:numId w:val="1009"/>
+        </w:numPr>
+      </w:pPr>
+      <w:r>
+        <w:t xml:space="preserve">Claude will run the processor, summarise the per-client output, perform the verification checks listed in §7.2.3, and offer to commit and push the changes. Approve the commit when prompted.</w:t>
+      </w:r>
+    </w:p>
+    <w:p>
+      <w:pPr>
+        <w:pStyle w:val="FirstParagraph"/>
       </w:pPr>
       <w:r>
         <w:rPr>
           <w:b/>
           <w:bCs/>
         </w:rPr>
-        <w:t xml:space="preserve">No</w:t>
-      </w:r>
+        <w:t xml:space="preserve">Route B — direct terminal command</w:t>
+      </w:r>
+      <w:r>
+        <w:t xml:space="preserve"> </w:t>
+      </w:r>
+      <w:r>
+        <w:t xml:space="preserve">(for technical users)</w:t>
+      </w:r>
+    </w:p>
+    <w:p>
+      <w:pPr>
+        <w:pStyle w:val="SourceCode"/>
+      </w:pPr>
+      <w:r>
+        <w:rPr>
+          <w:rStyle w:val="BuiltInTok"/>
+        </w:rPr>
+        <w:t xml:space="preserve">cd</w:t>
+      </w:r>
+      <w:r>
+        <w:rPr>
+          <w:rStyle w:val="NormalTok"/>
+        </w:rPr>
+        <w:t xml:space="preserve"> /Users/daveb/Desktop/MI-Portal</w:t>
+      </w:r>
+      <w:r>
+        <w:br/>
+      </w:r>
+      <w:r>
+        <w:rPr>
+          <w:rStyle w:val="FunctionTok"/>
+        </w:rPr>
+        <w:t xml:space="preserve">git</w:t>
+      </w:r>
+      <w:r>
+        <w:rPr>
+          <w:rStyle w:val="NormalTok"/>
+        </w:rPr>
+        <w:t xml:space="preserve"> pull origin main</w:t>
+      </w:r>
+      <w:r>
+        <w:br/>
+      </w:r>
+      <w:r>
+        <w:rPr>
+          <w:rStyle w:val="ExtensionTok"/>
+        </w:rPr>
+        <w:t xml:space="preserve">node</w:t>
+      </w:r>
+      <w:r>
+        <w:rPr>
+          <w:rStyle w:val="NormalTok"/>
+        </w:rPr>
+        <w:t xml:space="preserve"> scripts/process-csv.js ~/Downloads/cases_</w:t>
+      </w:r>
+      <w:r>
+        <w:rPr>
+          <w:rStyle w:val="PreprocessorTok"/>
+        </w:rPr>
+        <w:t xml:space="preserve">*</w:t>
+      </w:r>
+      <w:r>
+        <w:rPr>
+          <w:rStyle w:val="NormalTok"/>
+        </w:rPr>
+        <w:t xml:space="preserve">_</w:t>
+      </w:r>
+      <w:r>
+        <w:rPr>
+          <w:rStyle w:val="OperatorTok"/>
+        </w:rPr>
+        <w:t xml:space="preserve">&lt;</w:t>
+      </w:r>
+      <w:r>
+        <w:rPr>
+          <w:rStyle w:val="NormalTok"/>
+        </w:rPr>
+        <w:t xml:space="preserve">timestamp</w:t>
+      </w:r>
+      <w:r>
+        <w:rPr>
+          <w:rStyle w:val="OperatorTok"/>
+        </w:rPr>
+        <w:t xml:space="preserve">&gt;</w:t>
+      </w:r>
+      <w:r>
+        <w:rPr>
+          <w:rStyle w:val="NormalTok"/>
+        </w:rPr>
+        <w:t xml:space="preserve">.csv</w:t>
+      </w:r>
+    </w:p>
+    <w:bookmarkEnd w:id="17"/>
+    <w:bookmarkStart w:id="18" w:name="verify-the-output"/>
+    <w:p>
+      <w:pPr>
+        <w:pStyle w:val="Heading4"/>
+      </w:pPr>
+      <w:r>
+        <w:t xml:space="preserve">7.2.3 Verify the output</w:t>
+      </w:r>
+    </w:p>
+    <w:p>
+      <w:pPr>
+        <w:pStyle w:val="FirstParagraph"/>
+      </w:pPr>
+      <w:r>
+        <w:t xml:space="preserve">The MI Analyst shall review the script (or Claude Code) output. Each client line shows the case count (total) and RTC count in parentheses, plus SLA percentages for each measurable SLA dimension.</w:t>
+      </w:r>
+    </w:p>
+    <w:p>
+      <w:pPr>
+        <w:pStyle w:val="BodyText"/>
+      </w:pPr>
       <w:r>
         <w:rPr>
           <w:b/>
           <w:bCs/>
         </w:rPr>
-        <w:t xml:space="preserve"> </w:t>
-      </w:r>
+        <w:t xml:space="preserve">Verification checks</w:t>
+      </w:r>
+      <w:r>
+        <w:t xml:space="preserve"> </w:t>
+      </w:r>
+      <w:r>
+        <w:t xml:space="preserve">— all must pass before continuing to §7.3:</w:t>
+      </w:r>
+    </w:p>
+    <w:p>
+      <w:pPr>
+        <w:pStyle w:val="Compact"/>
+        <w:numPr>
+          <w:ilvl w:val="0"/>
+          <w:numId w:val="1010"/>
+        </w:numPr>
+      </w:pPr>
       <w:r>
         <w:rPr>
           <w:b/>
           <w:bCs/>
         </w:rPr>
-        <w:t xml:space="preserve">“Unmatched client names”</w:t>
-      </w:r>
-      <w:r>
-        <w:t xml:space="preserve"> </w:t>
-      </w:r>
-      <w:r>
-        <w:t xml:space="preserve">appear in the script output. If any do, add the client name (lowercased) to</w:t>
-      </w:r>
-      <w:r>
-        <w:t xml:space="preserve"> </w:t>
-      </w:r>
-      <w:r>
-        <w:rPr>
-          <w:rStyle w:val="VerbatimChar"/>
-        </w:rPr>
-        <w:t xml:space="preserve">scripts/client-map.json</w:t>
-      </w:r>
-      <w:r>
-        <w:t xml:space="preserve"> </w:t>
-      </w:r>
-      <w:r>
-        <w:t xml:space="preserve">mapping to the correct file, then re-run.</w:t>
-      </w:r>
-    </w:p>
-    <w:p>
-      <w:pPr>
-        <w:pStyle w:val="Compact"/>
-        <w:numPr>
-          <w:ilvl w:val="1"/>
-          <w:numId w:val="1009"/>
-        </w:numPr>
-      </w:pPr>
+        <w:t xml:space="preserve">No</w:t>
+      </w:r>
       <w:r>
         <w:rPr>
           <w:b/>
           <w:bCs/>
         </w:rPr>
-        <w:t xml:space="preserve">Total case count matches expectation</w:t>
-      </w:r>
-      <w:r>
-        <w:t xml:space="preserve"> </w:t>
-      </w:r>
-      <w:r>
-        <w:t xml:space="preserve">for the period (compare to TrackOps Cases view total).</w:t>
-      </w:r>
-    </w:p>
-    <w:p>
-      <w:pPr>
-        <w:pStyle w:val="Compact"/>
-        <w:numPr>
-          <w:ilvl w:val="1"/>
-          <w:numId w:val="1010"/>
-        </w:numPr>
-      </w:pPr>
+        <w:t xml:space="preserve"> </w:t>
+      </w:r>
       <w:r>
         <w:rPr>
           <w:b/>
           <w:bCs/>
         </w:rPr>
-        <w:t xml:space="preserve">No script errors</w:t>
-      </w:r>
-      <w:r>
-        <w:t xml:space="preserve"> </w:t>
-      </w:r>
-      <w:r>
-        <w:t xml:space="preserve">(</w:t>
-      </w:r>
-      <w:r>
-        <w:t xml:space="preserve">“ReferenceError”</w:t>
-      </w:r>
-      <w:r>
-        <w:t xml:space="preserve">,</w:t>
-      </w:r>
-      <w:r>
-        <w:t xml:space="preserve"> </w:t>
-      </w:r>
-      <w:r>
-        <w:t xml:space="preserve">“SyntaxError”</w:t>
-      </w:r>
-      <w:r>
-        <w:t xml:space="preserve"> </w:t>
-      </w:r>
-      <w:r>
-        <w:t xml:space="preserve">etc.).</w:t>
-      </w:r>
-    </w:p>
-    <w:p>
-      <w:pPr>
-        <w:numPr>
-          <w:ilvl w:val="0"/>
-          <w:numId w:val="1006"/>
-        </w:numPr>
-      </w:pPr>
-      <w:r>
-        <w:t xml:space="preserve">Open</w:t>
-      </w:r>
-      <w:r>
-        <w:t xml:space="preserve"> </w:t>
-      </w:r>
-      <w:r>
-        <w:rPr>
-          <w:rStyle w:val="VerbatimChar"/>
-        </w:rPr>
-        <w:t xml:space="preserve">clients/zego.js</w:t>
-      </w:r>
-      <w:r>
-        <w:t xml:space="preserve"> </w:t>
-      </w:r>
-      <w:r>
-        <w:t xml:space="preserve">in a text editor and confirm the header reads</w:t>
-      </w:r>
-      <w:r>
-        <w:t xml:space="preserve"> </w:t>
-      </w:r>
-      <w:r>
-        <w:rPr>
-          <w:rStyle w:val="VerbatimChar"/>
-        </w:rPr>
-        <w:t xml:space="preserve">Period: Jan–Dec [year]</w:t>
-      </w:r>
-      <w:r>
-        <w:t xml:space="preserve"> </w:t>
-      </w:r>
-      <w:r>
-        <w:t xml:space="preserve">and</w:t>
-      </w:r>
-      <w:r>
-        <w:t xml:space="preserve"> </w:t>
-      </w:r>
-      <w:r>
-        <w:rPr>
-          <w:rStyle w:val="VerbatimChar"/>
-        </w:rPr>
-        <w:t xml:space="preserve">Updated: [today's date]</w:t>
-      </w:r>
-      <w:r>
-        <w:t xml:space="preserve">.</w:t>
-      </w:r>
-    </w:p>
-    <w:bookmarkEnd w:id="16"/>
-    <w:bookmarkStart w:id="17" w:name="production-day-publish-day-0-5-min"/>
-    <w:p>
-      <w:pPr>
-        <w:pStyle w:val="Heading3"/>
-      </w:pPr>
-      <w:r>
-        <w:t xml:space="preserve">7.3 Production day — publish (Day 0, ~5 min)</w:t>
-      </w:r>
-    </w:p>
-    <w:p>
-      <w:pPr>
+        <w:t xml:space="preserve">“Unmatched client names”</w:t>
+      </w:r>
+      <w:r>
+        <w:t xml:space="preserve"> </w:t>
+      </w:r>
+      <w:r>
+        <w:t xml:space="preserve">appear in the output. If any do, add the client name (lowercased) to</w:t>
+      </w:r>
+      <w:r>
+        <w:t xml:space="preserve"> </w:t>
+      </w:r>
+      <w:r>
+        <w:rPr>
+          <w:rStyle w:val="VerbatimChar"/>
+        </w:rPr>
+        <w:t xml:space="preserve">scripts/client-map.json</w:t>
+      </w:r>
+      <w:r>
+        <w:t xml:space="preserve"> </w:t>
+      </w:r>
+      <w:r>
+        <w:t xml:space="preserve">mapping to the correct file, then re-run.</w:t>
+      </w:r>
+    </w:p>
+    <w:p>
+      <w:pPr>
+        <w:pStyle w:val="Compact"/>
         <w:numPr>
           <w:ilvl w:val="0"/>
           <w:numId w:val="1011"/>
         </w:numPr>
       </w:pPr>
       <w:r>
+        <w:rPr>
+          <w:b/>
+          <w:bCs/>
+        </w:rPr>
+        <w:t xml:space="preserve">Total case count matches expectation</w:t>
+      </w:r>
+      <w:r>
+        <w:t xml:space="preserve"> </w:t>
+      </w:r>
+      <w:r>
+        <w:t xml:space="preserve">for the period (compare to the TrackOps Case List total).</w:t>
+      </w:r>
+    </w:p>
+    <w:p>
+      <w:pPr>
+        <w:pStyle w:val="Compact"/>
+        <w:numPr>
+          <w:ilvl w:val="0"/>
+          <w:numId w:val="1012"/>
+        </w:numPr>
+      </w:pPr>
+      <w:r>
+        <w:rPr>
+          <w:b/>
+          <w:bCs/>
+        </w:rPr>
+        <w:t xml:space="preserve">No script errors</w:t>
+      </w:r>
+      <w:r>
+        <w:t xml:space="preserve"> </w:t>
+      </w:r>
+      <w:r>
+        <w:t xml:space="preserve">(</w:t>
+      </w:r>
+      <w:r>
+        <w:t xml:space="preserve">“ReferenceError”</w:t>
+      </w:r>
+      <w:r>
+        <w:t xml:space="preserve">,</w:t>
+      </w:r>
+      <w:r>
+        <w:t xml:space="preserve"> </w:t>
+      </w:r>
+      <w:r>
+        <w:t xml:space="preserve">“SyntaxError”</w:t>
+      </w:r>
+      <w:r>
+        <w:t xml:space="preserve"> </w:t>
+      </w:r>
+      <w:r>
+        <w:t xml:space="preserve">etc.).</w:t>
+      </w:r>
+    </w:p>
+    <w:p>
+      <w:pPr>
+        <w:pStyle w:val="FirstParagraph"/>
+      </w:pPr>
+      <w:r>
+        <w:t xml:space="preserve">Open</w:t>
+      </w:r>
+      <w:r>
+        <w:t xml:space="preserve"> </w:t>
+      </w:r>
+      <w:r>
+        <w:rPr>
+          <w:rStyle w:val="VerbatimChar"/>
+        </w:rPr>
+        <w:t xml:space="preserve">clients/zego.js</w:t>
+      </w:r>
+      <w:r>
+        <w:t xml:space="preserve"> </w:t>
+      </w:r>
+      <w:r>
+        <w:t xml:space="preserve">in a text editor and confirm the header reads</w:t>
+      </w:r>
+      <w:r>
+        <w:t xml:space="preserve"> </w:t>
+      </w:r>
+      <w:r>
+        <w:rPr>
+          <w:rStyle w:val="VerbatimChar"/>
+        </w:rPr>
+        <w:t xml:space="preserve">Period: Jan–Dec [year]</w:t>
+      </w:r>
+      <w:r>
+        <w:t xml:space="preserve"> </w:t>
+      </w:r>
+      <w:r>
+        <w:t xml:space="preserve">and</w:t>
+      </w:r>
+      <w:r>
+        <w:t xml:space="preserve"> </w:t>
+      </w:r>
+      <w:r>
+        <w:rPr>
+          <w:rStyle w:val="VerbatimChar"/>
+        </w:rPr>
+        <w:t xml:space="preserve">Updated: [today's date]</w:t>
+      </w:r>
+      <w:r>
+        <w:t xml:space="preserve">.</w:t>
+      </w:r>
+    </w:p>
+    <w:bookmarkEnd w:id="18"/>
+    <w:bookmarkEnd w:id="19"/>
+    <w:bookmarkStart w:id="20" w:name="production-day-publish-day-0-5-min"/>
+    <w:p>
+      <w:pPr>
+        <w:pStyle w:val="Heading3"/>
+      </w:pPr>
+      <w:r>
+        <w:t xml:space="preserve">7.3 Production day — publish (Day 0, ~5 min)</w:t>
+      </w:r>
+    </w:p>
+    <w:p>
+      <w:pPr>
+        <w:numPr>
+          <w:ilvl w:val="0"/>
+          <w:numId w:val="1013"/>
+        </w:numPr>
+      </w:pPr>
+      <w:r>
         <w:t xml:space="preserve">Review the changes:</w:t>
       </w:r>
     </w:p>
@@ -1951,7 +2476,7 @@
       <w:pPr>
         <w:numPr>
           <w:ilvl w:val="0"/>
-          <w:numId w:val="1011"/>
+          <w:numId w:val="1013"/>
         </w:numPr>
       </w:pPr>
       <w:r>
@@ -2031,7 +2556,7 @@
       <w:pPr>
         <w:numPr>
           <w:ilvl w:val="0"/>
-          <w:numId w:val="1011"/>
+          <w:numId w:val="1013"/>
         </w:numPr>
       </w:pPr>
       <w:r>
@@ -2080,7 +2605,7 @@
         <w:pStyle w:val="Compact"/>
         <w:numPr>
           <w:ilvl w:val="1"/>
-          <w:numId w:val="1012"/>
+          <w:numId w:val="1014"/>
         </w:numPr>
       </w:pPr>
       <w:r>
@@ -2092,7 +2617,7 @@
         <w:pStyle w:val="Compact"/>
         <w:numPr>
           <w:ilvl w:val="1"/>
-          <w:numId w:val="1013"/>
+          <w:numId w:val="1015"/>
         </w:numPr>
       </w:pPr>
       <w:r>
@@ -2110,15 +2635,15 @@
         <w:pStyle w:val="Compact"/>
         <w:numPr>
           <w:ilvl w:val="1"/>
-          <w:numId w:val="1014"/>
+          <w:numId w:val="1016"/>
         </w:numPr>
       </w:pPr>
       <w:r>
         <w:t xml:space="preserve">At least one Case Detail Log row matches a case verified in §7.1 against the same TrackOps record</w:t>
       </w:r>
     </w:p>
-    <w:bookmarkEnd w:id="17"/>
-    <w:bookmarkStart w:id="18" w:name="automated-distribution-day-0-0800-utc"/>
+    <w:bookmarkEnd w:id="20"/>
+    <w:bookmarkStart w:id="21" w:name="automated-distribution-day-0-0800-utc"/>
     <w:p>
       <w:pPr>
         <w:pStyle w:val="Heading3"/>
@@ -2152,7 +2677,7 @@
         <w:pStyle w:val="Compact"/>
         <w:numPr>
           <w:ilvl w:val="0"/>
-          <w:numId w:val="1015"/>
+          <w:numId w:val="1017"/>
         </w:numPr>
       </w:pPr>
       <w:r>
@@ -2188,7 +2713,7 @@
         <w:pStyle w:val="Compact"/>
         <w:numPr>
           <w:ilvl w:val="0"/>
-          <w:numId w:val="1015"/>
+          <w:numId w:val="1017"/>
         </w:numPr>
       </w:pPr>
       <w:r>
@@ -2200,7 +2725,7 @@
         <w:pStyle w:val="Compact"/>
         <w:numPr>
           <w:ilvl w:val="0"/>
-          <w:numId w:val="1015"/>
+          <w:numId w:val="1017"/>
         </w:numPr>
       </w:pPr>
       <w:r>
@@ -2212,7 +2737,7 @@
         <w:pStyle w:val="Compact"/>
         <w:numPr>
           <w:ilvl w:val="0"/>
-          <w:numId w:val="1015"/>
+          <w:numId w:val="1017"/>
         </w:numPr>
       </w:pPr>
       <w:r>
@@ -2237,8 +2762,8 @@
         <w:t xml:space="preserve">The MI Analyst shall, however, confirm the run on Day +1 (§7.5).</w:t>
       </w:r>
     </w:p>
-    <w:bookmarkEnd w:id="18"/>
-    <w:bookmarkStart w:id="19" w:name="post-release-verification-day-1-10-min"/>
+    <w:bookmarkEnd w:id="21"/>
+    <w:bookmarkStart w:id="22" w:name="post-release-verification-day-1-10-min"/>
     <w:p>
       <w:pPr>
         <w:pStyle w:val="Heading3"/>
@@ -2260,7 +2785,7 @@
         <w:pStyle w:val="Compact"/>
         <w:numPr>
           <w:ilvl w:val="0"/>
-          <w:numId w:val="1016"/>
+          <w:numId w:val="1018"/>
         </w:numPr>
       </w:pPr>
       <w:r>
@@ -2296,7 +2821,7 @@
         <w:pStyle w:val="Compact"/>
         <w:numPr>
           <w:ilvl w:val="0"/>
-          <w:numId w:val="1016"/>
+          <w:numId w:val="1018"/>
         </w:numPr>
       </w:pPr>
       <w:r>
@@ -2308,7 +2833,7 @@
         <w:pStyle w:val="Compact"/>
         <w:numPr>
           <w:ilvl w:val="0"/>
-          <w:numId w:val="1016"/>
+          <w:numId w:val="1018"/>
         </w:numPr>
       </w:pPr>
       <w:r>
@@ -2359,7 +2884,7 @@
         <w:pStyle w:val="Compact"/>
         <w:numPr>
           <w:ilvl w:val="0"/>
-          <w:numId w:val="1016"/>
+          <w:numId w:val="1018"/>
         </w:numPr>
       </w:pPr>
       <w:r>
@@ -2398,7 +2923,7 @@
         <w:pStyle w:val="Compact"/>
         <w:numPr>
           <w:ilvl w:val="0"/>
-          <w:numId w:val="1016"/>
+          <w:numId w:val="1018"/>
         </w:numPr>
       </w:pPr>
       <w:r>
@@ -2420,15 +2945,15 @@
         <w:pStyle w:val="Compact"/>
         <w:numPr>
           <w:ilvl w:val="0"/>
-          <w:numId w:val="1016"/>
+          <w:numId w:val="1018"/>
         </w:numPr>
       </w:pPr>
       <w:r>
         <w:t xml:space="preserve">Record completion on Annex C.</w:t>
       </w:r>
     </w:p>
-    <w:bookmarkEnd w:id="19"/>
-    <w:bookmarkStart w:id="20" w:name="adding-or-removing-a-client"/>
+    <w:bookmarkEnd w:id="22"/>
+    <w:bookmarkStart w:id="23" w:name="adding-or-removing-a-client"/>
     <w:p>
       <w:pPr>
         <w:pStyle w:val="Heading3"/>
@@ -2450,7 +2975,7 @@
         <w:pStyle w:val="Compact"/>
         <w:numPr>
           <w:ilvl w:val="0"/>
-          <w:numId w:val="1017"/>
+          <w:numId w:val="1019"/>
         </w:numPr>
       </w:pPr>
       <w:r>
@@ -2466,7 +2991,7 @@
         <w:pStyle w:val="Compact"/>
         <w:numPr>
           <w:ilvl w:val="1"/>
-          <w:numId w:val="1018"/>
+          <w:numId w:val="1020"/>
         </w:numPr>
       </w:pPr>
       <w:r>
@@ -2487,7 +3012,7 @@
         <w:pStyle w:val="Compact"/>
         <w:numPr>
           <w:ilvl w:val="1"/>
-          <w:numId w:val="1018"/>
+          <w:numId w:val="1020"/>
         </w:numPr>
       </w:pPr>
       <w:r>
@@ -2520,7 +3045,7 @@
         <w:pStyle w:val="Compact"/>
         <w:numPr>
           <w:ilvl w:val="1"/>
-          <w:numId w:val="1018"/>
+          <w:numId w:val="1020"/>
         </w:numPr>
       </w:pPr>
       <w:r>
@@ -2547,7 +3072,7 @@
         <w:pStyle w:val="Compact"/>
         <w:numPr>
           <w:ilvl w:val="1"/>
-          <w:numId w:val="1018"/>
+          <w:numId w:val="1020"/>
         </w:numPr>
       </w:pPr>
       <w:r>
@@ -2571,7 +3096,7 @@
         <w:pStyle w:val="Compact"/>
         <w:numPr>
           <w:ilvl w:val="1"/>
-          <w:numId w:val="1018"/>
+          <w:numId w:val="1020"/>
         </w:numPr>
       </w:pPr>
       <w:r>
@@ -2613,7 +3138,7 @@
         <w:pStyle w:val="Compact"/>
         <w:numPr>
           <w:ilvl w:val="1"/>
-          <w:numId w:val="1018"/>
+          <w:numId w:val="1020"/>
         </w:numPr>
       </w:pPr>
       <w:r>
@@ -2625,7 +3150,7 @@
         <w:pStyle w:val="Compact"/>
         <w:numPr>
           <w:ilvl w:val="0"/>
-          <w:numId w:val="1017"/>
+          <w:numId w:val="1019"/>
         </w:numPr>
       </w:pPr>
       <w:r>
@@ -2641,7 +3166,7 @@
         <w:pStyle w:val="Compact"/>
         <w:numPr>
           <w:ilvl w:val="1"/>
-          <w:numId w:val="1019"/>
+          <w:numId w:val="1021"/>
         </w:numPr>
       </w:pPr>
       <w:r>
@@ -2677,7 +3202,7 @@
         <w:pStyle w:val="Compact"/>
         <w:numPr>
           <w:ilvl w:val="1"/>
-          <w:numId w:val="1019"/>
+          <w:numId w:val="1021"/>
         </w:numPr>
       </w:pPr>
       <w:r>
@@ -2704,7 +3229,7 @@
         <w:pStyle w:val="Compact"/>
         <w:numPr>
           <w:ilvl w:val="1"/>
-          <w:numId w:val="1019"/>
+          <w:numId w:val="1021"/>
         </w:numPr>
       </w:pPr>
       <w:r>
@@ -2776,9 +3301,9 @@
         <w:t xml:space="preserve">.</w:t>
       </w:r>
     </w:p>
-    <w:bookmarkEnd w:id="20"/>
-    <w:bookmarkEnd w:id="21"/>
-    <w:bookmarkStart w:id="22" w:name="records-retained"/>
+    <w:bookmarkEnd w:id="23"/>
+    <w:bookmarkEnd w:id="24"/>
+    <w:bookmarkStart w:id="25" w:name="records-retained"/>
     <w:p>
       <w:pPr>
         <w:pStyle w:val="Heading2"/>
@@ -3055,8 +3580,8 @@
         </w:tc>
       </w:tr>
     </w:tbl>
-    <w:bookmarkEnd w:id="22"/>
-    <w:bookmarkStart w:id="23" w:name="exception-handling"/>
+    <w:bookmarkEnd w:id="25"/>
+    <w:bookmarkStart w:id="26" w:name="exception-handling"/>
     <w:p>
       <w:pPr>
         <w:pStyle w:val="Heading2"/>
@@ -3487,8 +4012,8 @@
         </w:tc>
       </w:tr>
     </w:tbl>
-    <w:bookmarkEnd w:id="23"/>
-    <w:bookmarkStart w:id="27" w:name="annexes"/>
+    <w:bookmarkEnd w:id="26"/>
+    <w:bookmarkStart w:id="30" w:name="annexes"/>
     <w:p>
       <w:pPr>
         <w:pStyle w:val="Heading2"/>
@@ -3497,7 +4022,7 @@
         <w:t xml:space="preserve">10. Annexes</w:t>
       </w:r>
     </w:p>
-    <w:bookmarkStart w:id="24" w:name="annex-a-mi-analyst-training-checklist"/>
+    <w:bookmarkStart w:id="27" w:name="annex-a-mi-analyst-training-checklist"/>
     <w:p>
       <w:pPr>
         <w:pStyle w:val="Heading3"/>
@@ -3512,30 +4037,6 @@
       </w:pPr>
       <w:r>
         <w:t xml:space="preserve">A new MI Analyst shall not perform an unsupervised release until they have:</w:t>
-      </w:r>
-    </w:p>
-    <w:p>
-      <w:pPr>
-        <w:pStyle w:val="Compact"/>
-        <w:numPr>
-          <w:ilvl w:val="0"/>
-          <w:numId w:val="1020"/>
-        </w:numPr>
-      </w:pPr>
-      <w:r>
-        <w:t xml:space="preserve">Read this procedure in full</w:t>
-      </w:r>
-    </w:p>
-    <w:p>
-      <w:pPr>
-        <w:pStyle w:val="Compact"/>
-        <w:numPr>
-          <w:ilvl w:val="0"/>
-          <w:numId w:val="1021"/>
-        </w:numPr>
-      </w:pPr>
-      <w:r>
-        <w:t xml:space="preserve">Observed one full release performed by the current MI Analyst</w:t>
       </w:r>
     </w:p>
     <w:p>
@@ -3547,7 +4048,7 @@
         </w:numPr>
       </w:pPr>
       <w:r>
-        <w:t xml:space="preserve">Performed one supervised release end-to-end</w:t>
+        <w:t xml:space="preserve">Read this procedure in full</w:t>
       </w:r>
     </w:p>
     <w:p>
@@ -3559,7 +4060,7 @@
         </w:numPr>
       </w:pPr>
       <w:r>
-        <w:t xml:space="preserve">Demonstrated correct identification of a data-quality typo in TrackOps and corrective action</w:t>
+        <w:t xml:space="preserve">Observed one full release performed by the current MI Analyst</w:t>
       </w:r>
     </w:p>
     <w:p>
@@ -3571,7 +4072,7 @@
         </w:numPr>
       </w:pPr>
       <w:r>
-        <w:t xml:space="preserve">Demonstrated retrieval of a Microsoft Graph workflow run log and interpretation of its output</w:t>
+        <w:t xml:space="preserve">Performed one supervised release end-to-end</w:t>
       </w:r>
     </w:p>
     <w:p>
@@ -3583,11 +4084,35 @@
         </w:numPr>
       </w:pPr>
       <w:r>
+        <w:t xml:space="preserve">Demonstrated correct identification of a data-quality typo in TrackOps and corrective action</w:t>
+      </w:r>
+    </w:p>
+    <w:p>
+      <w:pPr>
+        <w:pStyle w:val="Compact"/>
+        <w:numPr>
+          <w:ilvl w:val="0"/>
+          <w:numId w:val="1026"/>
+        </w:numPr>
+      </w:pPr>
+      <w:r>
+        <w:t xml:space="preserve">Demonstrated retrieval of a Microsoft Graph workflow run log and interpretation of its output</w:t>
+      </w:r>
+    </w:p>
+    <w:p>
+      <w:pPr>
+        <w:pStyle w:val="Compact"/>
+        <w:numPr>
+          <w:ilvl w:val="0"/>
+          <w:numId w:val="1027"/>
+        </w:numPr>
+      </w:pPr>
+      <w:r>
         <w:t xml:space="preserve">Signed Annex C against their first supervised release</w:t>
       </w:r>
     </w:p>
-    <w:bookmarkEnd w:id="24"/>
-    <w:bookmarkStart w:id="25" w:name="annex-b-secret-rotation-schedule"/>
+    <w:bookmarkEnd w:id="27"/>
+    <w:bookmarkStart w:id="28" w:name="annex-b-secret-rotation-schedule"/>
     <w:p>
       <w:pPr>
         <w:pStyle w:val="Heading3"/>
@@ -3809,8 +4334,8 @@
         </w:tc>
       </w:tr>
     </w:tbl>
-    <w:bookmarkEnd w:id="25"/>
-    <w:bookmarkStart w:id="26" w:name="annex-c-monthly-mi-release-record"/>
+    <w:bookmarkEnd w:id="28"/>
+    <w:bookmarkStart w:id="29" w:name="annex-c-monthly-mi-release-record"/>
     <w:p>
       <w:pPr>
         <w:pStyle w:val="Heading3"/>
@@ -4033,9 +4558,9 @@
         <w:t xml:space="preserve">                        (MI Analyst signature)</w:t>
       </w:r>
     </w:p>
-    <w:bookmarkEnd w:id="26"/>
-    <w:bookmarkEnd w:id="27"/>
-    <w:bookmarkStart w:id="28" w:name="revision-history"/>
+    <w:bookmarkEnd w:id="29"/>
+    <w:bookmarkEnd w:id="30"/>
+    <w:bookmarkStart w:id="31" w:name="revision-history"/>
     <w:p>
       <w:pPr>
         <w:pStyle w:val="Heading2"/>
@@ -4152,9 +4677,55 @@
           </w:p>
         </w:tc>
       </w:tr>
+      <w:tr>
+        <w:tc>
+          <w:tcPr/>
+          <w:p>
+            <w:pPr>
+              <w:pStyle w:val="Compact"/>
+            </w:pPr>
+            <w:r>
+              <w:t xml:space="preserve">1.1</w:t>
+            </w:r>
+          </w:p>
+        </w:tc>
+        <w:tc>
+          <w:tcPr/>
+          <w:p>
+            <w:pPr>
+              <w:pStyle w:val="Compact"/>
+            </w:pPr>
+            <w:r>
+              <w:t xml:space="preserve">11 May 2026</w:t>
+            </w:r>
+          </w:p>
+        </w:tc>
+        <w:tc>
+          <w:tcPr/>
+          <w:p>
+            <w:pPr>
+              <w:pStyle w:val="Compact"/>
+            </w:pPr>
+            <w:r>
+              <w:t xml:space="preserve">David Booker</w:t>
+            </w:r>
+          </w:p>
+        </w:tc>
+        <w:tc>
+          <w:tcPr/>
+          <w:p>
+            <w:pPr>
+              <w:pStyle w:val="Compact"/>
+            </w:pPr>
+            <w:r>
+              <w:t xml:space="preserve">Expanded §7.2 with the specific TrackOps export click-path (Case List → Advanced → date-range filter at foot of right-hand sidebar) and an explicit rule for choosing the end date (last day of the last full calendar month preceding today). Added Route A (Claude Code) alongside Route B (direct terminal command) for running the processor.</w:t>
+            </w:r>
+          </w:p>
+        </w:tc>
+      </w:tr>
     </w:tbl>
-    <w:bookmarkEnd w:id="28"/>
-    <w:bookmarkEnd w:id="29"/>
+    <w:bookmarkEnd w:id="31"/>
+    <w:bookmarkEnd w:id="32"/>
     <w:sectPr>
       <w:footnotePr>
         <w:numRestart w:val="eachSect"/>
@@ -4608,15 +5179,9 @@
     <w:abstractNumId w:val="991"/>
   </w:num>
   <w:num w:numId="1008">
-    <w:abstractNumId w:val="992"/>
+    <w:abstractNumId w:val="991"/>
   </w:num>
   <w:num w:numId="1009">
-    <w:abstractNumId w:val="992"/>
-  </w:num>
-  <w:num w:numId="1010">
-    <w:abstractNumId w:val="992"/>
-  </w:num>
-  <w:num w:numId="1011">
     <w:abstractNumId w:val="99411"/>
     <w:lvlOverride w:ilvl="0">
       <w:startOverride w:val="1"/>
@@ -4646,16 +5211,16 @@
       <w:startOverride w:val="1"/>
     </w:lvlOverride>
   </w:num>
+  <w:num w:numId="1010">
+    <w:abstractNumId w:val="992"/>
+  </w:num>
+  <w:num w:numId="1011">
+    <w:abstractNumId w:val="992"/>
+  </w:num>
   <w:num w:numId="1012">
     <w:abstractNumId w:val="992"/>
   </w:num>
   <w:num w:numId="1013">
-    <w:abstractNumId w:val="992"/>
-  </w:num>
-  <w:num w:numId="1014">
-    <w:abstractNumId w:val="992"/>
-  </w:num>
-  <w:num w:numId="1015">
     <w:abstractNumId w:val="99411"/>
     <w:lvlOverride w:ilvl="0">
       <w:startOverride w:val="1"/>
@@ -4685,35 +5250,14 @@
       <w:startOverride w:val="1"/>
     </w:lvlOverride>
   </w:num>
+  <w:num w:numId="1014">
+    <w:abstractNumId w:val="992"/>
+  </w:num>
+  <w:num w:numId="1015">
+    <w:abstractNumId w:val="992"/>
+  </w:num>
   <w:num w:numId="1016">
-    <w:abstractNumId w:val="99411"/>
-    <w:lvlOverride w:ilvl="0">
-      <w:startOverride w:val="1"/>
-    </w:lvlOverride>
-    <w:lvlOverride w:ilvl="1">
-      <w:startOverride w:val="1"/>
-    </w:lvlOverride>
-    <w:lvlOverride w:ilvl="2">
-      <w:startOverride w:val="1"/>
-    </w:lvlOverride>
-    <w:lvlOverride w:ilvl="3">
-      <w:startOverride w:val="1"/>
-    </w:lvlOverride>
-    <w:lvlOverride w:ilvl="4">
-      <w:startOverride w:val="1"/>
-    </w:lvlOverride>
-    <w:lvlOverride w:ilvl="5">
-      <w:startOverride w:val="1"/>
-    </w:lvlOverride>
-    <w:lvlOverride w:ilvl="6">
-      <w:startOverride w:val="1"/>
-    </w:lvlOverride>
-    <w:lvlOverride w:ilvl="7">
-      <w:startOverride w:val="1"/>
-    </w:lvlOverride>
-    <w:lvlOverride w:ilvl="8">
-      <w:startOverride w:val="1"/>
-    </w:lvlOverride>
+    <w:abstractNumId w:val="992"/>
   </w:num>
   <w:num w:numId="1017">
     <w:abstractNumId w:val="99411"/>
@@ -4746,16 +5290,70 @@
     </w:lvlOverride>
   </w:num>
   <w:num w:numId="1018">
+    <w:abstractNumId w:val="99411"/>
+    <w:lvlOverride w:ilvl="0">
+      <w:startOverride w:val="1"/>
+    </w:lvlOverride>
+    <w:lvlOverride w:ilvl="1">
+      <w:startOverride w:val="1"/>
+    </w:lvlOverride>
+    <w:lvlOverride w:ilvl="2">
+      <w:startOverride w:val="1"/>
+    </w:lvlOverride>
+    <w:lvlOverride w:ilvl="3">
+      <w:startOverride w:val="1"/>
+    </w:lvlOverride>
+    <w:lvlOverride w:ilvl="4">
+      <w:startOverride w:val="1"/>
+    </w:lvlOverride>
+    <w:lvlOverride w:ilvl="5">
+      <w:startOverride w:val="1"/>
+    </w:lvlOverride>
+    <w:lvlOverride w:ilvl="6">
+      <w:startOverride w:val="1"/>
+    </w:lvlOverride>
+    <w:lvlOverride w:ilvl="7">
+      <w:startOverride w:val="1"/>
+    </w:lvlOverride>
+    <w:lvlOverride w:ilvl="8">
+      <w:startOverride w:val="1"/>
+    </w:lvlOverride>
+  </w:num>
+  <w:num w:numId="1019">
+    <w:abstractNumId w:val="99411"/>
+    <w:lvlOverride w:ilvl="0">
+      <w:startOverride w:val="1"/>
+    </w:lvlOverride>
+    <w:lvlOverride w:ilvl="1">
+      <w:startOverride w:val="1"/>
+    </w:lvlOverride>
+    <w:lvlOverride w:ilvl="2">
+      <w:startOverride w:val="1"/>
+    </w:lvlOverride>
+    <w:lvlOverride w:ilvl="3">
+      <w:startOverride w:val="1"/>
+    </w:lvlOverride>
+    <w:lvlOverride w:ilvl="4">
+      <w:startOverride w:val="1"/>
+    </w:lvlOverride>
+    <w:lvlOverride w:ilvl="5">
+      <w:startOverride w:val="1"/>
+    </w:lvlOverride>
+    <w:lvlOverride w:ilvl="6">
+      <w:startOverride w:val="1"/>
+    </w:lvlOverride>
+    <w:lvlOverride w:ilvl="7">
+      <w:startOverride w:val="1"/>
+    </w:lvlOverride>
+    <w:lvlOverride w:ilvl="8">
+      <w:startOverride w:val="1"/>
+    </w:lvlOverride>
+  </w:num>
+  <w:num w:numId="1020">
     <w:abstractNumId w:val="991"/>
   </w:num>
-  <w:num w:numId="1019">
+  <w:num w:numId="1021">
     <w:abstractNumId w:val="991"/>
-  </w:num>
-  <w:num w:numId="1020">
-    <w:abstractNumId w:val="992"/>
-  </w:num>
-  <w:num w:numId="1021">
-    <w:abstractNumId w:val="992"/>
   </w:num>
   <w:num w:numId="1022">
     <w:abstractNumId w:val="992"/>
@@ -4767,6 +5365,12 @@
     <w:abstractNumId w:val="992"/>
   </w:num>
   <w:num w:numId="1025">
+    <w:abstractNumId w:val="992"/>
+  </w:num>
+  <w:num w:numId="1026">
+    <w:abstractNumId w:val="992"/>
+  </w:num>
+  <w:num w:numId="1027">
     <w:abstractNumId w:val="992"/>
   </w:num>
 </w:numbering>

</xml_diff>

<commit_message>
AIrep001 v1.3 — rewrite §7.2.2 Route A for non-technical users
The previous version assumed familiarity with Terminal. Rewritten as a
true six-step beginner walkthrough:

- Step 1 — how to open Terminal (Cmd-Space → "Terminal" → Return)
- Step 2 — how to navigate to the MI Portal folder (one cd command)
- Step 3 — how to start Claude Code (one word + Return)
- Step 4 — how to find the two CSV files in Finder
- Step 5 — drag-and-drop both files into the Claude prompt to auto-paste
  the paths, then send
- Step 6 — review the per-client summary and approve the commit

Plus a troubleshooting table for the four most common error messages
("command not found: claude", missing CSV, unmatched client names, ✗
failures) telling the operator exactly what to do or who to escalate to.

The doc can now be handed to a non-technical analyst who has never opened
Terminal before — no prior context required.

Co-Authored-By: Claude Opus 4.7 (1M context) <noreply@anthropic.com>
</commit_message>
<xml_diff>
--- a/docs/exports/AIrep001-MI-Process.docx
+++ b/docs/exports/AIrep001-MI-Process.docx
@@ -28,7 +28,7 @@
         </w:p>
       </w:sdtContent>
     </w:sdt>
-    <w:bookmarkStart w:id="32" w:name="X54cd307e615825903a4e33dd06757783330d89e"/>
+    <w:bookmarkStart w:id="35" w:name="X54cd307e615825903a4e33dd06757783330d89e"/>
     <w:p>
       <w:pPr>
         <w:pStyle w:val="Heading1"/>
@@ -68,7 +68,7 @@
         <w:t xml:space="preserve"> </w:t>
       </w:r>
       <w:r>
-        <w:t xml:space="preserve">1.2</w:t>
+        <w:t xml:space="preserve">1.3</w:t>
       </w:r>
       <w:r>
         <w:t xml:space="preserve"> </w:t>
@@ -84,7 +84,7 @@
         <w:t xml:space="preserve"> </w:t>
       </w:r>
       <w:r>
-        <w:t xml:space="preserve">12 May 2026</w:t>
+        <w:t xml:space="preserve">13 May 2026</w:t>
       </w:r>
       <w:r>
         <w:t xml:space="preserve"> </w:t>
@@ -1234,7 +1234,7 @@
       </w:r>
     </w:p>
     <w:bookmarkEnd w:id="14"/>
-    <w:bookmarkStart w:id="24" w:name="procedure"/>
+    <w:bookmarkStart w:id="27" w:name="procedure"/>
     <w:p>
       <w:pPr>
         <w:pStyle w:val="Heading2"/>
@@ -1427,7 +1427,7 @@
       </w:r>
     </w:p>
     <w:bookmarkEnd w:id="15"/>
-    <w:bookmarkStart w:id="19" w:name="X6b5a6cdc7782e4cd09dd714fb06d8023e5f8bbc"/>
+    <w:bookmarkStart w:id="22" w:name="X6b5a6cdc7782e4cd09dd714fb06d8023e5f8bbc"/>
     <w:p>
       <w:pPr>
         <w:pStyle w:val="Heading3"/>
@@ -2137,7 +2137,7 @@
       </w:r>
     </w:p>
     <w:bookmarkEnd w:id="16"/>
-    <w:bookmarkStart w:id="17" w:name="process-the-csvs"/>
+    <w:bookmarkStart w:id="20" w:name="process-the-csvs"/>
     <w:p>
       <w:pPr>
         <w:pStyle w:val="Heading4"/>
@@ -2151,36 +2151,100 @@
         <w:pStyle w:val="FirstParagraph"/>
       </w:pPr>
       <w:r>
-        <w:t xml:space="preserve">The MI Analyst has two routes — either is acceptable, both produce identical output.</w:t>
-      </w:r>
-    </w:p>
-    <w:p>
-      <w:pPr>
-        <w:pStyle w:val="BodyText"/>
-      </w:pPr>
+        <w:t xml:space="preserve">Two routes are available — they produce identical output.</w:t>
+      </w:r>
+      <w:r>
+        <w:t xml:space="preserve"> </w:t>
+      </w:r>
       <w:r>
         <w:rPr>
           <w:b/>
           <w:bCs/>
         </w:rPr>
-        <w:t xml:space="preserve">Route A — via Claude Code</w:t>
-      </w:r>
-      <w:r>
-        <w:t xml:space="preserve"> </w:t>
-      </w:r>
-      <w:r>
-        <w:t xml:space="preserve">(recommended for non-technical users)</w:t>
-      </w:r>
-    </w:p>
-    <w:p>
-      <w:pPr>
+        <w:t xml:space="preserve">Route A is designed for someone who has never used a command line before</w:t>
+      </w:r>
+      <w:r>
+        <w:t xml:space="preserve"> </w:t>
+      </w:r>
+      <w:r>
+        <w:t xml:space="preserve">and is the recommended path.</w:t>
+      </w:r>
+    </w:p>
+    <w:p>
+      <w:r>
+        <w:pict>
+          <v:rect style="width:0;height:1.5pt" o:hralign="center" o:hrstd="t" o:hr="t"/>
+        </w:pict>
+      </w:r>
+    </w:p>
+    <w:bookmarkStart w:id="17" w:name="route-a-via-claude-code-recommended"/>
+    <w:p>
+      <w:pPr>
+        <w:pStyle w:val="Heading5"/>
+      </w:pPr>
+      <w:r>
+        <w:t xml:space="preserve">Route A — via Claude Code (recommended)</w:t>
+      </w:r>
+    </w:p>
+    <w:p>
+      <w:pPr>
+        <w:pStyle w:val="FirstParagraph"/>
+      </w:pPr>
+      <w:r>
+        <w:t xml:space="preserve">You only need to do</w:t>
+      </w:r>
+      <w:r>
+        <w:t xml:space="preserve"> </w:t>
+      </w:r>
+      <w:r>
+        <w:rPr>
+          <w:b/>
+          <w:bCs/>
+        </w:rPr>
+        <w:t xml:space="preserve">six small steps</w:t>
+      </w:r>
+      <w:r>
+        <w:t xml:space="preserve">. Each is described in full below.</w:t>
+      </w:r>
+    </w:p>
+    <w:p>
+      <w:pPr>
+        <w:pStyle w:val="BodyText"/>
+      </w:pPr>
+      <w:r>
+        <w:rPr>
+          <w:b/>
+          <w:bCs/>
+        </w:rPr>
+        <w:t xml:space="preserve">Step 1 — Open the Terminal app</w:t>
+      </w:r>
+    </w:p>
+    <w:p>
+      <w:pPr>
+        <w:pStyle w:val="BodyText"/>
+      </w:pPr>
+      <w:r>
+        <w:t xml:space="preserve">Terminal is a built-in Mac application. It looks like a black or dark grey window with text inside. You don’t need any prior knowledge — you’ll just paste/type a few things.</w:t>
+      </w:r>
+    </w:p>
+    <w:p>
+      <w:pPr>
+        <w:pStyle w:val="BodyText"/>
+      </w:pPr>
+      <w:r>
+        <w:t xml:space="preserve">The quickest way to open it:</w:t>
+      </w:r>
+    </w:p>
+    <w:p>
+      <w:pPr>
+        <w:pStyle w:val="Compact"/>
         <w:numPr>
           <w:ilvl w:val="0"/>
           <w:numId w:val="1010"/>
         </w:numPr>
       </w:pPr>
       <w:r>
-        <w:t xml:space="preserve">Open</w:t>
+        <w:t xml:space="preserve">Press</w:t>
       </w:r>
       <w:r>
         <w:t xml:space="preserve"> </w:t>
@@ -2190,35 +2254,1220 @@
           <w:b/>
           <w:bCs/>
         </w:rPr>
-        <w:t xml:space="preserve">Terminal.app</w:t>
-      </w:r>
-      <w:r>
-        <w:t xml:space="preserve"> </w:t>
-      </w:r>
-      <w:r>
-        <w:t xml:space="preserve">on the workstation.</w:t>
-      </w:r>
-    </w:p>
-    <w:p>
-      <w:pPr>
+        <w:t xml:space="preserve">Cmd + Space</w:t>
+      </w:r>
+      <w:r>
+        <w:t xml:space="preserve"> </w:t>
+      </w:r>
+      <w:r>
+        <w:t xml:space="preserve">on the keyboard. This opens</w:t>
+      </w:r>
+      <w:r>
+        <w:t xml:space="preserve"> </w:t>
+      </w:r>
+      <w:r>
+        <w:rPr>
+          <w:b/>
+          <w:bCs/>
+        </w:rPr>
+        <w:t xml:space="preserve">Spotlight Search</w:t>
+      </w:r>
+      <w:r>
+        <w:t xml:space="preserve"> </w:t>
+      </w:r>
+      <w:r>
+        <w:t xml:space="preserve">(a small search bar appears in the middle of the screen).</w:t>
+      </w:r>
+    </w:p>
+    <w:p>
+      <w:pPr>
+        <w:pStyle w:val="Compact"/>
         <w:numPr>
           <w:ilvl w:val="0"/>
           <w:numId w:val="1010"/>
         </w:numPr>
       </w:pPr>
       <w:r>
-        <w:t xml:space="preserve">Change into the MI Portal project directory:</w:t>
+        <w:t xml:space="preserve">Type the word</w:t>
+      </w:r>
+      <w:r>
+        <w:t xml:space="preserve"> </w:t>
+      </w:r>
+      <w:r>
+        <w:rPr>
+          <w:b/>
+          <w:bCs/>
+        </w:rPr>
+        <w:t xml:space="preserve">Terminal</w:t>
+      </w:r>
+      <w:r>
+        <w:t xml:space="preserve">.</w:t>
+      </w:r>
+    </w:p>
+    <w:p>
+      <w:pPr>
+        <w:pStyle w:val="Compact"/>
+        <w:numPr>
+          <w:ilvl w:val="0"/>
+          <w:numId w:val="1010"/>
+        </w:numPr>
+      </w:pPr>
+      <w:r>
+        <w:t xml:space="preserve">Press</w:t>
+      </w:r>
+      <w:r>
+        <w:t xml:space="preserve"> </w:t>
+      </w:r>
+      <w:r>
+        <w:rPr>
+          <w:b/>
+          <w:bCs/>
+        </w:rPr>
+        <w:t xml:space="preserve">Return</w:t>
+      </w:r>
+      <w:r>
+        <w:t xml:space="preserve">. The Terminal app opens.</w:t>
+      </w:r>
+    </w:p>
+    <w:p>
+      <w:pPr>
+        <w:pStyle w:val="FirstParagraph"/>
+      </w:pPr>
+      <w:r>
+        <w:rPr>
+          <w:i/>
+          <w:iCs/>
+        </w:rPr>
+        <w:t xml:space="preserve">(Alternative path if Spotlight is disabled: open</w:t>
+      </w:r>
+      <w:r>
+        <w:rPr>
+          <w:i/>
+          <w:iCs/>
+        </w:rPr>
+        <w:t xml:space="preserve"> </w:t>
+      </w:r>
+      <w:r>
+        <w:rPr>
+          <w:b/>
+          <w:bCs/>
+          <w:i/>
+          <w:iCs/>
+        </w:rPr>
+        <w:t xml:space="preserve">Finder</w:t>
+      </w:r>
+      <w:r>
+        <w:rPr>
+          <w:i/>
+          <w:iCs/>
+        </w:rPr>
+        <w:t xml:space="preserve"> </w:t>
+      </w:r>
+      <w:r>
+        <w:rPr>
+          <w:i/>
+          <w:iCs/>
+        </w:rPr>
+        <w:t xml:space="preserve">→</w:t>
+      </w:r>
+      <w:r>
+        <w:rPr>
+          <w:i/>
+          <w:iCs/>
+        </w:rPr>
+        <w:t xml:space="preserve"> </w:t>
+      </w:r>
+      <w:r>
+        <w:rPr>
+          <w:b/>
+          <w:bCs/>
+          <w:i/>
+          <w:iCs/>
+        </w:rPr>
+        <w:t xml:space="preserve">Applications</w:t>
+      </w:r>
+      <w:r>
+        <w:rPr>
+          <w:i/>
+          <w:iCs/>
+        </w:rPr>
+        <w:t xml:space="preserve"> </w:t>
+      </w:r>
+      <w:r>
+        <w:rPr>
+          <w:i/>
+          <w:iCs/>
+        </w:rPr>
+        <w:t xml:space="preserve">→</w:t>
+      </w:r>
+      <w:r>
+        <w:rPr>
+          <w:i/>
+          <w:iCs/>
+        </w:rPr>
+        <w:t xml:space="preserve"> </w:t>
+      </w:r>
+      <w:r>
+        <w:rPr>
+          <w:b/>
+          <w:bCs/>
+          <w:i/>
+          <w:iCs/>
+        </w:rPr>
+        <w:t xml:space="preserve">Utilities</w:t>
+      </w:r>
+      <w:r>
+        <w:rPr>
+          <w:i/>
+          <w:iCs/>
+        </w:rPr>
+        <w:t xml:space="preserve"> </w:t>
+      </w:r>
+      <w:r>
+        <w:rPr>
+          <w:i/>
+          <w:iCs/>
+        </w:rPr>
+        <w:t xml:space="preserve">→ double-click</w:t>
+      </w:r>
+      <w:r>
+        <w:rPr>
+          <w:i/>
+          <w:iCs/>
+        </w:rPr>
+        <w:t xml:space="preserve"> </w:t>
+      </w:r>
+      <w:r>
+        <w:rPr>
+          <w:b/>
+          <w:bCs/>
+          <w:i/>
+          <w:iCs/>
+        </w:rPr>
+        <w:t xml:space="preserve">Terminal</w:t>
+      </w:r>
+      <w:r>
+        <w:rPr>
+          <w:i/>
+          <w:iCs/>
+        </w:rPr>
+        <w:t xml:space="preserve">.)</w:t>
+      </w:r>
+    </w:p>
+    <w:p>
+      <w:pPr>
+        <w:pStyle w:val="BodyText"/>
+      </w:pPr>
+      <w:r>
+        <w:rPr>
+          <w:b/>
+          <w:bCs/>
+        </w:rPr>
+        <w:t xml:space="preserve">Step 2 — Go to the MI Portal folder</w:t>
+      </w:r>
+    </w:p>
+    <w:p>
+      <w:pPr>
+        <w:pStyle w:val="BodyText"/>
+      </w:pPr>
+      <w:r>
+        <w:t xml:space="preserve">Click anywhere inside the Terminal window so it accepts typing, then type exactly:</w:t>
       </w:r>
     </w:p>
     <w:p>
       <w:pPr>
         <w:pStyle w:val="SourceCode"/>
+      </w:pPr>
+      <w:r>
+        <w:rPr>
+          <w:rStyle w:val="VerbatimChar"/>
+        </w:rPr>
+        <w:t xml:space="preserve">cd ~/Desktop/MI-Portal</w:t>
+      </w:r>
+    </w:p>
+    <w:p>
+      <w:pPr>
+        <w:pStyle w:val="FirstParagraph"/>
+      </w:pPr>
+      <w:r>
+        <w:t xml:space="preserve">Press</w:t>
+      </w:r>
+      <w:r>
+        <w:t xml:space="preserve"> </w:t>
+      </w:r>
+      <w:r>
+        <w:rPr>
+          <w:b/>
+          <w:bCs/>
+        </w:rPr>
+        <w:t xml:space="preserve">Return</w:t>
+      </w:r>
+      <w:r>
+        <w:t xml:space="preserve"> </w:t>
+      </w:r>
+      <w:r>
+        <w:t xml:space="preserve">after typing. You’re now</w:t>
+      </w:r>
+      <w:r>
+        <w:t xml:space="preserve"> </w:t>
+      </w:r>
+      <w:r>
+        <w:t xml:space="preserve">“inside”</w:t>
+      </w:r>
+      <w:r>
+        <w:t xml:space="preserve"> </w:t>
+      </w:r>
+      <w:r>
+        <w:t xml:space="preserve">the MI Portal folder. The Terminal prompt will change to show</w:t>
+      </w:r>
+      <w:r>
+        <w:t xml:space="preserve"> </w:t>
+      </w:r>
+      <w:r>
+        <w:rPr>
+          <w:rStyle w:val="VerbatimChar"/>
+        </w:rPr>
+        <w:t xml:space="preserve">MI-Portal</w:t>
+      </w:r>
+      <w:r>
+        <w:t xml:space="preserve"> </w:t>
+      </w:r>
+      <w:r>
+        <w:t xml:space="preserve">somewhere in it — that confirms you’re in the right place.</w:t>
+      </w:r>
+    </w:p>
+    <w:p>
+      <w:pPr>
+        <w:pStyle w:val="BodyText"/>
+      </w:pPr>
+      <w:r>
+        <w:rPr>
+          <w:i/>
+          <w:iCs/>
+        </w:rPr>
+        <w:t xml:space="preserve">(The</w:t>
+      </w:r>
+      <w:r>
+        <w:rPr>
+          <w:i/>
+          <w:iCs/>
+        </w:rPr>
+        <w:t xml:space="preserve"> </w:t>
+      </w:r>
+      <w:r>
+        <w:rPr>
+          <w:rStyle w:val="VerbatimChar"/>
+          <w:i/>
+          <w:iCs/>
+        </w:rPr>
+        <w:t xml:space="preserve">cd</w:t>
+      </w:r>
+      <w:r>
+        <w:rPr>
+          <w:i/>
+          <w:iCs/>
+        </w:rPr>
+        <w:t xml:space="preserve"> </w:t>
+      </w:r>
+      <w:r>
+        <w:rPr>
+          <w:i/>
+          <w:iCs/>
+        </w:rPr>
+        <w:t xml:space="preserve">command stands for</w:t>
+      </w:r>
+      <w:r>
+        <w:rPr>
+          <w:i/>
+          <w:iCs/>
+        </w:rPr>
+        <w:t xml:space="preserve"> </w:t>
+      </w:r>
+      <w:r>
+        <w:rPr>
+          <w:i/>
+          <w:iCs/>
+        </w:rPr>
+        <w:t xml:space="preserve">“change directory”</w:t>
+      </w:r>
+      <w:r>
+        <w:rPr>
+          <w:i/>
+          <w:iCs/>
+        </w:rPr>
+        <w:t xml:space="preserve">. The</w:t>
+      </w:r>
+      <w:r>
+        <w:rPr>
+          <w:i/>
+          <w:iCs/>
+        </w:rPr>
+        <w:t xml:space="preserve"> </w:t>
+      </w:r>
+      <w:r>
+        <w:rPr>
+          <w:rStyle w:val="VerbatimChar"/>
+          <w:i/>
+          <w:iCs/>
+        </w:rPr>
+        <w:t xml:space="preserve">~/</w:t>
+      </w:r>
+      <w:r>
+        <w:rPr>
+          <w:i/>
+          <w:iCs/>
+        </w:rPr>
+        <w:t xml:space="preserve"> </w:t>
+      </w:r>
+      <w:r>
+        <w:rPr>
+          <w:i/>
+          <w:iCs/>
+        </w:rPr>
+        <w:t xml:space="preserve">symbol means</w:t>
+      </w:r>
+      <w:r>
+        <w:rPr>
+          <w:i/>
+          <w:iCs/>
+        </w:rPr>
+        <w:t xml:space="preserve"> </w:t>
+      </w:r>
+      <w:r>
+        <w:rPr>
+          <w:i/>
+          <w:iCs/>
+        </w:rPr>
+        <w:t xml:space="preserve">“the home folder of the currently logged-in user”</w:t>
+      </w:r>
+      <w:r>
+        <w:rPr>
+          <w:i/>
+          <w:iCs/>
+        </w:rPr>
+        <w:t xml:space="preserve">.)</w:t>
+      </w:r>
+    </w:p>
+    <w:p>
+      <w:pPr>
+        <w:pStyle w:val="BodyText"/>
+      </w:pPr>
+      <w:r>
+        <w:rPr>
+          <w:b/>
+          <w:bCs/>
+        </w:rPr>
+        <w:t xml:space="preserve">Step 3 — Start Claude Code</w:t>
+      </w:r>
+    </w:p>
+    <w:p>
+      <w:pPr>
+        <w:pStyle w:val="BodyText"/>
+      </w:pPr>
+      <w:r>
+        <w:t xml:space="preserve">Type:</w:t>
+      </w:r>
+    </w:p>
+    <w:p>
+      <w:pPr>
+        <w:pStyle w:val="SourceCode"/>
+      </w:pPr>
+      <w:r>
+        <w:rPr>
+          <w:rStyle w:val="VerbatimChar"/>
+        </w:rPr>
+        <w:t xml:space="preserve">claude</w:t>
+      </w:r>
+    </w:p>
+    <w:p>
+      <w:pPr>
+        <w:pStyle w:val="FirstParagraph"/>
+      </w:pPr>
+      <w:r>
+        <w:t xml:space="preserve">Press</w:t>
+      </w:r>
+      <w:r>
+        <w:t xml:space="preserve"> </w:t>
+      </w:r>
+      <w:r>
+        <w:rPr>
+          <w:b/>
+          <w:bCs/>
+        </w:rPr>
+        <w:t xml:space="preserve">Return</w:t>
+      </w:r>
+      <w:r>
+        <w:t xml:space="preserve">. After a couple of seconds, a chat-style prompt appears. This is Claude Code — you can now type messages to Claude in plain English, the same as in the web chat.</w:t>
+      </w:r>
+    </w:p>
+    <w:p>
+      <w:pPr>
+        <w:pStyle w:val="BodyText"/>
+      </w:pPr>
+      <w:r>
+        <w:rPr>
+          <w:i/>
+          <w:iCs/>
+        </w:rPr>
+        <w:t xml:space="preserve">(If you see</w:t>
+      </w:r>
+      <w:r>
+        <w:rPr>
+          <w:i/>
+          <w:iCs/>
+        </w:rPr>
+        <w:t xml:space="preserve"> </w:t>
+      </w:r>
+      <w:r>
+        <w:rPr>
+          <w:i/>
+          <w:iCs/>
+        </w:rPr>
+        <w:t xml:space="preserve">“command not found: claude”</w:t>
+      </w:r>
+      <w:r>
+        <w:rPr>
+          <w:i/>
+          <w:iCs/>
+        </w:rPr>
+        <w:t xml:space="preserve"> </w:t>
+      </w:r>
+      <w:r>
+        <w:rPr>
+          <w:i/>
+          <w:iCs/>
+        </w:rPr>
+        <w:t xml:space="preserve">instead, Claude Code is not installed on this machine. Install it once by following the instructions at https://docs.claude.com/claude-code — it’s a one-time setup that takes a few minutes — then return to Step 3.)</w:t>
+      </w:r>
+    </w:p>
+    <w:p>
+      <w:pPr>
+        <w:pStyle w:val="BodyText"/>
+      </w:pPr>
+      <w:r>
+        <w:rPr>
+          <w:b/>
+          <w:bCs/>
+        </w:rPr>
+        <w:t xml:space="preserve">Step 4 — Find the two CSV files in Finder</w:t>
+      </w:r>
+    </w:p>
+    <w:p>
+      <w:pPr>
+        <w:pStyle w:val="BodyText"/>
+      </w:pPr>
+      <w:r>
+        <w:t xml:space="preserve">Open</w:t>
+      </w:r>
+      <w:r>
+        <w:t xml:space="preserve"> </w:t>
+      </w:r>
+      <w:r>
+        <w:rPr>
+          <w:b/>
+          <w:bCs/>
+        </w:rPr>
+        <w:t xml:space="preserve">Finder</w:t>
+      </w:r>
+      <w:r>
+        <w:t xml:space="preserve"> </w:t>
+      </w:r>
+      <w:r>
+        <w:t xml:space="preserve">(smiling-face icon in the Dock) and click</w:t>
+      </w:r>
+      <w:r>
+        <w:t xml:space="preserve"> </w:t>
+      </w:r>
+      <w:r>
+        <w:rPr>
+          <w:b/>
+          <w:bCs/>
+        </w:rPr>
+        <w:t xml:space="preserve">Downloads</w:t>
+      </w:r>
+      <w:r>
+        <w:t xml:space="preserve"> </w:t>
+      </w:r>
+      <w:r>
+        <w:t xml:space="preserve">in the left sidebar. You should see the two files you exported earlier:</w:t>
+      </w:r>
+    </w:p>
+    <w:p>
+      <w:pPr>
+        <w:pStyle w:val="SourceCode"/>
+      </w:pPr>
+      <w:r>
+        <w:rPr>
+          <w:rStyle w:val="VerbatimChar"/>
+        </w:rPr>
+        <w:t xml:space="preserve">cases_2026-01-01_-_2026-04-30_&lt;long-number&gt;.csv</w:t>
+      </w:r>
+      <w:r>
+        <w:br/>
+      </w:r>
+      <w:r>
+        <w:rPr>
+          <w:rStyle w:val="VerbatimChar"/>
+        </w:rPr>
+        <w:t xml:space="preserve">invoice_details_2026-01-01_-_2026-04-30_&lt;long-number&gt;.csv</w:t>
+      </w:r>
+    </w:p>
+    <w:p>
+      <w:pPr>
+        <w:pStyle w:val="FirstParagraph"/>
+      </w:pPr>
+      <w:r>
+        <w:t xml:space="preserve">Keep the Finder window open alongside the Terminal window.</w:t>
+      </w:r>
+    </w:p>
+    <w:p>
+      <w:pPr>
+        <w:pStyle w:val="BodyText"/>
+      </w:pPr>
+      <w:r>
+        <w:rPr>
+          <w:b/>
+          <w:bCs/>
+        </w:rPr>
+        <w:t xml:space="preserve">Step 5 — Ask Claude to update the MI</w:t>
+      </w:r>
+    </w:p>
+    <w:p>
+      <w:pPr>
+        <w:pStyle w:val="BodyText"/>
+      </w:pPr>
+      <w:r>
+        <w:t xml:space="preserve">In the Terminal window (which now shows the Claude Code prompt), type or copy-paste:</w:t>
+      </w:r>
+    </w:p>
+    <w:p>
+      <w:pPr>
+        <w:pStyle w:val="BlockText"/>
+      </w:pPr>
+      <w:r>
+        <w:t xml:space="preserve">Please update the MI from these two CSV files:</w:t>
+      </w:r>
+      <w:r>
+        <w:t xml:space="preserve"> </w:t>
+      </w:r>
+      <w:r>
+        <w:t xml:space="preserve">Cases:</w:t>
+      </w:r>
+      <w:r>
+        <w:t xml:space="preserve"> </w:t>
+      </w:r>
+      <w:r>
+        <w:t xml:space="preserve">Invoices:</w:t>
+      </w:r>
+    </w:p>
+    <w:p>
+      <w:pPr>
+        <w:pStyle w:val="FirstParagraph"/>
+      </w:pPr>
+      <w:r>
+        <w:rPr>
+          <w:b/>
+          <w:bCs/>
+        </w:rPr>
+        <w:t xml:space="preserve">Don’t press Return yet.</w:t>
+      </w:r>
+      <w:r>
+        <w:t xml:space="preserve"> </w:t>
+      </w:r>
+      <w:r>
+        <w:t xml:space="preserve">Now, for each file:</w:t>
+      </w:r>
+    </w:p>
+    <w:p>
+      <w:pPr>
+        <w:numPr>
+          <w:ilvl w:val="0"/>
+          <w:numId w:val="1011"/>
+        </w:numPr>
+      </w:pPr>
+      <w:r>
+        <w:t xml:space="preserve">Click on the file in Finder,</w:t>
+      </w:r>
+      <w:r>
+        <w:t xml:space="preserve"> </w:t>
+      </w:r>
+      <w:r>
+        <w:rPr>
+          <w:b/>
+          <w:bCs/>
+        </w:rPr>
+        <w:t xml:space="preserve">hold the mouse button down</w:t>
+      </w:r>
+      <w:r>
+        <w:t xml:space="preserve">, and</w:t>
+      </w:r>
+      <w:r>
+        <w:t xml:space="preserve"> </w:t>
+      </w:r>
+      <w:r>
+        <w:rPr>
+          <w:b/>
+          <w:bCs/>
+        </w:rPr>
+        <w:t xml:space="preserve">drag</w:t>
+      </w:r>
+      <w:r>
+        <w:t xml:space="preserve"> </w:t>
+      </w:r>
+      <w:r>
+        <w:t xml:space="preserve">it onto the Terminal window — drop it directly after the word</w:t>
+      </w:r>
+      <w:r>
+        <w:t xml:space="preserve"> </w:t>
+      </w:r>
+      <w:r>
+        <w:t xml:space="preserve">“Cases:”</w:t>
+      </w:r>
+      <w:r>
+        <w:t xml:space="preserve"> </w:t>
+      </w:r>
+      <w:r>
+        <w:t xml:space="preserve">(and again after</w:t>
+      </w:r>
+      <w:r>
+        <w:t xml:space="preserve"> </w:t>
+      </w:r>
+      <w:r>
+        <w:t xml:space="preserve">“Invoices:”</w:t>
+      </w:r>
+      <w:r>
+        <w:t xml:space="preserve"> </w:t>
+      </w:r>
+      <w:r>
+        <w:t xml:space="preserve">for the second file).</w:t>
+      </w:r>
+    </w:p>
+    <w:p>
+      <w:pPr>
+        <w:numPr>
+          <w:ilvl w:val="0"/>
+          <w:numId w:val="1011"/>
+        </w:numPr>
+      </w:pPr>
+      <w:r>
+        <w:t xml:space="preserve">macOS automatically pastes the full file path. Your message should now look like:</w:t>
+      </w:r>
+    </w:p>
+    <w:p>
+      <w:pPr>
+        <w:pStyle w:val="BlockText"/>
         <w:numPr>
           <w:ilvl w:val="0"/>
           <w:numId w:val="1000"/>
         </w:numPr>
       </w:pPr>
       <w:r>
+        <w:t xml:space="preserve">Please update the MI from these two CSV files:</w:t>
+      </w:r>
+      <w:r>
+        <w:t xml:space="preserve"> </w:t>
+      </w:r>
+      <w:r>
+        <w:t xml:space="preserve">Cases: /Users/daveb/Downloads/cases_2026-01-01_-</w:t>
+      </w:r>
+      <w:r>
+        <w:rPr>
+          <w:i/>
+          <w:iCs/>
+        </w:rPr>
+        <w:t xml:space="preserve">2026-04-30_1234567890.csv</w:t>
+      </w:r>
+      <w:r>
+        <w:rPr>
+          <w:i/>
+          <w:iCs/>
+        </w:rPr>
+        <w:t xml:space="preserve"> </w:t>
+      </w:r>
+      <w:r>
+        <w:rPr>
+          <w:i/>
+          <w:iCs/>
+        </w:rPr>
+        <w:t xml:space="preserve">Invoices: /Users/daveb/Downloads/invoice_details_2026-01-01</w:t>
+      </w:r>
+      <w:r>
+        <w:t xml:space="preserve">-_2026-04-30_1234567890.csv</w:t>
+      </w:r>
+    </w:p>
+    <w:p>
+      <w:pPr>
+        <w:numPr>
+          <w:ilvl w:val="0"/>
+          <w:numId w:val="1011"/>
+        </w:numPr>
+      </w:pPr>
+      <w:r>
+        <w:t xml:space="preserve">Now press</w:t>
+      </w:r>
+      <w:r>
+        <w:t xml:space="preserve"> </w:t>
+      </w:r>
+      <w:r>
+        <w:rPr>
+          <w:b/>
+          <w:bCs/>
+        </w:rPr>
+        <w:t xml:space="preserve">Return</w:t>
+      </w:r>
+      <w:r>
+        <w:t xml:space="preserve"> </w:t>
+      </w:r>
+      <w:r>
+        <w:t xml:space="preserve">to send the message.</w:t>
+      </w:r>
+    </w:p>
+    <w:p>
+      <w:pPr>
+        <w:pStyle w:val="FirstParagraph"/>
+      </w:pPr>
+      <w:r>
+        <w:rPr>
+          <w:b/>
+          <w:bCs/>
+        </w:rPr>
+        <w:t xml:space="preserve">Step 6 — Review and approve</w:t>
+      </w:r>
+    </w:p>
+    <w:p>
+      <w:pPr>
+        <w:pStyle w:val="BodyText"/>
+      </w:pPr>
+      <w:r>
+        <w:t xml:space="preserve">Claude will run the processor and show a summary like:</w:t>
+      </w:r>
+    </w:p>
+    <w:p>
+      <w:pPr>
+        <w:pStyle w:val="SourceCode"/>
+      </w:pPr>
+      <w:r>
+        <w:rPr>
+          <w:rStyle w:val="VerbatimChar"/>
+        </w:rPr>
+        <w:t xml:space="preserve">  ✓ zego.js              58 cases  (36 RTC)  invoices £18,313 (77 lines)</w:t>
+      </w:r>
+      <w:r>
+        <w:br/>
+      </w:r>
+      <w:r>
+        <w:rPr>
+          <w:rStyle w:val="VerbatimChar"/>
+        </w:rPr>
+        <w:t xml:space="preserve">  ✓ inshur.js            56 cases  (0 RTC)   invoices £24,859 (106 lines)</w:t>
+      </w:r>
+      <w:r>
+        <w:br/>
+      </w:r>
+      <w:r>
+        <w:rPr>
+          <w:rStyle w:val="VerbatimChar"/>
+        </w:rPr>
+        <w:t xml:space="preserve">  ✓ trinity.js           42 cases  (0 RTC)   invoices £16,522 (62 lines)</w:t>
+      </w:r>
+      <w:r>
+        <w:br/>
+      </w:r>
+      <w:r>
+        <w:rPr>
+          <w:rStyle w:val="VerbatimChar"/>
+        </w:rPr>
+        <w:t xml:space="preserve">  ✓ ...</w:t>
+      </w:r>
+      <w:r>
+        <w:br/>
+      </w:r>
+      <w:r>
+        <w:br/>
+      </w:r>
+      <w:r>
+        <w:rPr>
+          <w:rStyle w:val="VerbatimChar"/>
+        </w:rPr>
+        <w:t xml:space="preserve">Done. Wrote 13 file(s) to clients/</w:t>
+      </w:r>
+    </w:p>
+    <w:p>
+      <w:pPr>
+        <w:pStyle w:val="FirstParagraph"/>
+      </w:pPr>
+      <w:r>
+        <w:t xml:space="preserve">Quickly check:</w:t>
+      </w:r>
+      <w:r>
+        <w:t xml:space="preserve"> </w:t>
+      </w:r>
+      <w:r>
+        <w:t xml:space="preserve">- Every client you’d expect to see is listed (Zego, Inshur, Trinity, And-E/ITB, DWF, Trinity, First Central, etc.).</w:t>
+      </w:r>
+      <w:r>
+        <w:t xml:space="preserve"> </w:t>
+      </w:r>
+      <w:r>
+        <w:t xml:space="preserve">- The case counts look broadly normal — no client suddenly losing 80% of cases.</w:t>
+      </w:r>
+      <w:r>
+        <w:t xml:space="preserve"> </w:t>
+      </w:r>
+      <w:r>
+        <w:t xml:space="preserve">- No</w:t>
+      </w:r>
+      <w:r>
+        <w:t xml:space="preserve"> </w:t>
+      </w:r>
+      <w:r>
+        <w:t xml:space="preserve">“✗”</w:t>
+      </w:r>
+      <w:r>
+        <w:t xml:space="preserve"> </w:t>
+      </w:r>
+      <w:r>
+        <w:t xml:space="preserve">failure marks.</w:t>
+      </w:r>
+    </w:p>
+    <w:p>
+      <w:pPr>
+        <w:pStyle w:val="BodyText"/>
+      </w:pPr>
+      <w:r>
+        <w:t xml:space="preserve">Claude will then offer to</w:t>
+      </w:r>
+      <w:r>
+        <w:t xml:space="preserve"> </w:t>
+      </w:r>
+      <w:r>
+        <w:rPr>
+          <w:b/>
+          <w:bCs/>
+        </w:rPr>
+        <w:t xml:space="preserve">commit and push</w:t>
+      </w:r>
+      <w:r>
+        <w:t xml:space="preserve"> </w:t>
+      </w:r>
+      <w:r>
+        <w:t xml:space="preserve">the new figures to the live site. When asked, reply with one word:</w:t>
+      </w:r>
+      <w:r>
+        <w:t xml:space="preserve"> </w:t>
+      </w:r>
+      <w:r>
+        <w:rPr>
+          <w:b/>
+          <w:bCs/>
+        </w:rPr>
+        <w:t xml:space="preserve">yes</w:t>
+      </w:r>
+      <w:r>
+        <w:t xml:space="preserve"> </w:t>
+      </w:r>
+      <w:r>
+        <w:t xml:space="preserve">(or</w:t>
+      </w:r>
+      <w:r>
+        <w:t xml:space="preserve"> </w:t>
+      </w:r>
+      <w:r>
+        <w:rPr>
+          <w:b/>
+          <w:bCs/>
+        </w:rPr>
+        <w:t xml:space="preserve">push</w:t>
+      </w:r>
+      <w:r>
+        <w:t xml:space="preserve">).</w:t>
+      </w:r>
+    </w:p>
+    <w:p>
+      <w:pPr>
+        <w:pStyle w:val="BodyText"/>
+      </w:pPr>
+      <w:r>
+        <w:t xml:space="preserve">You’re done. The new MI is live at https://mi.dlbinvestigations.co.uk/ within about 60 seconds.</w:t>
+      </w:r>
+    </w:p>
+    <w:p>
+      <w:pPr>
+        <w:pStyle w:val="BodyText"/>
+      </w:pPr>
+      <w:r>
+        <w:t xml:space="preserve">You can close the Terminal window — type</w:t>
+      </w:r>
+      <w:r>
+        <w:t xml:space="preserve"> </w:t>
+      </w:r>
+      <w:r>
+        <w:rPr>
+          <w:rStyle w:val="VerbatimChar"/>
+        </w:rPr>
+        <w:t xml:space="preserve">exit</w:t>
+      </w:r>
+      <w:r>
+        <w:t xml:space="preserve"> </w:t>
+      </w:r>
+      <w:r>
+        <w:t xml:space="preserve">and press Return, or just close the window.</w:t>
+      </w:r>
+    </w:p>
+    <w:p>
+      <w:r>
+        <w:pict>
+          <v:rect style="width:0;height:1.5pt" o:hralign="center" o:hrstd="t" o:hr="t"/>
+        </w:pict>
+      </w:r>
+    </w:p>
+    <w:bookmarkEnd w:id="17"/>
+    <w:bookmarkStart w:id="18" w:name="if-something-goes-wrong"/>
+    <w:p>
+      <w:pPr>
+        <w:pStyle w:val="Heading5"/>
+      </w:pPr>
+      <w:r>
+        <w:t xml:space="preserve">If something goes wrong</w:t>
+      </w:r>
+    </w:p>
+    <w:tbl>
+      <w:tblPr>
+        <w:tblStyle w:val="Table"/>
+        <w:tblW w:type="pct" w:w="5000"/>
+        <w:tblLayout w:type="fixed"/>
+        <w:tblLook w:firstRow="1" w:lastRow="0" w:firstColumn="0" w:lastColumn="0" w:noHBand="0" w:noVBand="0" w:val="0020"/>
+      </w:tblPr>
+      <w:tblGrid>
+        <w:gridCol w:w="3960"/>
+        <w:gridCol w:w="3960"/>
+      </w:tblGrid>
+      <w:tr>
+        <w:trPr>
+          <w:tblHeader w:val="on"/>
+        </w:trPr>
+        <w:tc>
+          <w:tcPr/>
+          <w:p>
+            <w:pPr>
+              <w:pStyle w:val="Compact"/>
+            </w:pPr>
+            <w:r>
+              <w:t xml:space="preserve">What you see</w:t>
+            </w:r>
+          </w:p>
+        </w:tc>
+        <w:tc>
+          <w:tcPr/>
+          <w:p>
+            <w:pPr>
+              <w:pStyle w:val="Compact"/>
+            </w:pPr>
+            <w:r>
+              <w:t xml:space="preserve">What to do</w:t>
+            </w:r>
+          </w:p>
+        </w:tc>
+      </w:tr>
+      <w:tr>
+        <w:tc>
+          <w:tcPr/>
+          <w:p>
+            <w:pPr>
+              <w:pStyle w:val="Compact"/>
+            </w:pPr>
+            <w:r>
+              <w:t xml:space="preserve">“command not found: claude”</w:t>
+            </w:r>
+          </w:p>
+        </w:tc>
+        <w:tc>
+          <w:tcPr/>
+          <w:p>
+            <w:pPr>
+              <w:pStyle w:val="Compact"/>
+            </w:pPr>
+            <w:r>
+              <w:t xml:space="preserve">Install Claude Code (one-off setup). See https://docs.claude.com/claude-code, then go back to Step 3.</w:t>
+            </w:r>
+          </w:p>
+        </w:tc>
+      </w:tr>
+      <w:tr>
+        <w:tc>
+          <w:tcPr/>
+          <w:p>
+            <w:pPr>
+              <w:pStyle w:val="Compact"/>
+            </w:pPr>
+            <w:r>
+              <w:t xml:space="preserve">“Cases CSV not found”</w:t>
+            </w:r>
+            <w:r>
+              <w:t xml:space="preserve"> </w:t>
+            </w:r>
+            <w:r>
+              <w:t xml:space="preserve">or</w:t>
+            </w:r>
+            <w:r>
+              <w:t xml:space="preserve"> </w:t>
+            </w:r>
+            <w:r>
+              <w:t xml:space="preserve">“Invoices CSV not found”</w:t>
+            </w:r>
+          </w:p>
+        </w:tc>
+        <w:tc>
+          <w:tcPr/>
+          <w:p>
+            <w:pPr>
+              <w:pStyle w:val="Compact"/>
+            </w:pPr>
+            <w:r>
+              <w:t xml:space="preserve">The file path is wrong. Repeat Step 5 — drag the file from Finder again to make sure the path is correct.</w:t>
+            </w:r>
+          </w:p>
+        </w:tc>
+      </w:tr>
+      <w:tr>
+        <w:tc>
+          <w:tcPr/>
+          <w:p>
+            <w:pPr>
+              <w:pStyle w:val="Compact"/>
+            </w:pPr>
+            <w:r>
+              <w:t xml:space="preserve">Claude reports</w:t>
+            </w:r>
+            <w:r>
+              <w:t xml:space="preserve"> </w:t>
+            </w:r>
+            <w:r>
+              <w:t xml:space="preserve">“Unmatched client names”</w:t>
+            </w:r>
+          </w:p>
+        </w:tc>
+        <w:tc>
+          <w:tcPr/>
+          <w:p>
+            <w:pPr>
+              <w:pStyle w:val="Compact"/>
+            </w:pPr>
+            <w:r>
+              <w:t xml:space="preserve">Some TrackOps client name didn’t match our list. Ask Claude to add the unmatched name to</w:t>
+            </w:r>
+            <w:r>
+              <w:t xml:space="preserve"> </w:t>
+            </w:r>
+            <w:r>
+              <w:rPr>
+                <w:rStyle w:val="VerbatimChar"/>
+              </w:rPr>
+              <w:t xml:space="preserve">scripts/client-map.json</w:t>
+            </w:r>
+            <w:r>
+              <w:t xml:space="preserve"> </w:t>
+            </w:r>
+            <w:r>
+              <w:t xml:space="preserve">and re-run.</w:t>
+            </w:r>
+          </w:p>
+        </w:tc>
+      </w:tr>
+      <w:tr>
+        <w:tc>
+          <w:tcPr/>
+          <w:p>
+            <w:pPr>
+              <w:pStyle w:val="Compact"/>
+            </w:pPr>
+            <w:r>
+              <w:t xml:space="preserve">A</w:t>
+            </w:r>
+            <w:r>
+              <w:t xml:space="preserve"> </w:t>
+            </w:r>
+            <w:r>
+              <w:rPr>
+                <w:rStyle w:val="VerbatimChar"/>
+              </w:rPr>
+              <w:t xml:space="preserve">✗</w:t>
+            </w:r>
+            <w:r>
+              <w:t xml:space="preserve"> </w:t>
+            </w:r>
+            <w:r>
+              <w:t xml:space="preserve">failure mark next to a client</w:t>
+            </w:r>
+          </w:p>
+        </w:tc>
+        <w:tc>
+          <w:tcPr/>
+          <w:p>
+            <w:pPr>
+              <w:pStyle w:val="Compact"/>
+            </w:pPr>
+            <w:r>
+              <w:t xml:space="preserve">Show the full message to your DLB account manager. Don’t approve the commit.</w:t>
+            </w:r>
+          </w:p>
+        </w:tc>
+      </w:tr>
+      <w:tr>
+        <w:tc>
+          <w:tcPr/>
+          <w:p>
+            <w:pPr>
+              <w:pStyle w:val="Compact"/>
+            </w:pPr>
+            <w:r>
+              <w:t xml:space="preserve">Anything else unexpected</w:t>
+            </w:r>
+          </w:p>
+        </w:tc>
+        <w:tc>
+          <w:tcPr/>
+          <w:p>
+            <w:pPr>
+              <w:pStyle w:val="Compact"/>
+            </w:pPr>
+            <w:r>
+              <w:t xml:space="preserve">Don’t approve any commit. Screenshot the Terminal window and forward it to your DLB account manager.</w:t>
+            </w:r>
+          </w:p>
+        </w:tc>
+      </w:tr>
+    </w:tbl>
+    <w:p>
+      <w:r>
+        <w:pict>
+          <v:rect style="width:0;height:1.5pt" o:hralign="center" o:hrstd="t" o:hr="t"/>
+        </w:pict>
+      </w:r>
+    </w:p>
+    <w:bookmarkEnd w:id="18"/>
+    <w:bookmarkStart w:id="19" w:name="Xed7d3b56792cc768c3c4ca477e9f75d748f347f"/>
+    <w:p>
+      <w:pPr>
+        <w:pStyle w:val="Heading5"/>
+      </w:pPr>
+      <w:r>
+        <w:t xml:space="preserve">Route B — direct terminal command (for technical users only)</w:t>
+      </w:r>
+    </w:p>
+    <w:p>
+      <w:pPr>
+        <w:pStyle w:val="FirstParagraph"/>
+      </w:pPr>
+      <w:r>
+        <w:t xml:space="preserve">For users comfortable with the command line:</w:t>
+      </w:r>
+    </w:p>
+    <w:p>
+      <w:pPr>
+        <w:pStyle w:val="SourceCode"/>
+      </w:pPr>
+      <w:r>
         <w:rPr>
           <w:rStyle w:val="BuiltInTok"/>
         </w:rPr>
@@ -2230,9 +3479,488 @@
         </w:rPr>
         <w:t xml:space="preserve"> /Users/daveb/Desktop/MI-Portal</w:t>
       </w:r>
-    </w:p>
-    <w:p>
-      <w:pPr>
+      <w:r>
+        <w:br/>
+      </w:r>
+      <w:r>
+        <w:rPr>
+          <w:rStyle w:val="FunctionTok"/>
+        </w:rPr>
+        <w:t xml:space="preserve">git</w:t>
+      </w:r>
+      <w:r>
+        <w:rPr>
+          <w:rStyle w:val="NormalTok"/>
+        </w:rPr>
+        <w:t xml:space="preserve"> pull origin main</w:t>
+      </w:r>
+      <w:r>
+        <w:br/>
+      </w:r>
+      <w:r>
+        <w:rPr>
+          <w:rStyle w:val="ExtensionTok"/>
+        </w:rPr>
+        <w:t xml:space="preserve">node</w:t>
+      </w:r>
+      <w:r>
+        <w:rPr>
+          <w:rStyle w:val="NormalTok"/>
+        </w:rPr>
+        <w:t xml:space="preserve"> scripts/process-csv.js </w:t>
+      </w:r>
+      <w:r>
+        <w:rPr>
+          <w:rStyle w:val="DataTypeTok"/>
+        </w:rPr>
+        <w:t xml:space="preserve">\</w:t>
+      </w:r>
+      <w:r>
+        <w:br/>
+      </w:r>
+      <w:r>
+        <w:rPr>
+          <w:rStyle w:val="NormalTok"/>
+        </w:rPr>
+        <w:t xml:space="preserve">    ~/Downloads/cases_</w:t>
+      </w:r>
+      <w:r>
+        <w:rPr>
+          <w:rStyle w:val="PreprocessorTok"/>
+        </w:rPr>
+        <w:t xml:space="preserve">*</w:t>
+      </w:r>
+      <w:r>
+        <w:rPr>
+          <w:rStyle w:val="NormalTok"/>
+        </w:rPr>
+        <w:t xml:space="preserve">_</w:t>
+      </w:r>
+      <w:r>
+        <w:rPr>
+          <w:rStyle w:val="OperatorTok"/>
+        </w:rPr>
+        <w:t xml:space="preserve">&lt;</w:t>
+      </w:r>
+      <w:r>
+        <w:rPr>
+          <w:rStyle w:val="NormalTok"/>
+        </w:rPr>
+        <w:t xml:space="preserve">timestamp</w:t>
+      </w:r>
+      <w:r>
+        <w:rPr>
+          <w:rStyle w:val="OperatorTok"/>
+        </w:rPr>
+        <w:t xml:space="preserve">&gt;</w:t>
+      </w:r>
+      <w:r>
+        <w:rPr>
+          <w:rStyle w:val="NormalTok"/>
+        </w:rPr>
+        <w:t xml:space="preserve">.csv </w:t>
+      </w:r>
+      <w:r>
+        <w:rPr>
+          <w:rStyle w:val="DataTypeTok"/>
+        </w:rPr>
+        <w:t xml:space="preserve">\</w:t>
+      </w:r>
+      <w:r>
+        <w:br/>
+      </w:r>
+      <w:r>
+        <w:rPr>
+          <w:rStyle w:val="NormalTok"/>
+        </w:rPr>
+        <w:t xml:space="preserve">    </w:t>
+      </w:r>
+      <w:r>
+        <w:rPr>
+          <w:rStyle w:val="AttributeTok"/>
+        </w:rPr>
+        <w:t xml:space="preserve">--invoices</w:t>
+      </w:r>
+      <w:r>
+        <w:rPr>
+          <w:rStyle w:val="NormalTok"/>
+        </w:rPr>
+        <w:t xml:space="preserve"> ~/Downloads/invoice_details_</w:t>
+      </w:r>
+      <w:r>
+        <w:rPr>
+          <w:rStyle w:val="PreprocessorTok"/>
+        </w:rPr>
+        <w:t xml:space="preserve">*</w:t>
+      </w:r>
+      <w:r>
+        <w:rPr>
+          <w:rStyle w:val="NormalTok"/>
+        </w:rPr>
+        <w:t xml:space="preserve">_</w:t>
+      </w:r>
+      <w:r>
+        <w:rPr>
+          <w:rStyle w:val="OperatorTok"/>
+        </w:rPr>
+        <w:t xml:space="preserve">&lt;</w:t>
+      </w:r>
+      <w:r>
+        <w:rPr>
+          <w:rStyle w:val="NormalTok"/>
+        </w:rPr>
+        <w:t xml:space="preserve">timestamp</w:t>
+      </w:r>
+      <w:r>
+        <w:rPr>
+          <w:rStyle w:val="OperatorTok"/>
+        </w:rPr>
+        <w:t xml:space="preserve">&gt;</w:t>
+      </w:r>
+      <w:r>
+        <w:rPr>
+          <w:rStyle w:val="NormalTok"/>
+        </w:rPr>
+        <w:t xml:space="preserve">.csv</w:t>
+      </w:r>
+    </w:p>
+    <w:p>
+      <w:pPr>
+        <w:pStyle w:val="FirstParagraph"/>
+      </w:pPr>
+      <w:r>
+        <w:t xml:space="preserve">The</w:t>
+      </w:r>
+      <w:r>
+        <w:t xml:space="preserve"> </w:t>
+      </w:r>
+      <w:r>
+        <w:rPr>
+          <w:rStyle w:val="VerbatimChar"/>
+        </w:rPr>
+        <w:t xml:space="preserve">--invoices</w:t>
+      </w:r>
+      <w:r>
+        <w:t xml:space="preserve"> </w:t>
+      </w:r>
+      <w:r>
+        <w:t xml:space="preserve">flag is</w:t>
+      </w:r>
+      <w:r>
+        <w:t xml:space="preserve"> </w:t>
+      </w:r>
+      <w:r>
+        <w:rPr>
+          <w:b/>
+          <w:bCs/>
+        </w:rPr>
+        <w:t xml:space="preserve">strongly recommended</w:t>
+      </w:r>
+      <w:r>
+        <w:t xml:space="preserve"> </w:t>
+      </w:r>
+      <w:r>
+        <w:t xml:space="preserve">but technically optional. If omitted, the dashboard will fall back to a less-accurate case-level revenue view (no service-type breakdown).</w:t>
+      </w:r>
+    </w:p>
+    <w:p>
+      <w:pPr>
+        <w:pStyle w:val="BodyText"/>
+      </w:pPr>
+      <w:r>
+        <w:t xml:space="preserve">To publish the changes after the processor finishes:</w:t>
+      </w:r>
+    </w:p>
+    <w:p>
+      <w:pPr>
+        <w:pStyle w:val="SourceCode"/>
+      </w:pPr>
+      <w:r>
+        <w:rPr>
+          <w:rStyle w:val="FunctionTok"/>
+        </w:rPr>
+        <w:t xml:space="preserve">git</w:t>
+      </w:r>
+      <w:r>
+        <w:rPr>
+          <w:rStyle w:val="NormalTok"/>
+        </w:rPr>
+        <w:t xml:space="preserve"> add clients/</w:t>
+      </w:r>
+      <w:r>
+        <w:br/>
+      </w:r>
+      <w:r>
+        <w:rPr>
+          <w:rStyle w:val="FunctionTok"/>
+        </w:rPr>
+        <w:t xml:space="preserve">git</w:t>
+      </w:r>
+      <w:r>
+        <w:rPr>
+          <w:rStyle w:val="NormalTok"/>
+        </w:rPr>
+        <w:t xml:space="preserve"> commit </w:t>
+      </w:r>
+      <w:r>
+        <w:rPr>
+          <w:rStyle w:val="AttributeTok"/>
+        </w:rPr>
+        <w:t xml:space="preserve">-m</w:t>
+      </w:r>
+      <w:r>
+        <w:rPr>
+          <w:rStyle w:val="NormalTok"/>
+        </w:rPr>
+        <w:t xml:space="preserve"> </w:t>
+      </w:r>
+      <w:r>
+        <w:rPr>
+          <w:rStyle w:val="StringTok"/>
+        </w:rPr>
+        <w:t xml:space="preserve">"MI update: [Month] [Year]"</w:t>
+      </w:r>
+      <w:r>
+        <w:br/>
+      </w:r>
+      <w:r>
+        <w:rPr>
+          <w:rStyle w:val="FunctionTok"/>
+        </w:rPr>
+        <w:t xml:space="preserve">git</w:t>
+      </w:r>
+      <w:r>
+        <w:rPr>
+          <w:rStyle w:val="NormalTok"/>
+        </w:rPr>
+        <w:t xml:space="preserve"> push origin main</w:t>
+      </w:r>
+    </w:p>
+    <w:bookmarkEnd w:id="19"/>
+    <w:bookmarkEnd w:id="20"/>
+    <w:bookmarkStart w:id="21" w:name="verify-the-output"/>
+    <w:p>
+      <w:pPr>
+        <w:pStyle w:val="Heading4"/>
+      </w:pPr>
+      <w:r>
+        <w:t xml:space="preserve">7.2.3 Verify the output</w:t>
+      </w:r>
+    </w:p>
+    <w:p>
+      <w:pPr>
+        <w:pStyle w:val="FirstParagraph"/>
+      </w:pPr>
+      <w:r>
+        <w:t xml:space="preserve">The MI Analyst shall review the script (or Claude Code) output. Each client line shows the case count (total) and RTC count in parentheses, plus SLA percentages for each measurable SLA dimension.</w:t>
+      </w:r>
+    </w:p>
+    <w:p>
+      <w:pPr>
+        <w:pStyle w:val="BodyText"/>
+      </w:pPr>
+      <w:r>
+        <w:rPr>
+          <w:b/>
+          <w:bCs/>
+        </w:rPr>
+        <w:t xml:space="preserve">Verification checks</w:t>
+      </w:r>
+      <w:r>
+        <w:t xml:space="preserve"> </w:t>
+      </w:r>
+      <w:r>
+        <w:t xml:space="preserve">— all must pass before continuing to §7.3:</w:t>
+      </w:r>
+    </w:p>
+    <w:p>
+      <w:pPr>
+        <w:pStyle w:val="Compact"/>
+        <w:numPr>
+          <w:ilvl w:val="0"/>
+          <w:numId w:val="1012"/>
+        </w:numPr>
+      </w:pPr>
+      <w:r>
+        <w:rPr>
+          <w:b/>
+          <w:bCs/>
+        </w:rPr>
+        <w:t xml:space="preserve">No</w:t>
+      </w:r>
+      <w:r>
+        <w:rPr>
+          <w:b/>
+          <w:bCs/>
+        </w:rPr>
+        <w:t xml:space="preserve"> </w:t>
+      </w:r>
+      <w:r>
+        <w:rPr>
+          <w:b/>
+          <w:bCs/>
+        </w:rPr>
+        <w:t xml:space="preserve">“Unmatched client names”</w:t>
+      </w:r>
+      <w:r>
+        <w:t xml:space="preserve"> </w:t>
+      </w:r>
+      <w:r>
+        <w:t xml:space="preserve">appear in the output. If any do, add the client name (lowercased) to</w:t>
+      </w:r>
+      <w:r>
+        <w:t xml:space="preserve"> </w:t>
+      </w:r>
+      <w:r>
+        <w:rPr>
+          <w:rStyle w:val="VerbatimChar"/>
+        </w:rPr>
+        <w:t xml:space="preserve">scripts/client-map.json</w:t>
+      </w:r>
+      <w:r>
+        <w:t xml:space="preserve"> </w:t>
+      </w:r>
+      <w:r>
+        <w:t xml:space="preserve">mapping to the correct file, then re-run.</w:t>
+      </w:r>
+    </w:p>
+    <w:p>
+      <w:pPr>
+        <w:pStyle w:val="Compact"/>
+        <w:numPr>
+          <w:ilvl w:val="0"/>
+          <w:numId w:val="1013"/>
+        </w:numPr>
+      </w:pPr>
+      <w:r>
+        <w:rPr>
+          <w:b/>
+          <w:bCs/>
+        </w:rPr>
+        <w:t xml:space="preserve">Total case count matches expectation</w:t>
+      </w:r>
+      <w:r>
+        <w:t xml:space="preserve"> </w:t>
+      </w:r>
+      <w:r>
+        <w:t xml:space="preserve">for the period (compare to the TrackOps Case List total).</w:t>
+      </w:r>
+    </w:p>
+    <w:p>
+      <w:pPr>
+        <w:pStyle w:val="Compact"/>
+        <w:numPr>
+          <w:ilvl w:val="0"/>
+          <w:numId w:val="1014"/>
+        </w:numPr>
+      </w:pPr>
+      <w:r>
+        <w:rPr>
+          <w:b/>
+          <w:bCs/>
+        </w:rPr>
+        <w:t xml:space="preserve">No script errors</w:t>
+      </w:r>
+      <w:r>
+        <w:t xml:space="preserve"> </w:t>
+      </w:r>
+      <w:r>
+        <w:t xml:space="preserve">(</w:t>
+      </w:r>
+      <w:r>
+        <w:t xml:space="preserve">“ReferenceError”</w:t>
+      </w:r>
+      <w:r>
+        <w:t xml:space="preserve">,</w:t>
+      </w:r>
+      <w:r>
+        <w:t xml:space="preserve"> </w:t>
+      </w:r>
+      <w:r>
+        <w:t xml:space="preserve">“SyntaxError”</w:t>
+      </w:r>
+      <w:r>
+        <w:t xml:space="preserve"> </w:t>
+      </w:r>
+      <w:r>
+        <w:t xml:space="preserve">etc.).</w:t>
+      </w:r>
+    </w:p>
+    <w:p>
+      <w:pPr>
+        <w:pStyle w:val="FirstParagraph"/>
+      </w:pPr>
+      <w:r>
+        <w:t xml:space="preserve">Open</w:t>
+      </w:r>
+      <w:r>
+        <w:t xml:space="preserve"> </w:t>
+      </w:r>
+      <w:r>
+        <w:rPr>
+          <w:rStyle w:val="VerbatimChar"/>
+        </w:rPr>
+        <w:t xml:space="preserve">clients/zego.js</w:t>
+      </w:r>
+      <w:r>
+        <w:t xml:space="preserve"> </w:t>
+      </w:r>
+      <w:r>
+        <w:t xml:space="preserve">in a text editor and confirm the header reads</w:t>
+      </w:r>
+      <w:r>
+        <w:t xml:space="preserve"> </w:t>
+      </w:r>
+      <w:r>
+        <w:rPr>
+          <w:rStyle w:val="VerbatimChar"/>
+        </w:rPr>
+        <w:t xml:space="preserve">Period: Jan–Dec [year]</w:t>
+      </w:r>
+      <w:r>
+        <w:t xml:space="preserve"> </w:t>
+      </w:r>
+      <w:r>
+        <w:t xml:space="preserve">and</w:t>
+      </w:r>
+      <w:r>
+        <w:t xml:space="preserve"> </w:t>
+      </w:r>
+      <w:r>
+        <w:rPr>
+          <w:rStyle w:val="VerbatimChar"/>
+        </w:rPr>
+        <w:t xml:space="preserve">Updated: [today's date]</w:t>
+      </w:r>
+      <w:r>
+        <w:t xml:space="preserve">.</w:t>
+      </w:r>
+    </w:p>
+    <w:bookmarkEnd w:id="21"/>
+    <w:bookmarkEnd w:id="22"/>
+    <w:bookmarkStart w:id="23" w:name="production-day-publish-day-0-5-min"/>
+    <w:p>
+      <w:pPr>
+        <w:pStyle w:val="Heading3"/>
+      </w:pPr>
+      <w:r>
+        <w:t xml:space="preserve">7.3 Production day — publish (Day 0, ~5 min)</w:t>
+      </w:r>
+    </w:p>
+    <w:p>
+      <w:pPr>
+        <w:numPr>
+          <w:ilvl w:val="0"/>
+          <w:numId w:val="1015"/>
+        </w:numPr>
+      </w:pPr>
+      <w:r>
+        <w:t xml:space="preserve">Review the changes:</w:t>
+      </w:r>
+    </w:p>
+    <w:p>
+      <w:pPr>
+        <w:pStyle w:val="SourceCode"/>
         <w:numPr>
           <w:ilvl w:val="0"/>
           <w:numId w:val="1000"/>
@@ -2240,308 +3968,543 @@
       </w:pPr>
       <w:r>
         <w:rPr>
-          <w:i/>
-          <w:iCs/>
-        </w:rPr>
-        <w:t xml:space="preserve">(or the equivalent path if the repository is cloned elsewhere on the analyst’s machine)</w:t>
+          <w:rStyle w:val="FunctionTok"/>
+        </w:rPr>
+        <w:t xml:space="preserve">git</w:t>
+      </w:r>
+      <w:r>
+        <w:rPr>
+          <w:rStyle w:val="NormalTok"/>
+        </w:rPr>
+        <w:t xml:space="preserve"> status</w:t>
+      </w:r>
+      <w:r>
+        <w:br/>
+      </w:r>
+      <w:r>
+        <w:rPr>
+          <w:rStyle w:val="FunctionTok"/>
+        </w:rPr>
+        <w:t xml:space="preserve">git</w:t>
+      </w:r>
+      <w:r>
+        <w:rPr>
+          <w:rStyle w:val="NormalTok"/>
+        </w:rPr>
+        <w:t xml:space="preserve"> diff </w:t>
+      </w:r>
+      <w:r>
+        <w:rPr>
+          <w:rStyle w:val="AttributeTok"/>
+        </w:rPr>
+        <w:t xml:space="preserve">--stat</w:t>
+      </w:r>
+      <w:r>
+        <w:rPr>
+          <w:rStyle w:val="NormalTok"/>
+        </w:rPr>
+        <w:t xml:space="preserve"> clients/</w:t>
       </w:r>
     </w:p>
     <w:p>
       <w:pPr>
         <w:numPr>
           <w:ilvl w:val="0"/>
-          <w:numId w:val="1010"/>
-        </w:numPr>
-      </w:pPr>
-      <w:r>
-        <w:t xml:space="preserve">Start a Claude Code session by typing</w:t>
-      </w:r>
-      <w:r>
-        <w:t xml:space="preserve"> </w:t>
-      </w:r>
-      <w:r>
-        <w:rPr>
-          <w:rStyle w:val="VerbatimChar"/>
-        </w:rPr>
-        <w:t xml:space="preserve">claude</w:t>
-      </w:r>
-      <w:r>
-        <w:t xml:space="preserve"> </w:t>
-      </w:r>
-      <w:r>
-        <w:t xml:space="preserve">and pressing</w:t>
-      </w:r>
-      <w:r>
-        <w:t xml:space="preserve"> </w:t>
-      </w:r>
+          <w:numId w:val="1000"/>
+        </w:numPr>
+      </w:pPr>
+      <w:r>
+        <w:t xml:space="preserve">This will list which client files were modified. Large unexpected diffs (e.g. a client suddenly losing 50% of cases) shall be investigated before publishing.</w:t>
+      </w:r>
+    </w:p>
+    <w:p>
+      <w:pPr>
+        <w:numPr>
+          <w:ilvl w:val="0"/>
+          <w:numId w:val="1015"/>
+        </w:numPr>
+      </w:pPr>
+      <w:r>
+        <w:t xml:space="preserve">Commit and push:</w:t>
+      </w:r>
+    </w:p>
+    <w:p>
+      <w:pPr>
+        <w:pStyle w:val="SourceCode"/>
+        <w:numPr>
+          <w:ilvl w:val="0"/>
+          <w:numId w:val="1000"/>
+        </w:numPr>
+      </w:pPr>
+      <w:r>
+        <w:rPr>
+          <w:rStyle w:val="FunctionTok"/>
+        </w:rPr>
+        <w:t xml:space="preserve">git</w:t>
+      </w:r>
+      <w:r>
+        <w:rPr>
+          <w:rStyle w:val="NormalTok"/>
+        </w:rPr>
+        <w:t xml:space="preserve"> add clients/</w:t>
+      </w:r>
+      <w:r>
+        <w:br/>
+      </w:r>
+      <w:r>
+        <w:rPr>
+          <w:rStyle w:val="FunctionTok"/>
+        </w:rPr>
+        <w:t xml:space="preserve">git</w:t>
+      </w:r>
+      <w:r>
+        <w:rPr>
+          <w:rStyle w:val="NormalTok"/>
+        </w:rPr>
+        <w:t xml:space="preserve"> commit </w:t>
+      </w:r>
+      <w:r>
+        <w:rPr>
+          <w:rStyle w:val="AttributeTok"/>
+        </w:rPr>
+        <w:t xml:space="preserve">-m</w:t>
+      </w:r>
+      <w:r>
+        <w:rPr>
+          <w:rStyle w:val="NormalTok"/>
+        </w:rPr>
+        <w:t xml:space="preserve"> </w:t>
+      </w:r>
+      <w:r>
+        <w:rPr>
+          <w:rStyle w:val="StringTok"/>
+        </w:rPr>
+        <w:t xml:space="preserve">"MI update: [Month] [Year] — Jan–Dec [Year]"</w:t>
+      </w:r>
+      <w:r>
+        <w:br/>
+      </w:r>
+      <w:r>
+        <w:rPr>
+          <w:rStyle w:val="FunctionTok"/>
+        </w:rPr>
+        <w:t xml:space="preserve">git</w:t>
+      </w:r>
+      <w:r>
+        <w:rPr>
+          <w:rStyle w:val="NormalTok"/>
+        </w:rPr>
+        <w:t xml:space="preserve"> push origin main</w:t>
+      </w:r>
+    </w:p>
+    <w:p>
+      <w:pPr>
+        <w:numPr>
+          <w:ilvl w:val="0"/>
+          <w:numId w:val="1015"/>
+        </w:numPr>
+      </w:pPr>
       <w:r>
         <w:rPr>
           <w:b/>
           <w:bCs/>
         </w:rPr>
-        <w:t xml:space="preserve">Return</w:t>
-      </w:r>
-      <w:r>
-        <w:t xml:space="preserve">. Claude Code is installed system-wide; if the command is not recognised, install it once per the instructions at https://docs.claude.com/claude-code.</w:t>
-      </w:r>
-    </w:p>
-    <w:p>
-      <w:pPr>
+        <w:t xml:space="preserve">Verification</w:t>
+      </w:r>
+      <w:r>
+        <w:t xml:space="preserve"> </w:t>
+      </w:r>
+      <w:r>
+        <w:t xml:space="preserve">— wait ~90 seconds, then in a browser open</w:t>
+      </w:r>
+      <w:r>
+        <w:t xml:space="preserve"> </w:t>
+      </w:r>
+      <w:r>
+        <w:rPr>
+          <w:rStyle w:val="VerbatimChar"/>
+        </w:rPr>
+        <w:t xml:space="preserve">https://mi.dlbinvestigations.co.uk/</w:t>
+      </w:r>
+      <w:r>
+        <w:t xml:space="preserve">. Enter the access code</w:t>
+      </w:r>
+      <w:r>
+        <w:t xml:space="preserve"> </w:t>
+      </w:r>
+      <w:r>
+        <w:rPr>
+          <w:rStyle w:val="VerbatimChar"/>
+        </w:rPr>
+        <w:t xml:space="preserve">ZEGO26</w:t>
+      </w:r>
+      <w:r>
+        <w:t xml:space="preserve"> </w:t>
+      </w:r>
+      <w:r>
+        <w:t xml:space="preserve">(a known RTC client). Confirm:</w:t>
+      </w:r>
+    </w:p>
+    <w:p>
+      <w:pPr>
+        <w:pStyle w:val="Compact"/>
+        <w:numPr>
+          <w:ilvl w:val="1"/>
+          <w:numId w:val="1016"/>
+        </w:numPr>
+      </w:pPr>
+      <w:r>
+        <w:t xml:space="preserve">Dashboard loads without an error banner at the top of the page</w:t>
+      </w:r>
+    </w:p>
+    <w:p>
+      <w:pPr>
+        <w:pStyle w:val="Compact"/>
+        <w:numPr>
+          <w:ilvl w:val="1"/>
+          <w:numId w:val="1017"/>
+        </w:numPr>
+      </w:pPr>
+      <w:r>
+        <w:t xml:space="preserve">Header shows the current period (e.g. </w:t>
+      </w:r>
+      <w:r>
+        <w:t xml:space="preserve">“Jan–Dec 2026”</w:t>
+      </w:r>
+      <w:r>
+        <w:t xml:space="preserve">) and today’s date</w:t>
+      </w:r>
+    </w:p>
+    <w:p>
+      <w:pPr>
+        <w:pStyle w:val="Compact"/>
+        <w:numPr>
+          <w:ilvl w:val="1"/>
+          <w:numId w:val="1018"/>
+        </w:numPr>
+      </w:pPr>
+      <w:r>
+        <w:t xml:space="preserve">At least one Case Detail Log row matches a case verified in §7.1 against the same TrackOps record</w:t>
+      </w:r>
+    </w:p>
+    <w:bookmarkEnd w:id="23"/>
+    <w:bookmarkStart w:id="24" w:name="automated-distribution-day-0-0800-utc"/>
+    <w:p>
+      <w:pPr>
+        <w:pStyle w:val="Heading3"/>
+      </w:pPr>
+      <w:r>
+        <w:t xml:space="preserve">7.4 Automated distribution (Day 0, 08:00 UTC)</w:t>
+      </w:r>
+    </w:p>
+    <w:p>
+      <w:pPr>
+        <w:pStyle w:val="FirstParagraph"/>
+      </w:pPr>
+      <w:r>
+        <w:t xml:space="preserve">This step is fully automated by the GitHub Actions workflow</w:t>
+      </w:r>
+      <w:r>
+        <w:t xml:space="preserve"> </w:t>
+      </w:r>
+      <w:r>
+        <w:rPr>
+          <w:rStyle w:val="VerbatimChar"/>
+        </w:rPr>
+        <w:t xml:space="preserve">Monthly MI release email</w:t>
+      </w:r>
+      <w:r>
+        <w:t xml:space="preserve">. The workflow:</w:t>
+      </w:r>
+    </w:p>
+    <w:p>
+      <w:pPr>
+        <w:pStyle w:val="Compact"/>
         <w:numPr>
           <w:ilvl w:val="0"/>
-          <w:numId w:val="1010"/>
-        </w:numPr>
-      </w:pPr>
-      <w:r>
-        <w:t xml:space="preserve">At the Claude Code prompt, paste the</w:t>
-      </w:r>
-      <w:r>
-        <w:t xml:space="preserve"> </w:t>
-      </w:r>
+          <w:numId w:val="1019"/>
+        </w:numPr>
+      </w:pPr>
+      <w:r>
+        <w:t xml:space="preserve">Reads</w:t>
+      </w:r>
+      <w:r>
+        <w:t xml:space="preserve"> </w:t>
+      </w:r>
+      <w:r>
+        <w:rPr>
+          <w:rStyle w:val="VerbatimChar"/>
+        </w:rPr>
+        <w:t xml:space="preserve">scripts/client-recipients.json</w:t>
+      </w:r>
+      <w:r>
+        <w:t xml:space="preserve"> </w:t>
+      </w:r>
+      <w:r>
+        <w:t xml:space="preserve">and</w:t>
+      </w:r>
+      <w:r>
+        <w:t xml:space="preserve"> </w:t>
+      </w:r>
+      <w:r>
+        <w:rPr>
+          <w:rStyle w:val="VerbatimChar"/>
+        </w:rPr>
+        <w:t xml:space="preserve">clients/*.js</w:t>
+      </w:r>
+    </w:p>
+    <w:p>
+      <w:pPr>
+        <w:pStyle w:val="Compact"/>
+        <w:numPr>
+          <w:ilvl w:val="0"/>
+          <w:numId w:val="1019"/>
+        </w:numPr>
+      </w:pPr>
+      <w:r>
+        <w:t xml:space="preserve">Acquires an OAuth access token from Microsoft via the registered Azure AD application</w:t>
+      </w:r>
+    </w:p>
+    <w:p>
+      <w:pPr>
+        <w:pStyle w:val="Compact"/>
+        <w:numPr>
+          <w:ilvl w:val="0"/>
+          <w:numId w:val="1019"/>
+        </w:numPr>
+      </w:pPr>
+      <w:r>
+        <w:t xml:space="preserve">Sends one email per recipient, each personalised with the client’s name and the release period</w:t>
+      </w:r>
+    </w:p>
+    <w:p>
+      <w:pPr>
+        <w:pStyle w:val="Compact"/>
+        <w:numPr>
+          <w:ilvl w:val="0"/>
+          <w:numId w:val="1019"/>
+        </w:numPr>
+      </w:pPr>
+      <w:r>
+        <w:t xml:space="preserve">Logs success and failure to the workflow run output</w:t>
+      </w:r>
+    </w:p>
+    <w:p>
+      <w:pPr>
+        <w:pStyle w:val="FirstParagraph"/>
+      </w:pPr>
       <w:r>
         <w:rPr>
           <w:b/>
           <w:bCs/>
         </w:rPr>
-        <w:t xml:space="preserve">full paths of both CSV files</w:t>
-      </w:r>
-      <w:r>
-        <w:t xml:space="preserve"> </w:t>
-      </w:r>
-      <w:r>
-        <w:t xml:space="preserve">saved in §7.2.1 and ask Claude to update the MI. A working prompt is:</w:t>
-      </w:r>
-    </w:p>
-    <w:p>
-      <w:pPr>
-        <w:pStyle w:val="BlockText"/>
+        <w:t xml:space="preserve">No manual action is required for this step.</w:t>
+      </w:r>
+      <w:r>
+        <w:t xml:space="preserve"> </w:t>
+      </w:r>
+      <w:r>
+        <w:t xml:space="preserve">The MI Analyst shall, however, confirm the run on Day +1 (§7.5).</w:t>
+      </w:r>
+    </w:p>
+    <w:bookmarkEnd w:id="24"/>
+    <w:bookmarkStart w:id="25" w:name="post-release-verification-day-1-10-min"/>
+    <w:p>
+      <w:pPr>
+        <w:pStyle w:val="Heading3"/>
+      </w:pPr>
+      <w:r>
+        <w:t xml:space="preserve">7.5 Post-release verification (Day +1, ~10 min)</w:t>
+      </w:r>
+    </w:p>
+    <w:p>
+      <w:pPr>
+        <w:pStyle w:val="FirstParagraph"/>
+      </w:pPr>
+      <w:r>
+        <w:t xml:space="preserve">The MI Analyst shall:</w:t>
+      </w:r>
+    </w:p>
+    <w:p>
+      <w:pPr>
+        <w:pStyle w:val="Compact"/>
         <w:numPr>
           <w:ilvl w:val="0"/>
-          <w:numId w:val="1000"/>
-        </w:numPr>
-      </w:pPr>
-      <w:r>
-        <w:t xml:space="preserve">Please update the MI from these CSVs:</w:t>
-      </w:r>
-      <w:r>
-        <w:t xml:space="preserve"> </w:t>
-      </w:r>
-      <w:r>
-        <w:t xml:space="preserve">Cases:</w:t>
-      </w:r>
-      <w:r>
-        <w:t xml:space="preserve"> </w:t>
-      </w:r>
-      <w:r>
-        <w:rPr>
-          <w:rStyle w:val="VerbatimChar"/>
-        </w:rPr>
-        <w:t xml:space="preserve">/Users/daveb/Downloads/cases_2026-01-01_-_2026-04-30_&lt;timestamp&gt;.csv</w:t>
-      </w:r>
-      <w:r>
-        <w:t xml:space="preserve"> </w:t>
-      </w:r>
-      <w:r>
-        <w:t xml:space="preserve">Invoices:</w:t>
-      </w:r>
-      <w:r>
-        <w:t xml:space="preserve"> </w:t>
-      </w:r>
-      <w:r>
-        <w:rPr>
-          <w:rStyle w:val="VerbatimChar"/>
-        </w:rPr>
-        <w:t xml:space="preserve">/Users/daveb/Downloads/invoice_details_2026-01-01_-_2026-04-30_&lt;timestamp&gt;.csv</w:t>
-      </w:r>
-    </w:p>
-    <w:p>
-      <w:pPr>
+          <w:numId w:val="1020"/>
+        </w:numPr>
+      </w:pPr>
+      <w:r>
+        <w:t xml:space="preserve">Open</w:t>
+      </w:r>
+      <w:r>
+        <w:t xml:space="preserve"> </w:t>
+      </w:r>
+      <w:r>
+        <w:rPr>
+          <w:rStyle w:val="VerbatimChar"/>
+        </w:rPr>
+        <w:t xml:space="preserve">https://github.com/dlbltd/MI-Portal/actions</w:t>
+      </w:r>
+      <w:r>
+        <w:t xml:space="preserve">. Locate the most recent run of the</w:t>
+      </w:r>
+      <w:r>
+        <w:t xml:space="preserve"> </w:t>
+      </w:r>
+      <w:r>
+        <w:t xml:space="preserve">“Monthly MI release email”</w:t>
+      </w:r>
+      <w:r>
+        <w:t xml:space="preserve"> </w:t>
+      </w:r>
+      <w:r>
+        <w:t xml:space="preserve">workflow scheduled at 08:00 UTC on Day 0.</w:t>
+      </w:r>
+    </w:p>
+    <w:p>
+      <w:pPr>
+        <w:pStyle w:val="Compact"/>
         <w:numPr>
           <w:ilvl w:val="0"/>
-          <w:numId w:val="1010"/>
-        </w:numPr>
-      </w:pPr>
-      <w:r>
-        <w:t xml:space="preserve">Claude will run the processor, summarise the per-client output, perform the verification checks listed in §7.2.3, and offer to commit and push the changes. Approve the commit when prompted.</w:t>
-      </w:r>
-    </w:p>
-    <w:p>
-      <w:pPr>
-        <w:pStyle w:val="FirstParagraph"/>
+          <w:numId w:val="1020"/>
+        </w:numPr>
+      </w:pPr>
+      <w:r>
+        <w:t xml:space="preserve">Confirm the run shows a green tick (Success).</w:t>
+      </w:r>
+    </w:p>
+    <w:p>
+      <w:pPr>
+        <w:pStyle w:val="Compact"/>
+        <w:numPr>
+          <w:ilvl w:val="0"/>
+          <w:numId w:val="1020"/>
+        </w:numPr>
+      </w:pPr>
+      <w:r>
+        <w:t xml:space="preserve">Open the run, click into the</w:t>
+      </w:r>
+      <w:r>
+        <w:t xml:space="preserve"> </w:t>
+      </w:r>
+      <w:r>
+        <w:t xml:space="preserve">“Send monthly MI emails via Microsoft Graph”</w:t>
+      </w:r>
+      <w:r>
+        <w:t xml:space="preserve"> </w:t>
+      </w:r>
+      <w:r>
+        <w:t xml:space="preserve">step, and verify the log shows the expected number of</w:t>
+      </w:r>
+      <w:r>
+        <w:t xml:space="preserve"> </w:t>
+      </w:r>
+      <w:r>
+        <w:rPr>
+          <w:rStyle w:val="VerbatimChar"/>
+        </w:rPr>
+        <w:t xml:space="preserve">✓</w:t>
+      </w:r>
+      <w:r>
+        <w:t xml:space="preserve"> </w:t>
+      </w:r>
+      <w:r>
+        <w:t xml:space="preserve">lines (one per recipient) and</w:t>
+      </w:r>
+      <w:r>
+        <w:t xml:space="preserve"> </w:t>
+      </w:r>
+      <w:r>
+        <w:rPr>
+          <w:rStyle w:val="VerbatimChar"/>
+        </w:rPr>
+        <w:t xml:space="preserve">Sent N, skipped M, failed 0</w:t>
+      </w:r>
+      <w:r>
+        <w:t xml:space="preserve">.</w:t>
+      </w:r>
+    </w:p>
+    <w:p>
+      <w:pPr>
+        <w:pStyle w:val="Compact"/>
+        <w:numPr>
+          <w:ilvl w:val="0"/>
+          <w:numId w:val="1020"/>
+        </w:numPr>
+      </w:pPr>
+      <w:r>
+        <w:t xml:space="preserve">Sign into the</w:t>
+      </w:r>
+      <w:r>
+        <w:t xml:space="preserve"> </w:t>
+      </w:r>
+      <w:r>
+        <w:rPr>
+          <w:rStyle w:val="VerbatimChar"/>
+        </w:rPr>
+        <w:t xml:space="preserve">midata@dlbinvestigations.co.uk</w:t>
+      </w:r>
+      <w:r>
+        <w:t xml:space="preserve"> </w:t>
+      </w:r>
+      <w:r>
+        <w:t xml:space="preserve">mailbox via Outlook. Check Sent Items contains messages with subject pattern</w:t>
+      </w:r>
+      <w:r>
+        <w:t xml:space="preserve"> </w:t>
+      </w:r>
+      <w:r>
+        <w:rPr>
+          <w:rStyle w:val="VerbatimChar"/>
+        </w:rPr>
+        <w:t xml:space="preserve">[Client] — [Month] [Year] MI release</w:t>
+      </w:r>
+      <w:r>
+        <w:t xml:space="preserve">.</w:t>
+      </w:r>
+    </w:p>
+    <w:p>
+      <w:pPr>
+        <w:pStyle w:val="Compact"/>
+        <w:numPr>
+          <w:ilvl w:val="0"/>
+          <w:numId w:val="1020"/>
+        </w:numPr>
       </w:pPr>
       <w:r>
         <w:rPr>
           <w:b/>
           <w:bCs/>
         </w:rPr>
-        <w:t xml:space="preserve">Route B — direct terminal command</w:t>
-      </w:r>
-      <w:r>
-        <w:t xml:space="preserve"> </w:t>
-      </w:r>
-      <w:r>
-        <w:t xml:space="preserve">(for technical users)</w:t>
-      </w:r>
-    </w:p>
-    <w:p>
-      <w:pPr>
-        <w:pStyle w:val="SourceCode"/>
-      </w:pPr>
-      <w:r>
-        <w:rPr>
-          <w:rStyle w:val="BuiltInTok"/>
-        </w:rPr>
-        <w:t xml:space="preserve">cd</w:t>
-      </w:r>
-      <w:r>
-        <w:rPr>
-          <w:rStyle w:val="NormalTok"/>
-        </w:rPr>
-        <w:t xml:space="preserve"> /Users/daveb/Desktop/MI-Portal</w:t>
-      </w:r>
-      <w:r>
-        <w:br/>
-      </w:r>
-      <w:r>
-        <w:rPr>
-          <w:rStyle w:val="FunctionTok"/>
-        </w:rPr>
-        <w:t xml:space="preserve">git</w:t>
-      </w:r>
-      <w:r>
-        <w:rPr>
-          <w:rStyle w:val="NormalTok"/>
-        </w:rPr>
-        <w:t xml:space="preserve"> pull origin main</w:t>
-      </w:r>
-      <w:r>
-        <w:br/>
-      </w:r>
-      <w:r>
-        <w:rPr>
-          <w:rStyle w:val="ExtensionTok"/>
-        </w:rPr>
-        <w:t xml:space="preserve">node</w:t>
-      </w:r>
-      <w:r>
-        <w:rPr>
-          <w:rStyle w:val="NormalTok"/>
-        </w:rPr>
-        <w:t xml:space="preserve"> scripts/process-csv.js </w:t>
-      </w:r>
-      <w:r>
-        <w:rPr>
-          <w:rStyle w:val="DataTypeTok"/>
-        </w:rPr>
-        <w:t xml:space="preserve">\</w:t>
-      </w:r>
-      <w:r>
-        <w:br/>
-      </w:r>
-      <w:r>
-        <w:rPr>
-          <w:rStyle w:val="NormalTok"/>
-        </w:rPr>
-        <w:t xml:space="preserve">    ~/Downloads/cases_</w:t>
-      </w:r>
-      <w:r>
-        <w:rPr>
-          <w:rStyle w:val="PreprocessorTok"/>
-        </w:rPr>
-        <w:t xml:space="preserve">*</w:t>
-      </w:r>
-      <w:r>
-        <w:rPr>
-          <w:rStyle w:val="NormalTok"/>
-        </w:rPr>
-        <w:t xml:space="preserve">_</w:t>
-      </w:r>
-      <w:r>
-        <w:rPr>
-          <w:rStyle w:val="OperatorTok"/>
-        </w:rPr>
-        <w:t xml:space="preserve">&lt;</w:t>
-      </w:r>
-      <w:r>
-        <w:rPr>
-          <w:rStyle w:val="NormalTok"/>
-        </w:rPr>
-        <w:t xml:space="preserve">timestamp</w:t>
-      </w:r>
-      <w:r>
-        <w:rPr>
-          <w:rStyle w:val="OperatorTok"/>
-        </w:rPr>
-        <w:t xml:space="preserve">&gt;</w:t>
-      </w:r>
-      <w:r>
-        <w:rPr>
-          <w:rStyle w:val="NormalTok"/>
-        </w:rPr>
-        <w:t xml:space="preserve">.csv </w:t>
-      </w:r>
-      <w:r>
-        <w:rPr>
-          <w:rStyle w:val="DataTypeTok"/>
-        </w:rPr>
-        <w:t xml:space="preserve">\</w:t>
-      </w:r>
-      <w:r>
-        <w:br/>
-      </w:r>
-      <w:r>
-        <w:rPr>
-          <w:rStyle w:val="NormalTok"/>
-        </w:rPr>
-        <w:t xml:space="preserve">    </w:t>
-      </w:r>
-      <w:r>
-        <w:rPr>
-          <w:rStyle w:val="AttributeTok"/>
-        </w:rPr>
-        <w:t xml:space="preserve">--invoices</w:t>
-      </w:r>
-      <w:r>
-        <w:rPr>
-          <w:rStyle w:val="NormalTok"/>
-        </w:rPr>
-        <w:t xml:space="preserve"> ~/Downloads/invoice_details_</w:t>
-      </w:r>
-      <w:r>
-        <w:rPr>
-          <w:rStyle w:val="PreprocessorTok"/>
-        </w:rPr>
-        <w:t xml:space="preserve">*</w:t>
-      </w:r>
-      <w:r>
-        <w:rPr>
-          <w:rStyle w:val="NormalTok"/>
-        </w:rPr>
-        <w:t xml:space="preserve">_</w:t>
-      </w:r>
-      <w:r>
-        <w:rPr>
-          <w:rStyle w:val="OperatorTok"/>
-        </w:rPr>
-        <w:t xml:space="preserve">&lt;</w:t>
-      </w:r>
-      <w:r>
-        <w:rPr>
-          <w:rStyle w:val="NormalTok"/>
-        </w:rPr>
-        <w:t xml:space="preserve">timestamp</w:t>
-      </w:r>
-      <w:r>
-        <w:rPr>
-          <w:rStyle w:val="OperatorTok"/>
-        </w:rPr>
-        <w:t xml:space="preserve">&gt;</w:t>
-      </w:r>
-      <w:r>
-        <w:rPr>
-          <w:rStyle w:val="NormalTok"/>
-        </w:rPr>
-        <w:t xml:space="preserve">.csv</w:t>
+        <w:t xml:space="preserve">Spot-check</w:t>
+      </w:r>
+      <w:r>
+        <w:t xml:space="preserve"> </w:t>
+      </w:r>
+      <w:r>
+        <w:t xml:space="preserve">one client by phone or reply-to-test: confirm receipt with their nominated MI contact.</w:t>
+      </w:r>
+    </w:p>
+    <w:p>
+      <w:pPr>
+        <w:pStyle w:val="Compact"/>
+        <w:numPr>
+          <w:ilvl w:val="0"/>
+          <w:numId w:val="1020"/>
+        </w:numPr>
+      </w:pPr>
+      <w:r>
+        <w:t xml:space="preserve">Record completion on Annex C.</w:t>
+      </w:r>
+    </w:p>
+    <w:bookmarkEnd w:id="25"/>
+    <w:bookmarkStart w:id="26" w:name="adding-or-removing-a-client"/>
+    <w:p>
+      <w:pPr>
+        <w:pStyle w:val="Heading3"/>
+      </w:pPr>
+      <w:r>
+        <w:t xml:space="preserve">7.6 Adding or removing a client</w:t>
       </w:r>
     </w:p>
     <w:p>
@@ -2549,110 +4512,273 @@
         <w:pStyle w:val="FirstParagraph"/>
       </w:pPr>
       <w:r>
-        <w:t xml:space="preserve">The</w:t>
-      </w:r>
-      <w:r>
-        <w:t xml:space="preserve"> </w:t>
-      </w:r>
-      <w:r>
-        <w:rPr>
-          <w:rStyle w:val="VerbatimChar"/>
-        </w:rPr>
-        <w:t xml:space="preserve">--invoices</w:t>
-      </w:r>
-      <w:r>
-        <w:t xml:space="preserve"> </w:t>
-      </w:r>
-      <w:r>
-        <w:t xml:space="preserve">flag is</w:t>
-      </w:r>
-      <w:r>
-        <w:t xml:space="preserve"> </w:t>
-      </w:r>
+        <w:t xml:space="preserve">When a new client is onboarded or an existing client is offboarded the MI Analyst (or designate) shall:</w:t>
+      </w:r>
+    </w:p>
+    <w:p>
+      <w:pPr>
+        <w:pStyle w:val="Compact"/>
+        <w:numPr>
+          <w:ilvl w:val="0"/>
+          <w:numId w:val="1021"/>
+        </w:numPr>
+      </w:pPr>
       <w:r>
         <w:rPr>
           <w:b/>
           <w:bCs/>
         </w:rPr>
-        <w:t xml:space="preserve">strongly recommended</w:t>
-      </w:r>
-      <w:r>
-        <w:t xml:space="preserve"> </w:t>
-      </w:r>
-      <w:r>
-        <w:t xml:space="preserve">but technically optional. If omitted, the dashboard will fall back to a less-accurate case-level revenue view (no service-type breakdown).</w:t>
-      </w:r>
-    </w:p>
-    <w:bookmarkEnd w:id="17"/>
-    <w:bookmarkStart w:id="18" w:name="verify-the-output"/>
-    <w:p>
-      <w:pPr>
-        <w:pStyle w:val="Heading4"/>
-      </w:pPr>
-      <w:r>
-        <w:t xml:space="preserve">7.2.3 Verify the output</w:t>
-      </w:r>
-    </w:p>
-    <w:p>
-      <w:pPr>
-        <w:pStyle w:val="FirstParagraph"/>
-      </w:pPr>
-      <w:r>
-        <w:t xml:space="preserve">The MI Analyst shall review the script (or Claude Code) output. Each client line shows the case count (total) and RTC count in parentheses, plus SLA percentages for each measurable SLA dimension.</w:t>
-      </w:r>
-    </w:p>
-    <w:p>
-      <w:pPr>
-        <w:pStyle w:val="BodyText"/>
+        <w:t xml:space="preserve">Onboarding a new client:</w:t>
+      </w:r>
+    </w:p>
+    <w:p>
+      <w:pPr>
+        <w:pStyle w:val="Compact"/>
+        <w:numPr>
+          <w:ilvl w:val="1"/>
+          <w:numId w:val="1022"/>
+        </w:numPr>
+      </w:pPr>
+      <w:r>
+        <w:t xml:space="preserve">Decide the access code (UPPERCASE, suffix with the current year, e.g. </w:t>
+      </w:r>
+      <w:r>
+        <w:rPr>
+          <w:rStyle w:val="VerbatimChar"/>
+        </w:rPr>
+        <w:t xml:space="preserve">NEWCLIENT26</w:t>
+      </w:r>
+      <w:r>
+        <w:t xml:space="preserve">).</w:t>
+      </w:r>
+    </w:p>
+    <w:p>
+      <w:pPr>
+        <w:pStyle w:val="Compact"/>
+        <w:numPr>
+          <w:ilvl w:val="1"/>
+          <w:numId w:val="1022"/>
+        </w:numPr>
+      </w:pPr>
+      <w:r>
+        <w:t xml:space="preserve">Add the client to</w:t>
+      </w:r>
+      <w:r>
+        <w:t xml:space="preserve"> </w:t>
+      </w:r>
+      <w:r>
+        <w:rPr>
+          <w:rStyle w:val="VerbatimChar"/>
+        </w:rPr>
+        <w:t xml:space="preserve">index.html</w:t>
+      </w:r>
+      <w:r>
+        <w:t xml:space="preserve"> </w:t>
+      </w:r>
+      <w:r>
+        <w:rPr>
+          <w:rStyle w:val="VerbatimChar"/>
+        </w:rPr>
+        <w:t xml:space="preserve">CLIENT_REGISTRY</w:t>
+      </w:r>
+      <w:r>
+        <w:t xml:space="preserve">.</w:t>
+      </w:r>
+    </w:p>
+    <w:p>
+      <w:pPr>
+        <w:pStyle w:val="Compact"/>
+        <w:numPr>
+          <w:ilvl w:val="1"/>
+          <w:numId w:val="1022"/>
+        </w:numPr>
+      </w:pPr>
+      <w:r>
+        <w:t xml:space="preserve">Add the lowercased TrackOps client name(s) to</w:t>
+      </w:r>
+      <w:r>
+        <w:t xml:space="preserve"> </w:t>
+      </w:r>
+      <w:r>
+        <w:rPr>
+          <w:rStyle w:val="VerbatimChar"/>
+        </w:rPr>
+        <w:t xml:space="preserve">scripts/client-map.json</w:t>
+      </w:r>
+      <w:r>
+        <w:t xml:space="preserve"> </w:t>
+      </w:r>
+      <w:r>
+        <w:t xml:space="preserve">(include every alias TrackOps uses).</w:t>
+      </w:r>
+    </w:p>
+    <w:p>
+      <w:pPr>
+        <w:pStyle w:val="Compact"/>
+        <w:numPr>
+          <w:ilvl w:val="1"/>
+          <w:numId w:val="1022"/>
+        </w:numPr>
+      </w:pPr>
+      <w:r>
+        <w:t xml:space="preserve">Add recipient(s) to</w:t>
+      </w:r>
+      <w:r>
+        <w:t xml:space="preserve"> </w:t>
+      </w:r>
+      <w:r>
+        <w:rPr>
+          <w:rStyle w:val="VerbatimChar"/>
+        </w:rPr>
+        <w:t xml:space="preserve">scripts/client-recipients.json</w:t>
+      </w:r>
+      <w:r>
+        <w:t xml:space="preserve">.</w:t>
+      </w:r>
+    </w:p>
+    <w:p>
+      <w:pPr>
+        <w:pStyle w:val="Compact"/>
+        <w:numPr>
+          <w:ilvl w:val="1"/>
+          <w:numId w:val="1022"/>
+        </w:numPr>
+      </w:pPr>
+      <w:r>
+        <w:t xml:space="preserve">If the client is on the RTC service, set</w:t>
+      </w:r>
+      <w:r>
+        <w:t xml:space="preserve"> </w:t>
+      </w:r>
+      <w:r>
+        <w:rPr>
+          <w:rStyle w:val="VerbatimChar"/>
+        </w:rPr>
+        <w:t xml:space="preserve">is_rtc: true</w:t>
+      </w:r>
+      <w:r>
+        <w:t xml:space="preserve"> </w:t>
+      </w:r>
+      <w:r>
+        <w:t xml:space="preserve">in their</w:t>
+      </w:r>
+      <w:r>
+        <w:t xml:space="preserve"> </w:t>
+      </w:r>
+      <w:r>
+        <w:rPr>
+          <w:rStyle w:val="VerbatimChar"/>
+        </w:rPr>
+        <w:t xml:space="preserve">client-map.json</w:t>
+      </w:r>
+      <w:r>
+        <w:t xml:space="preserve"> </w:t>
+      </w:r>
+      <w:r>
+        <w:t xml:space="preserve">entry.</w:t>
+      </w:r>
+    </w:p>
+    <w:p>
+      <w:pPr>
+        <w:pStyle w:val="Compact"/>
+        <w:numPr>
+          <w:ilvl w:val="1"/>
+          <w:numId w:val="1022"/>
+        </w:numPr>
+      </w:pPr>
+      <w:r>
+        <w:t xml:space="preserve">Commit and push.</w:t>
+      </w:r>
+    </w:p>
+    <w:p>
+      <w:pPr>
+        <w:pStyle w:val="Compact"/>
+        <w:numPr>
+          <w:ilvl w:val="0"/>
+          <w:numId w:val="1021"/>
+        </w:numPr>
       </w:pPr>
       <w:r>
         <w:rPr>
           <w:b/>
           <w:bCs/>
         </w:rPr>
-        <w:t xml:space="preserve">Verification checks</w:t>
-      </w:r>
-      <w:r>
-        <w:t xml:space="preserve"> </w:t>
-      </w:r>
-      <w:r>
-        <w:t xml:space="preserve">— all must pass before continuing to §7.3:</w:t>
+        <w:t xml:space="preserve">Offboarding a client:</w:t>
       </w:r>
     </w:p>
     <w:p>
       <w:pPr>
         <w:pStyle w:val="Compact"/>
         <w:numPr>
-          <w:ilvl w:val="0"/>
-          <w:numId w:val="1011"/>
-        </w:numPr>
-      </w:pPr>
-      <w:r>
-        <w:rPr>
-          <w:b/>
-          <w:bCs/>
-        </w:rPr>
-        <w:t xml:space="preserve">No</w:t>
-      </w:r>
-      <w:r>
-        <w:rPr>
-          <w:b/>
-          <w:bCs/>
-        </w:rPr>
-        <w:t xml:space="preserve"> </w:t>
-      </w:r>
-      <w:r>
-        <w:rPr>
-          <w:b/>
-          <w:bCs/>
-        </w:rPr>
-        <w:t xml:space="preserve">“Unmatched client names”</w:t>
-      </w:r>
-      <w:r>
-        <w:t xml:space="preserve"> </w:t>
-      </w:r>
-      <w:r>
-        <w:t xml:space="preserve">appear in the output. If any do, add the client name (lowercased) to</w:t>
+          <w:ilvl w:val="1"/>
+          <w:numId w:val="1023"/>
+        </w:numPr>
+      </w:pPr>
+      <w:r>
+        <w:t xml:space="preserve">Remove their entry from</w:t>
+      </w:r>
+      <w:r>
+        <w:t xml:space="preserve"> </w:t>
+      </w:r>
+      <w:r>
+        <w:rPr>
+          <w:rStyle w:val="VerbatimChar"/>
+        </w:rPr>
+        <w:t xml:space="preserve">index.html</w:t>
+      </w:r>
+      <w:r>
+        <w:t xml:space="preserve"> </w:t>
+      </w:r>
+      <w:r>
+        <w:rPr>
+          <w:rStyle w:val="VerbatimChar"/>
+        </w:rPr>
+        <w:t xml:space="preserve">CLIENT_REGISTRY</w:t>
+      </w:r>
+      <w:r>
+        <w:t xml:space="preserve"> </w:t>
+      </w:r>
+      <w:r>
+        <w:t xml:space="preserve">(revokes access).</w:t>
+      </w:r>
+    </w:p>
+    <w:p>
+      <w:pPr>
+        <w:pStyle w:val="Compact"/>
+        <w:numPr>
+          <w:ilvl w:val="1"/>
+          <w:numId w:val="1023"/>
+        </w:numPr>
+      </w:pPr>
+      <w:r>
+        <w:t xml:space="preserve">Remove from</w:t>
+      </w:r>
+      <w:r>
+        <w:t xml:space="preserve"> </w:t>
+      </w:r>
+      <w:r>
+        <w:rPr>
+          <w:rStyle w:val="VerbatimChar"/>
+        </w:rPr>
+        <w:t xml:space="preserve">scripts/client-recipients.json</w:t>
+      </w:r>
+      <w:r>
+        <w:t xml:space="preserve"> </w:t>
+      </w:r>
+      <w:r>
+        <w:t xml:space="preserve">(stops emails).</w:t>
+      </w:r>
+    </w:p>
+    <w:p>
+      <w:pPr>
+        <w:pStyle w:val="Compact"/>
+        <w:numPr>
+          <w:ilvl w:val="1"/>
+          <w:numId w:val="1023"/>
+        </w:numPr>
+      </w:pPr>
+      <w:r>
+        <w:t xml:space="preserve">Leave</w:t>
       </w:r>
       <w:r>
         <w:t xml:space="preserve"> </w:t>
@@ -2667,69 +4793,22 @@
         <w:t xml:space="preserve"> </w:t>
       </w:r>
       <w:r>
-        <w:t xml:space="preserve">mapping to the correct file, then re-run.</w:t>
-      </w:r>
-    </w:p>
-    <w:p>
-      <w:pPr>
-        <w:pStyle w:val="Compact"/>
-        <w:numPr>
-          <w:ilvl w:val="0"/>
-          <w:numId w:val="1012"/>
-        </w:numPr>
-      </w:pPr>
-      <w:r>
-        <w:rPr>
-          <w:b/>
-          <w:bCs/>
-        </w:rPr>
-        <w:t xml:space="preserve">Total case count matches expectation</w:t>
-      </w:r>
-      <w:r>
-        <w:t xml:space="preserve"> </w:t>
-      </w:r>
-      <w:r>
-        <w:t xml:space="preserve">for the period (compare to the TrackOps Case List total).</w:t>
-      </w:r>
-    </w:p>
-    <w:p>
-      <w:pPr>
-        <w:pStyle w:val="Compact"/>
-        <w:numPr>
-          <w:ilvl w:val="0"/>
-          <w:numId w:val="1013"/>
-        </w:numPr>
-      </w:pPr>
-      <w:r>
-        <w:rPr>
-          <w:b/>
-          <w:bCs/>
-        </w:rPr>
-        <w:t xml:space="preserve">No script errors</w:t>
-      </w:r>
-      <w:r>
-        <w:t xml:space="preserve"> </w:t>
-      </w:r>
-      <w:r>
-        <w:t xml:space="preserve">(</w:t>
-      </w:r>
-      <w:r>
-        <w:t xml:space="preserve">“ReferenceError”</w:t>
-      </w:r>
-      <w:r>
-        <w:t xml:space="preserve">,</w:t>
-      </w:r>
-      <w:r>
-        <w:t xml:space="preserve"> </w:t>
-      </w:r>
-      <w:r>
-        <w:t xml:space="preserve">“SyntaxError”</w:t>
-      </w:r>
-      <w:r>
-        <w:t xml:space="preserve"> </w:t>
-      </w:r>
-      <w:r>
-        <w:t xml:space="preserve">etc.).</w:t>
+        <w:t xml:space="preserve">and</w:t>
+      </w:r>
+      <w:r>
+        <w:t xml:space="preserve"> </w:t>
+      </w:r>
+      <w:r>
+        <w:rPr>
+          <w:rStyle w:val="VerbatimChar"/>
+        </w:rPr>
+        <w:t xml:space="preserve">clients/[name].js</w:t>
+      </w:r>
+      <w:r>
+        <w:t xml:space="preserve"> </w:t>
+      </w:r>
+      <w:r>
+        <w:t xml:space="preserve">in place for historical reference unless the client expressly requests data deletion.</w:t>
       </w:r>
     </w:p>
     <w:p>
@@ -2737,964 +4816,39 @@
         <w:pStyle w:val="FirstParagraph"/>
       </w:pPr>
       <w:r>
-        <w:t xml:space="preserve">Open</w:t>
-      </w:r>
-      <w:r>
-        <w:t xml:space="preserve"> </w:t>
-      </w:r>
-      <w:r>
-        <w:rPr>
-          <w:rStyle w:val="VerbatimChar"/>
-        </w:rPr>
-        <w:t xml:space="preserve">clients/zego.js</w:t>
-      </w:r>
-      <w:r>
-        <w:t xml:space="preserve"> </w:t>
-      </w:r>
-      <w:r>
-        <w:t xml:space="preserve">in a text editor and confirm the header reads</w:t>
-      </w:r>
-      <w:r>
-        <w:t xml:space="preserve"> </w:t>
-      </w:r>
-      <w:r>
-        <w:rPr>
-          <w:rStyle w:val="VerbatimChar"/>
-        </w:rPr>
-        <w:t xml:space="preserve">Period: Jan–Dec [year]</w:t>
-      </w:r>
-      <w:r>
-        <w:t xml:space="preserve"> </w:t>
-      </w:r>
-      <w:r>
-        <w:t xml:space="preserve">and</w:t>
-      </w:r>
-      <w:r>
-        <w:t xml:space="preserve"> </w:t>
-      </w:r>
-      <w:r>
-        <w:rPr>
-          <w:rStyle w:val="VerbatimChar"/>
-        </w:rPr>
-        <w:t xml:space="preserve">Updated: [today's date]</w:t>
+        <w:t xml:space="preserve">All changes shall be made via a single commit with a message of the form</w:t>
+      </w:r>
+      <w:r>
+        <w:t xml:space="preserve"> </w:t>
+      </w:r>
+      <w:r>
+        <w:rPr>
+          <w:rStyle w:val="VerbatimChar"/>
+        </w:rPr>
+        <w:t xml:space="preserve">Client onboard: [Name]</w:t>
+      </w:r>
+      <w:r>
+        <w:t xml:space="preserve"> </w:t>
+      </w:r>
+      <w:r>
+        <w:t xml:space="preserve">or</w:t>
+      </w:r>
+      <w:r>
+        <w:t xml:space="preserve"> </w:t>
+      </w:r>
+      <w:r>
+        <w:rPr>
+          <w:rStyle w:val="VerbatimChar"/>
+        </w:rPr>
+        <w:t xml:space="preserve">Client offboard: [Name]</w:t>
       </w:r>
       <w:r>
         <w:t xml:space="preserve">.</w:t>
       </w:r>
     </w:p>
-    <w:bookmarkEnd w:id="18"/>
-    <w:bookmarkEnd w:id="19"/>
-    <w:bookmarkStart w:id="20" w:name="production-day-publish-day-0-5-min"/>
-    <w:p>
-      <w:pPr>
-        <w:pStyle w:val="Heading3"/>
-      </w:pPr>
-      <w:r>
-        <w:t xml:space="preserve">7.3 Production day — publish (Day 0, ~5 min)</w:t>
-      </w:r>
-    </w:p>
-    <w:p>
-      <w:pPr>
-        <w:numPr>
-          <w:ilvl w:val="0"/>
-          <w:numId w:val="1014"/>
-        </w:numPr>
-      </w:pPr>
-      <w:r>
-        <w:t xml:space="preserve">Review the changes:</w:t>
-      </w:r>
-    </w:p>
-    <w:p>
-      <w:pPr>
-        <w:pStyle w:val="SourceCode"/>
-        <w:numPr>
-          <w:ilvl w:val="0"/>
-          <w:numId w:val="1000"/>
-        </w:numPr>
-      </w:pPr>
-      <w:r>
-        <w:rPr>
-          <w:rStyle w:val="FunctionTok"/>
-        </w:rPr>
-        <w:t xml:space="preserve">git</w:t>
-      </w:r>
-      <w:r>
-        <w:rPr>
-          <w:rStyle w:val="NormalTok"/>
-        </w:rPr>
-        <w:t xml:space="preserve"> status</w:t>
-      </w:r>
-      <w:r>
-        <w:br/>
-      </w:r>
-      <w:r>
-        <w:rPr>
-          <w:rStyle w:val="FunctionTok"/>
-        </w:rPr>
-        <w:t xml:space="preserve">git</w:t>
-      </w:r>
-      <w:r>
-        <w:rPr>
-          <w:rStyle w:val="NormalTok"/>
-        </w:rPr>
-        <w:t xml:space="preserve"> diff </w:t>
-      </w:r>
-      <w:r>
-        <w:rPr>
-          <w:rStyle w:val="AttributeTok"/>
-        </w:rPr>
-        <w:t xml:space="preserve">--stat</w:t>
-      </w:r>
-      <w:r>
-        <w:rPr>
-          <w:rStyle w:val="NormalTok"/>
-        </w:rPr>
-        <w:t xml:space="preserve"> clients/</w:t>
-      </w:r>
-    </w:p>
-    <w:p>
-      <w:pPr>
-        <w:numPr>
-          <w:ilvl w:val="0"/>
-          <w:numId w:val="1000"/>
-        </w:numPr>
-      </w:pPr>
-      <w:r>
-        <w:t xml:space="preserve">This will list which client files were modified. Large unexpected diffs (e.g. a client suddenly losing 50% of cases) shall be investigated before publishing.</w:t>
-      </w:r>
-    </w:p>
-    <w:p>
-      <w:pPr>
-        <w:numPr>
-          <w:ilvl w:val="0"/>
-          <w:numId w:val="1014"/>
-        </w:numPr>
-      </w:pPr>
-      <w:r>
-        <w:t xml:space="preserve">Commit and push:</w:t>
-      </w:r>
-    </w:p>
-    <w:p>
-      <w:pPr>
-        <w:pStyle w:val="SourceCode"/>
-        <w:numPr>
-          <w:ilvl w:val="0"/>
-          <w:numId w:val="1000"/>
-        </w:numPr>
-      </w:pPr>
-      <w:r>
-        <w:rPr>
-          <w:rStyle w:val="FunctionTok"/>
-        </w:rPr>
-        <w:t xml:space="preserve">git</w:t>
-      </w:r>
-      <w:r>
-        <w:rPr>
-          <w:rStyle w:val="NormalTok"/>
-        </w:rPr>
-        <w:t xml:space="preserve"> add clients/</w:t>
-      </w:r>
-      <w:r>
-        <w:br/>
-      </w:r>
-      <w:r>
-        <w:rPr>
-          <w:rStyle w:val="FunctionTok"/>
-        </w:rPr>
-        <w:t xml:space="preserve">git</w:t>
-      </w:r>
-      <w:r>
-        <w:rPr>
-          <w:rStyle w:val="NormalTok"/>
-        </w:rPr>
-        <w:t xml:space="preserve"> commit </w:t>
-      </w:r>
-      <w:r>
-        <w:rPr>
-          <w:rStyle w:val="AttributeTok"/>
-        </w:rPr>
-        <w:t xml:space="preserve">-m</w:t>
-      </w:r>
-      <w:r>
-        <w:rPr>
-          <w:rStyle w:val="NormalTok"/>
-        </w:rPr>
-        <w:t xml:space="preserve"> </w:t>
-      </w:r>
-      <w:r>
-        <w:rPr>
-          <w:rStyle w:val="StringTok"/>
-        </w:rPr>
-        <w:t xml:space="preserve">"MI update: [Month] [Year] — Jan–Dec [Year]"</w:t>
-      </w:r>
-      <w:r>
-        <w:br/>
-      </w:r>
-      <w:r>
-        <w:rPr>
-          <w:rStyle w:val="FunctionTok"/>
-        </w:rPr>
-        <w:t xml:space="preserve">git</w:t>
-      </w:r>
-      <w:r>
-        <w:rPr>
-          <w:rStyle w:val="NormalTok"/>
-        </w:rPr>
-        <w:t xml:space="preserve"> push origin main</w:t>
-      </w:r>
-    </w:p>
-    <w:p>
-      <w:pPr>
-        <w:numPr>
-          <w:ilvl w:val="0"/>
-          <w:numId w:val="1014"/>
-        </w:numPr>
-      </w:pPr>
-      <w:r>
-        <w:rPr>
-          <w:b/>
-          <w:bCs/>
-        </w:rPr>
-        <w:t xml:space="preserve">Verification</w:t>
-      </w:r>
-      <w:r>
-        <w:t xml:space="preserve"> </w:t>
-      </w:r>
-      <w:r>
-        <w:t xml:space="preserve">— wait ~90 seconds, then in a browser open</w:t>
-      </w:r>
-      <w:r>
-        <w:t xml:space="preserve"> </w:t>
-      </w:r>
-      <w:r>
-        <w:rPr>
-          <w:rStyle w:val="VerbatimChar"/>
-        </w:rPr>
-        <w:t xml:space="preserve">https://mi.dlbinvestigations.co.uk/</w:t>
-      </w:r>
-      <w:r>
-        <w:t xml:space="preserve">. Enter the access code</w:t>
-      </w:r>
-      <w:r>
-        <w:t xml:space="preserve"> </w:t>
-      </w:r>
-      <w:r>
-        <w:rPr>
-          <w:rStyle w:val="VerbatimChar"/>
-        </w:rPr>
-        <w:t xml:space="preserve">ZEGO26</w:t>
-      </w:r>
-      <w:r>
-        <w:t xml:space="preserve"> </w:t>
-      </w:r>
-      <w:r>
-        <w:t xml:space="preserve">(a known RTC client). Confirm:</w:t>
-      </w:r>
-    </w:p>
-    <w:p>
-      <w:pPr>
-        <w:pStyle w:val="Compact"/>
-        <w:numPr>
-          <w:ilvl w:val="1"/>
-          <w:numId w:val="1015"/>
-        </w:numPr>
-      </w:pPr>
-      <w:r>
-        <w:t xml:space="preserve">Dashboard loads without an error banner at the top of the page</w:t>
-      </w:r>
-    </w:p>
-    <w:p>
-      <w:pPr>
-        <w:pStyle w:val="Compact"/>
-        <w:numPr>
-          <w:ilvl w:val="1"/>
-          <w:numId w:val="1016"/>
-        </w:numPr>
-      </w:pPr>
-      <w:r>
-        <w:t xml:space="preserve">Header shows the current period (e.g. </w:t>
-      </w:r>
-      <w:r>
-        <w:t xml:space="preserve">“Jan–Dec 2026”</w:t>
-      </w:r>
-      <w:r>
-        <w:t xml:space="preserve">) and today’s date</w:t>
-      </w:r>
-    </w:p>
-    <w:p>
-      <w:pPr>
-        <w:pStyle w:val="Compact"/>
-        <w:numPr>
-          <w:ilvl w:val="1"/>
-          <w:numId w:val="1017"/>
-        </w:numPr>
-      </w:pPr>
-      <w:r>
-        <w:t xml:space="preserve">At least one Case Detail Log row matches a case verified in §7.1 against the same TrackOps record</w:t>
-      </w:r>
-    </w:p>
-    <w:bookmarkEnd w:id="20"/>
-    <w:bookmarkStart w:id="21" w:name="automated-distribution-day-0-0800-utc"/>
-    <w:p>
-      <w:pPr>
-        <w:pStyle w:val="Heading3"/>
-      </w:pPr>
-      <w:r>
-        <w:t xml:space="preserve">7.4 Automated distribution (Day 0, 08:00 UTC)</w:t>
-      </w:r>
-    </w:p>
-    <w:p>
-      <w:pPr>
-        <w:pStyle w:val="FirstParagraph"/>
-      </w:pPr>
-      <w:r>
-        <w:t xml:space="preserve">This step is fully automated by the GitHub Actions workflow</w:t>
-      </w:r>
-      <w:r>
-        <w:t xml:space="preserve"> </w:t>
-      </w:r>
-      <w:r>
-        <w:rPr>
-          <w:rStyle w:val="VerbatimChar"/>
-        </w:rPr>
-        <w:t xml:space="preserve">Monthly MI release email</w:t>
-      </w:r>
-      <w:r>
-        <w:t xml:space="preserve">. The workflow:</w:t>
-      </w:r>
-    </w:p>
-    <w:p>
-      <w:pPr>
-        <w:pStyle w:val="Compact"/>
-        <w:numPr>
-          <w:ilvl w:val="0"/>
-          <w:numId w:val="1018"/>
-        </w:numPr>
-      </w:pPr>
-      <w:r>
-        <w:t xml:space="preserve">Reads</w:t>
-      </w:r>
-      <w:r>
-        <w:t xml:space="preserve"> </w:t>
-      </w:r>
-      <w:r>
-        <w:rPr>
-          <w:rStyle w:val="VerbatimChar"/>
-        </w:rPr>
-        <w:t xml:space="preserve">scripts/client-recipients.json</w:t>
-      </w:r>
-      <w:r>
-        <w:t xml:space="preserve"> </w:t>
-      </w:r>
-      <w:r>
-        <w:t xml:space="preserve">and</w:t>
-      </w:r>
-      <w:r>
-        <w:t xml:space="preserve"> </w:t>
-      </w:r>
-      <w:r>
-        <w:rPr>
-          <w:rStyle w:val="VerbatimChar"/>
-        </w:rPr>
-        <w:t xml:space="preserve">clients/*.js</w:t>
-      </w:r>
-    </w:p>
-    <w:p>
-      <w:pPr>
-        <w:pStyle w:val="Compact"/>
-        <w:numPr>
-          <w:ilvl w:val="0"/>
-          <w:numId w:val="1018"/>
-        </w:numPr>
-      </w:pPr>
-      <w:r>
-        <w:t xml:space="preserve">Acquires an OAuth access token from Microsoft via the registered Azure AD application</w:t>
-      </w:r>
-    </w:p>
-    <w:p>
-      <w:pPr>
-        <w:pStyle w:val="Compact"/>
-        <w:numPr>
-          <w:ilvl w:val="0"/>
-          <w:numId w:val="1018"/>
-        </w:numPr>
-      </w:pPr>
-      <w:r>
-        <w:t xml:space="preserve">Sends one email per recipient, each personalised with the client’s name and the release period</w:t>
-      </w:r>
-    </w:p>
-    <w:p>
-      <w:pPr>
-        <w:pStyle w:val="Compact"/>
-        <w:numPr>
-          <w:ilvl w:val="0"/>
-          <w:numId w:val="1018"/>
-        </w:numPr>
-      </w:pPr>
-      <w:r>
-        <w:t xml:space="preserve">Logs success and failure to the workflow run output</w:t>
-      </w:r>
-    </w:p>
-    <w:p>
-      <w:pPr>
-        <w:pStyle w:val="FirstParagraph"/>
-      </w:pPr>
-      <w:r>
-        <w:rPr>
-          <w:b/>
-          <w:bCs/>
-        </w:rPr>
-        <w:t xml:space="preserve">No manual action is required for this step.</w:t>
-      </w:r>
-      <w:r>
-        <w:t xml:space="preserve"> </w:t>
-      </w:r>
-      <w:r>
-        <w:t xml:space="preserve">The MI Analyst shall, however, confirm the run on Day +1 (§7.5).</w:t>
-      </w:r>
-    </w:p>
-    <w:bookmarkEnd w:id="21"/>
-    <w:bookmarkStart w:id="22" w:name="post-release-verification-day-1-10-min"/>
-    <w:p>
-      <w:pPr>
-        <w:pStyle w:val="Heading3"/>
-      </w:pPr>
-      <w:r>
-        <w:t xml:space="preserve">7.5 Post-release verification (Day +1, ~10 min)</w:t>
-      </w:r>
-    </w:p>
-    <w:p>
-      <w:pPr>
-        <w:pStyle w:val="FirstParagraph"/>
-      </w:pPr>
-      <w:r>
-        <w:t xml:space="preserve">The MI Analyst shall:</w:t>
-      </w:r>
-    </w:p>
-    <w:p>
-      <w:pPr>
-        <w:pStyle w:val="Compact"/>
-        <w:numPr>
-          <w:ilvl w:val="0"/>
-          <w:numId w:val="1019"/>
-        </w:numPr>
-      </w:pPr>
-      <w:r>
-        <w:t xml:space="preserve">Open</w:t>
-      </w:r>
-      <w:r>
-        <w:t xml:space="preserve"> </w:t>
-      </w:r>
-      <w:r>
-        <w:rPr>
-          <w:rStyle w:val="VerbatimChar"/>
-        </w:rPr>
-        <w:t xml:space="preserve">https://github.com/dlbltd/MI-Portal/actions</w:t>
-      </w:r>
-      <w:r>
-        <w:t xml:space="preserve">. Locate the most recent run of the</w:t>
-      </w:r>
-      <w:r>
-        <w:t xml:space="preserve"> </w:t>
-      </w:r>
-      <w:r>
-        <w:t xml:space="preserve">“Monthly MI release email”</w:t>
-      </w:r>
-      <w:r>
-        <w:t xml:space="preserve"> </w:t>
-      </w:r>
-      <w:r>
-        <w:t xml:space="preserve">workflow scheduled at 08:00 UTC on Day 0.</w:t>
-      </w:r>
-    </w:p>
-    <w:p>
-      <w:pPr>
-        <w:pStyle w:val="Compact"/>
-        <w:numPr>
-          <w:ilvl w:val="0"/>
-          <w:numId w:val="1019"/>
-        </w:numPr>
-      </w:pPr>
-      <w:r>
-        <w:t xml:space="preserve">Confirm the run shows a green tick (Success).</w:t>
-      </w:r>
-    </w:p>
-    <w:p>
-      <w:pPr>
-        <w:pStyle w:val="Compact"/>
-        <w:numPr>
-          <w:ilvl w:val="0"/>
-          <w:numId w:val="1019"/>
-        </w:numPr>
-      </w:pPr>
-      <w:r>
-        <w:t xml:space="preserve">Open the run, click into the</w:t>
-      </w:r>
-      <w:r>
-        <w:t xml:space="preserve"> </w:t>
-      </w:r>
-      <w:r>
-        <w:t xml:space="preserve">“Send monthly MI emails via Microsoft Graph”</w:t>
-      </w:r>
-      <w:r>
-        <w:t xml:space="preserve"> </w:t>
-      </w:r>
-      <w:r>
-        <w:t xml:space="preserve">step, and verify the log shows the expected number of</w:t>
-      </w:r>
-      <w:r>
-        <w:t xml:space="preserve"> </w:t>
-      </w:r>
-      <w:r>
-        <w:rPr>
-          <w:rStyle w:val="VerbatimChar"/>
-        </w:rPr>
-        <w:t xml:space="preserve">✓</w:t>
-      </w:r>
-      <w:r>
-        <w:t xml:space="preserve"> </w:t>
-      </w:r>
-      <w:r>
-        <w:t xml:space="preserve">lines (one per recipient) and</w:t>
-      </w:r>
-      <w:r>
-        <w:t xml:space="preserve"> </w:t>
-      </w:r>
-      <w:r>
-        <w:rPr>
-          <w:rStyle w:val="VerbatimChar"/>
-        </w:rPr>
-        <w:t xml:space="preserve">Sent N, skipped M, failed 0</w:t>
-      </w:r>
-      <w:r>
-        <w:t xml:space="preserve">.</w:t>
-      </w:r>
-    </w:p>
-    <w:p>
-      <w:pPr>
-        <w:pStyle w:val="Compact"/>
-        <w:numPr>
-          <w:ilvl w:val="0"/>
-          <w:numId w:val="1019"/>
-        </w:numPr>
-      </w:pPr>
-      <w:r>
-        <w:t xml:space="preserve">Sign into the</w:t>
-      </w:r>
-      <w:r>
-        <w:t xml:space="preserve"> </w:t>
-      </w:r>
-      <w:r>
-        <w:rPr>
-          <w:rStyle w:val="VerbatimChar"/>
-        </w:rPr>
-        <w:t xml:space="preserve">midata@dlbinvestigations.co.uk</w:t>
-      </w:r>
-      <w:r>
-        <w:t xml:space="preserve"> </w:t>
-      </w:r>
-      <w:r>
-        <w:t xml:space="preserve">mailbox via Outlook. Check Sent Items contains messages with subject pattern</w:t>
-      </w:r>
-      <w:r>
-        <w:t xml:space="preserve"> </w:t>
-      </w:r>
-      <w:r>
-        <w:rPr>
-          <w:rStyle w:val="VerbatimChar"/>
-        </w:rPr>
-        <w:t xml:space="preserve">[Client] — [Month] [Year] MI release</w:t>
-      </w:r>
-      <w:r>
-        <w:t xml:space="preserve">.</w:t>
-      </w:r>
-    </w:p>
-    <w:p>
-      <w:pPr>
-        <w:pStyle w:val="Compact"/>
-        <w:numPr>
-          <w:ilvl w:val="0"/>
-          <w:numId w:val="1019"/>
-        </w:numPr>
-      </w:pPr>
-      <w:r>
-        <w:rPr>
-          <w:b/>
-          <w:bCs/>
-        </w:rPr>
-        <w:t xml:space="preserve">Spot-check</w:t>
-      </w:r>
-      <w:r>
-        <w:t xml:space="preserve"> </w:t>
-      </w:r>
-      <w:r>
-        <w:t xml:space="preserve">one client by phone or reply-to-test: confirm receipt with their nominated MI contact.</w:t>
-      </w:r>
-    </w:p>
-    <w:p>
-      <w:pPr>
-        <w:pStyle w:val="Compact"/>
-        <w:numPr>
-          <w:ilvl w:val="0"/>
-          <w:numId w:val="1019"/>
-        </w:numPr>
-      </w:pPr>
-      <w:r>
-        <w:t xml:space="preserve">Record completion on Annex C.</w:t>
-      </w:r>
-    </w:p>
-    <w:bookmarkEnd w:id="22"/>
-    <w:bookmarkStart w:id="23" w:name="adding-or-removing-a-client"/>
-    <w:p>
-      <w:pPr>
-        <w:pStyle w:val="Heading3"/>
-      </w:pPr>
-      <w:r>
-        <w:t xml:space="preserve">7.6 Adding or removing a client</w:t>
-      </w:r>
-    </w:p>
-    <w:p>
-      <w:pPr>
-        <w:pStyle w:val="FirstParagraph"/>
-      </w:pPr>
-      <w:r>
-        <w:t xml:space="preserve">When a new client is onboarded or an existing client is offboarded the MI Analyst (or designate) shall:</w:t>
-      </w:r>
-    </w:p>
-    <w:p>
-      <w:pPr>
-        <w:pStyle w:val="Compact"/>
-        <w:numPr>
-          <w:ilvl w:val="0"/>
-          <w:numId w:val="1020"/>
-        </w:numPr>
-      </w:pPr>
-      <w:r>
-        <w:rPr>
-          <w:b/>
-          <w:bCs/>
-        </w:rPr>
-        <w:t xml:space="preserve">Onboarding a new client:</w:t>
-      </w:r>
-    </w:p>
-    <w:p>
-      <w:pPr>
-        <w:pStyle w:val="Compact"/>
-        <w:numPr>
-          <w:ilvl w:val="1"/>
-          <w:numId w:val="1021"/>
-        </w:numPr>
-      </w:pPr>
-      <w:r>
-        <w:t xml:space="preserve">Decide the access code (UPPERCASE, suffix with the current year, e.g. </w:t>
-      </w:r>
-      <w:r>
-        <w:rPr>
-          <w:rStyle w:val="VerbatimChar"/>
-        </w:rPr>
-        <w:t xml:space="preserve">NEWCLIENT26</w:t>
-      </w:r>
-      <w:r>
-        <w:t xml:space="preserve">).</w:t>
-      </w:r>
-    </w:p>
-    <w:p>
-      <w:pPr>
-        <w:pStyle w:val="Compact"/>
-        <w:numPr>
-          <w:ilvl w:val="1"/>
-          <w:numId w:val="1021"/>
-        </w:numPr>
-      </w:pPr>
-      <w:r>
-        <w:t xml:space="preserve">Add the client to</w:t>
-      </w:r>
-      <w:r>
-        <w:t xml:space="preserve"> </w:t>
-      </w:r>
-      <w:r>
-        <w:rPr>
-          <w:rStyle w:val="VerbatimChar"/>
-        </w:rPr>
-        <w:t xml:space="preserve">index.html</w:t>
-      </w:r>
-      <w:r>
-        <w:t xml:space="preserve"> </w:t>
-      </w:r>
-      <w:r>
-        <w:rPr>
-          <w:rStyle w:val="VerbatimChar"/>
-        </w:rPr>
-        <w:t xml:space="preserve">CLIENT_REGISTRY</w:t>
-      </w:r>
-      <w:r>
-        <w:t xml:space="preserve">.</w:t>
-      </w:r>
-    </w:p>
-    <w:p>
-      <w:pPr>
-        <w:pStyle w:val="Compact"/>
-        <w:numPr>
-          <w:ilvl w:val="1"/>
-          <w:numId w:val="1021"/>
-        </w:numPr>
-      </w:pPr>
-      <w:r>
-        <w:t xml:space="preserve">Add the lowercased TrackOps client name(s) to</w:t>
-      </w:r>
-      <w:r>
-        <w:t xml:space="preserve"> </w:t>
-      </w:r>
-      <w:r>
-        <w:rPr>
-          <w:rStyle w:val="VerbatimChar"/>
-        </w:rPr>
-        <w:t xml:space="preserve">scripts/client-map.json</w:t>
-      </w:r>
-      <w:r>
-        <w:t xml:space="preserve"> </w:t>
-      </w:r>
-      <w:r>
-        <w:t xml:space="preserve">(include every alias TrackOps uses).</w:t>
-      </w:r>
-    </w:p>
-    <w:p>
-      <w:pPr>
-        <w:pStyle w:val="Compact"/>
-        <w:numPr>
-          <w:ilvl w:val="1"/>
-          <w:numId w:val="1021"/>
-        </w:numPr>
-      </w:pPr>
-      <w:r>
-        <w:t xml:space="preserve">Add recipient(s) to</w:t>
-      </w:r>
-      <w:r>
-        <w:t xml:space="preserve"> </w:t>
-      </w:r>
-      <w:r>
-        <w:rPr>
-          <w:rStyle w:val="VerbatimChar"/>
-        </w:rPr>
-        <w:t xml:space="preserve">scripts/client-recipients.json</w:t>
-      </w:r>
-      <w:r>
-        <w:t xml:space="preserve">.</w:t>
-      </w:r>
-    </w:p>
-    <w:p>
-      <w:pPr>
-        <w:pStyle w:val="Compact"/>
-        <w:numPr>
-          <w:ilvl w:val="1"/>
-          <w:numId w:val="1021"/>
-        </w:numPr>
-      </w:pPr>
-      <w:r>
-        <w:t xml:space="preserve">If the client is on the RTC service, set</w:t>
-      </w:r>
-      <w:r>
-        <w:t xml:space="preserve"> </w:t>
-      </w:r>
-      <w:r>
-        <w:rPr>
-          <w:rStyle w:val="VerbatimChar"/>
-        </w:rPr>
-        <w:t xml:space="preserve">is_rtc: true</w:t>
-      </w:r>
-      <w:r>
-        <w:t xml:space="preserve"> </w:t>
-      </w:r>
-      <w:r>
-        <w:t xml:space="preserve">in their</w:t>
-      </w:r>
-      <w:r>
-        <w:t xml:space="preserve"> </w:t>
-      </w:r>
-      <w:r>
-        <w:rPr>
-          <w:rStyle w:val="VerbatimChar"/>
-        </w:rPr>
-        <w:t xml:space="preserve">client-map.json</w:t>
-      </w:r>
-      <w:r>
-        <w:t xml:space="preserve"> </w:t>
-      </w:r>
-      <w:r>
-        <w:t xml:space="preserve">entry.</w:t>
-      </w:r>
-    </w:p>
-    <w:p>
-      <w:pPr>
-        <w:pStyle w:val="Compact"/>
-        <w:numPr>
-          <w:ilvl w:val="1"/>
-          <w:numId w:val="1021"/>
-        </w:numPr>
-      </w:pPr>
-      <w:r>
-        <w:t xml:space="preserve">Commit and push.</w:t>
-      </w:r>
-    </w:p>
-    <w:p>
-      <w:pPr>
-        <w:pStyle w:val="Compact"/>
-        <w:numPr>
-          <w:ilvl w:val="0"/>
-          <w:numId w:val="1020"/>
-        </w:numPr>
-      </w:pPr>
-      <w:r>
-        <w:rPr>
-          <w:b/>
-          <w:bCs/>
-        </w:rPr>
-        <w:t xml:space="preserve">Offboarding a client:</w:t>
-      </w:r>
-    </w:p>
-    <w:p>
-      <w:pPr>
-        <w:pStyle w:val="Compact"/>
-        <w:numPr>
-          <w:ilvl w:val="1"/>
-          <w:numId w:val="1022"/>
-        </w:numPr>
-      </w:pPr>
-      <w:r>
-        <w:t xml:space="preserve">Remove their entry from</w:t>
-      </w:r>
-      <w:r>
-        <w:t xml:space="preserve"> </w:t>
-      </w:r>
-      <w:r>
-        <w:rPr>
-          <w:rStyle w:val="VerbatimChar"/>
-        </w:rPr>
-        <w:t xml:space="preserve">index.html</w:t>
-      </w:r>
-      <w:r>
-        <w:t xml:space="preserve"> </w:t>
-      </w:r>
-      <w:r>
-        <w:rPr>
-          <w:rStyle w:val="VerbatimChar"/>
-        </w:rPr>
-        <w:t xml:space="preserve">CLIENT_REGISTRY</w:t>
-      </w:r>
-      <w:r>
-        <w:t xml:space="preserve"> </w:t>
-      </w:r>
-      <w:r>
-        <w:t xml:space="preserve">(revokes access).</w:t>
-      </w:r>
-    </w:p>
-    <w:p>
-      <w:pPr>
-        <w:pStyle w:val="Compact"/>
-        <w:numPr>
-          <w:ilvl w:val="1"/>
-          <w:numId w:val="1022"/>
-        </w:numPr>
-      </w:pPr>
-      <w:r>
-        <w:t xml:space="preserve">Remove from</w:t>
-      </w:r>
-      <w:r>
-        <w:t xml:space="preserve"> </w:t>
-      </w:r>
-      <w:r>
-        <w:rPr>
-          <w:rStyle w:val="VerbatimChar"/>
-        </w:rPr>
-        <w:t xml:space="preserve">scripts/client-recipients.json</w:t>
-      </w:r>
-      <w:r>
-        <w:t xml:space="preserve"> </w:t>
-      </w:r>
-      <w:r>
-        <w:t xml:space="preserve">(stops emails).</w:t>
-      </w:r>
-    </w:p>
-    <w:p>
-      <w:pPr>
-        <w:pStyle w:val="Compact"/>
-        <w:numPr>
-          <w:ilvl w:val="1"/>
-          <w:numId w:val="1022"/>
-        </w:numPr>
-      </w:pPr>
-      <w:r>
-        <w:t xml:space="preserve">Leave</w:t>
-      </w:r>
-      <w:r>
-        <w:t xml:space="preserve"> </w:t>
-      </w:r>
-      <w:r>
-        <w:rPr>
-          <w:rStyle w:val="VerbatimChar"/>
-        </w:rPr>
-        <w:t xml:space="preserve">scripts/client-map.json</w:t>
-      </w:r>
-      <w:r>
-        <w:t xml:space="preserve"> </w:t>
-      </w:r>
-      <w:r>
-        <w:t xml:space="preserve">and</w:t>
-      </w:r>
-      <w:r>
-        <w:t xml:space="preserve"> </w:t>
-      </w:r>
-      <w:r>
-        <w:rPr>
-          <w:rStyle w:val="VerbatimChar"/>
-        </w:rPr>
-        <w:t xml:space="preserve">clients/[name].js</w:t>
-      </w:r>
-      <w:r>
-        <w:t xml:space="preserve"> </w:t>
-      </w:r>
-      <w:r>
-        <w:t xml:space="preserve">in place for historical reference unless the client expressly requests data deletion.</w:t>
-      </w:r>
-    </w:p>
-    <w:p>
-      <w:pPr>
-        <w:pStyle w:val="FirstParagraph"/>
-      </w:pPr>
-      <w:r>
-        <w:t xml:space="preserve">All changes shall be made via a single commit with a message of the form</w:t>
-      </w:r>
-      <w:r>
-        <w:t xml:space="preserve"> </w:t>
-      </w:r>
-      <w:r>
-        <w:rPr>
-          <w:rStyle w:val="VerbatimChar"/>
-        </w:rPr>
-        <w:t xml:space="preserve">Client onboard: [Name]</w:t>
-      </w:r>
-      <w:r>
-        <w:t xml:space="preserve"> </w:t>
-      </w:r>
-      <w:r>
-        <w:t xml:space="preserve">or</w:t>
-      </w:r>
-      <w:r>
-        <w:t xml:space="preserve"> </w:t>
-      </w:r>
-      <w:r>
-        <w:rPr>
-          <w:rStyle w:val="VerbatimChar"/>
-        </w:rPr>
-        <w:t xml:space="preserve">Client offboard: [Name]</w:t>
-      </w:r>
-      <w:r>
-        <w:t xml:space="preserve">.</w:t>
-      </w:r>
-    </w:p>
-    <w:bookmarkEnd w:id="23"/>
-    <w:bookmarkEnd w:id="24"/>
-    <w:bookmarkStart w:id="25" w:name="records-retained"/>
+    <w:bookmarkEnd w:id="26"/>
+    <w:bookmarkEnd w:id="27"/>
+    <w:bookmarkStart w:id="28" w:name="records-retained"/>
     <w:p>
       <w:pPr>
         <w:pStyle w:val="Heading2"/>
@@ -3971,8 +5125,8 @@
         </w:tc>
       </w:tr>
     </w:tbl>
-    <w:bookmarkEnd w:id="25"/>
-    <w:bookmarkStart w:id="26" w:name="exception-handling"/>
+    <w:bookmarkEnd w:id="28"/>
+    <w:bookmarkStart w:id="29" w:name="exception-handling"/>
     <w:p>
       <w:pPr>
         <w:pStyle w:val="Heading2"/>
@@ -4403,8 +5557,8 @@
         </w:tc>
       </w:tr>
     </w:tbl>
-    <w:bookmarkEnd w:id="26"/>
-    <w:bookmarkStart w:id="30" w:name="annexes"/>
+    <w:bookmarkEnd w:id="29"/>
+    <w:bookmarkStart w:id="33" w:name="annexes"/>
     <w:p>
       <w:pPr>
         <w:pStyle w:val="Heading2"/>
@@ -4413,7 +5567,7 @@
         <w:t xml:space="preserve">10. Annexes</w:t>
       </w:r>
     </w:p>
-    <w:bookmarkStart w:id="27" w:name="annex-a-mi-analyst-training-checklist"/>
+    <w:bookmarkStart w:id="30" w:name="annex-a-mi-analyst-training-checklist"/>
     <w:p>
       <w:pPr>
         <w:pStyle w:val="Heading3"/>
@@ -4428,18 +5582,6 @@
       </w:pPr>
       <w:r>
         <w:t xml:space="preserve">A new MI Analyst shall not perform an unsupervised release until they have:</w:t>
-      </w:r>
-    </w:p>
-    <w:p>
-      <w:pPr>
-        <w:pStyle w:val="Compact"/>
-        <w:numPr>
-          <w:ilvl w:val="0"/>
-          <w:numId w:val="1023"/>
-        </w:numPr>
-      </w:pPr>
-      <w:r>
-        <w:t xml:space="preserve">Read this procedure in full</w:t>
       </w:r>
     </w:p>
     <w:p>
@@ -4451,7 +5593,7 @@
         </w:numPr>
       </w:pPr>
       <w:r>
-        <w:t xml:space="preserve">Observed one full release performed by the current MI Analyst</w:t>
+        <w:t xml:space="preserve">Read this procedure in full</w:t>
       </w:r>
     </w:p>
     <w:p>
@@ -4463,7 +5605,7 @@
         </w:numPr>
       </w:pPr>
       <w:r>
-        <w:t xml:space="preserve">Performed one supervised release end-to-end</w:t>
+        <w:t xml:space="preserve">Observed one full release performed by the current MI Analyst</w:t>
       </w:r>
     </w:p>
     <w:p>
@@ -4475,7 +5617,7 @@
         </w:numPr>
       </w:pPr>
       <w:r>
-        <w:t xml:space="preserve">Demonstrated correct identification of a data-quality typo in TrackOps and corrective action</w:t>
+        <w:t xml:space="preserve">Performed one supervised release end-to-end</w:t>
       </w:r>
     </w:p>
     <w:p>
@@ -4487,7 +5629,7 @@
         </w:numPr>
       </w:pPr>
       <w:r>
-        <w:t xml:space="preserve">Demonstrated retrieval of a Microsoft Graph workflow run log and interpretation of its output</w:t>
+        <w:t xml:space="preserve">Demonstrated correct identification of a data-quality typo in TrackOps and corrective action</w:t>
       </w:r>
     </w:p>
     <w:p>
@@ -4499,11 +5641,23 @@
         </w:numPr>
       </w:pPr>
       <w:r>
+        <w:t xml:space="preserve">Demonstrated retrieval of a Microsoft Graph workflow run log and interpretation of its output</w:t>
+      </w:r>
+    </w:p>
+    <w:p>
+      <w:pPr>
+        <w:pStyle w:val="Compact"/>
+        <w:numPr>
+          <w:ilvl w:val="0"/>
+          <w:numId w:val="1029"/>
+        </w:numPr>
+      </w:pPr>
+      <w:r>
         <w:t xml:space="preserve">Signed Annex C against their first supervised release</w:t>
       </w:r>
     </w:p>
-    <w:bookmarkEnd w:id="27"/>
-    <w:bookmarkStart w:id="28" w:name="annex-b-secret-rotation-schedule"/>
+    <w:bookmarkEnd w:id="30"/>
+    <w:bookmarkStart w:id="31" w:name="annex-b-secret-rotation-schedule"/>
     <w:p>
       <w:pPr>
         <w:pStyle w:val="Heading3"/>
@@ -4725,8 +5879,8 @@
         </w:tc>
       </w:tr>
     </w:tbl>
-    <w:bookmarkEnd w:id="28"/>
-    <w:bookmarkStart w:id="29" w:name="annex-c-monthly-mi-release-record"/>
+    <w:bookmarkEnd w:id="31"/>
+    <w:bookmarkStart w:id="32" w:name="annex-c-monthly-mi-release-record"/>
     <w:p>
       <w:pPr>
         <w:pStyle w:val="Heading3"/>
@@ -4949,9 +6103,9 @@
         <w:t xml:space="preserve">                        (MI Analyst signature)</w:t>
       </w:r>
     </w:p>
-    <w:bookmarkEnd w:id="29"/>
-    <w:bookmarkEnd w:id="30"/>
-    <w:bookmarkStart w:id="31" w:name="revision-history"/>
+    <w:bookmarkEnd w:id="32"/>
+    <w:bookmarkEnd w:id="33"/>
+    <w:bookmarkStart w:id="34" w:name="revision-history"/>
     <w:p>
       <w:pPr>
         <w:pStyle w:val="Heading2"/>
@@ -5160,9 +6314,64 @@
           </w:p>
         </w:tc>
       </w:tr>
+      <w:tr>
+        <w:tc>
+          <w:tcPr/>
+          <w:p>
+            <w:pPr>
+              <w:pStyle w:val="Compact"/>
+            </w:pPr>
+            <w:r>
+              <w:t xml:space="preserve">1.3</w:t>
+            </w:r>
+          </w:p>
+        </w:tc>
+        <w:tc>
+          <w:tcPr/>
+          <w:p>
+            <w:pPr>
+              <w:pStyle w:val="Compact"/>
+            </w:pPr>
+            <w:r>
+              <w:t xml:space="preserve">13 May 2026</w:t>
+            </w:r>
+          </w:p>
+        </w:tc>
+        <w:tc>
+          <w:tcPr/>
+          <w:p>
+            <w:pPr>
+              <w:pStyle w:val="Compact"/>
+            </w:pPr>
+            <w:r>
+              <w:t xml:space="preserve">David Booker</w:t>
+            </w:r>
+          </w:p>
+        </w:tc>
+        <w:tc>
+          <w:tcPr/>
+          <w:p>
+            <w:pPr>
+              <w:pStyle w:val="Compact"/>
+            </w:pPr>
+            <w:r>
+              <w:t xml:space="preserve">Rewrote §7.2.2 Route A as a true beginner’s step-by-step. Explicit instructions on how to open Terminal (Cmd-Space →</w:t>
+            </w:r>
+            <w:r>
+              <w:t xml:space="preserve"> </w:t>
+            </w:r>
+            <w:r>
+              <w:t xml:space="preserve">“Terminal”</w:t>
+            </w:r>
+            <w:r>
+              <w:t xml:space="preserve">), how to navigate to the MI Portal folder, how to start Claude Code, how to drag the two CSV files from Finder into the Terminal prompt (auto-pastes full paths), what to expect in the output, and how to approve the commit. Added a troubleshooting matrix for the most common errors. The doc can now be handed to a non-technical operator with no prior context.</w:t>
+            </w:r>
+          </w:p>
+        </w:tc>
+      </w:tr>
     </w:tbl>
-    <w:bookmarkEnd w:id="31"/>
-    <w:bookmarkEnd w:id="32"/>
+    <w:bookmarkEnd w:id="34"/>
+    <w:bookmarkEnd w:id="35"/>
     <w:sectPr>
       <w:footnotePr>
         <w:numRestart w:val="eachSect"/>
@@ -5764,15 +6973,6 @@
     </w:lvlOverride>
   </w:num>
   <w:num w:numId="1011">
-    <w:abstractNumId w:val="992"/>
-  </w:num>
-  <w:num w:numId="1012">
-    <w:abstractNumId w:val="992"/>
-  </w:num>
-  <w:num w:numId="1013">
-    <w:abstractNumId w:val="992"/>
-  </w:num>
-  <w:num w:numId="1014">
     <w:abstractNumId w:val="99411"/>
     <w:lvlOverride w:ilvl="0">
       <w:startOverride w:val="1"/>
@@ -5802,16 +7002,16 @@
       <w:startOverride w:val="1"/>
     </w:lvlOverride>
   </w:num>
-  <w:num w:numId="1015">
+  <w:num w:numId="1012">
     <w:abstractNumId w:val="992"/>
   </w:num>
-  <w:num w:numId="1016">
+  <w:num w:numId="1013">
     <w:abstractNumId w:val="992"/>
   </w:num>
-  <w:num w:numId="1017">
+  <w:num w:numId="1014">
     <w:abstractNumId w:val="992"/>
   </w:num>
-  <w:num w:numId="1018">
+  <w:num w:numId="1015">
     <w:abstractNumId w:val="99411"/>
     <w:lvlOverride w:ilvl="0">
       <w:startOverride w:val="1"/>
@@ -5840,6 +7040,15 @@
     <w:lvlOverride w:ilvl="8">
       <w:startOverride w:val="1"/>
     </w:lvlOverride>
+  </w:num>
+  <w:num w:numId="1016">
+    <w:abstractNumId w:val="992"/>
+  </w:num>
+  <w:num w:numId="1017">
+    <w:abstractNumId w:val="992"/>
+  </w:num>
+  <w:num w:numId="1018">
+    <w:abstractNumId w:val="992"/>
   </w:num>
   <w:num w:numId="1019">
     <w:abstractNumId w:val="99411"/>
@@ -5902,13 +7111,40 @@
     </w:lvlOverride>
   </w:num>
   <w:num w:numId="1021">
-    <w:abstractNumId w:val="991"/>
+    <w:abstractNumId w:val="99411"/>
+    <w:lvlOverride w:ilvl="0">
+      <w:startOverride w:val="1"/>
+    </w:lvlOverride>
+    <w:lvlOverride w:ilvl="1">
+      <w:startOverride w:val="1"/>
+    </w:lvlOverride>
+    <w:lvlOverride w:ilvl="2">
+      <w:startOverride w:val="1"/>
+    </w:lvlOverride>
+    <w:lvlOverride w:ilvl="3">
+      <w:startOverride w:val="1"/>
+    </w:lvlOverride>
+    <w:lvlOverride w:ilvl="4">
+      <w:startOverride w:val="1"/>
+    </w:lvlOverride>
+    <w:lvlOverride w:ilvl="5">
+      <w:startOverride w:val="1"/>
+    </w:lvlOverride>
+    <w:lvlOverride w:ilvl="6">
+      <w:startOverride w:val="1"/>
+    </w:lvlOverride>
+    <w:lvlOverride w:ilvl="7">
+      <w:startOverride w:val="1"/>
+    </w:lvlOverride>
+    <w:lvlOverride w:ilvl="8">
+      <w:startOverride w:val="1"/>
+    </w:lvlOverride>
   </w:num>
   <w:num w:numId="1022">
     <w:abstractNumId w:val="991"/>
   </w:num>
   <w:num w:numId="1023">
-    <w:abstractNumId w:val="992"/>
+    <w:abstractNumId w:val="991"/>
   </w:num>
   <w:num w:numId="1024">
     <w:abstractNumId w:val="992"/>
@@ -5923,6 +7159,9 @@
     <w:abstractNumId w:val="992"/>
   </w:num>
   <w:num w:numId="1028">
+    <w:abstractNumId w:val="992"/>
+  </w:num>
+  <w:num w:numId="1029">
     <w:abstractNumId w:val="992"/>
   </w:num>
 </w:numbering>

</xml_diff>